<commit_message>
Draft chapters 11 (R. v. Dosanjh) and 22 (State v. Burch); codify standalone-chapter rule
- ch11-dosanjh-rental-gps.md: 'Never Rent a Getaway Car' — infotainment
  tracklog places the QX60 at the hotel front at the murder minute; fake
  rental name defeats the s. 8 privacy claim
- ch22-burch-fitbit-twelve-steps.md: 'Twelve Steps' — boyfriend's Fitbit
  clears him; Burch's consented phone extraction, 64 news-story views,
  and Google Dashboard location data convict him
- Both PDFs added to book/pdfs/; citations confirmed from slip opinions
- TOC: chapters marked drafted with bolded hooks; note that chapters are
  standalone short stories readable in any order
- Word docs regenerated; master manuscript now carries three chapters

Co-Authored-By: Claude Opus 4.8 <noreply@anthropic.com>
Claude-Session: https://claude.ai/code/session_016HAHAXcMmaZghEz1kJrDWU
</commit_message>
<xml_diff>
--- a/book/word/How Not to Get Away With Murder - Master.docx
+++ b/book/word/How Not to Get Away With Murder - Master.docx
@@ -199,6 +199,60 @@
       </w:r>
     </w:p>
     <w:p>
+      <w:pPr>
+        <w:pStyle w:val="BlockText"/>
+      </w:pPr>
+      <w:r>
+        <w:rPr>
+          <w:bCs/>
+          <w:b/>
+        </w:rPr>
+        <w:t xml:space="preserve">Read it in any order.</w:t>
+      </w:r>
+      <w:r>
+        <w:t xml:space="preserve"> </w:t>
+      </w:r>
+      <w:r>
+        <w:t xml:space="preserve">Every chapter is a self-contained short story —</w:t>
+      </w:r>
+      <w:r>
+        <w:t xml:space="preserve"> </w:t>
+      </w:r>
+      <w:r>
+        <w:t xml:space="preserve">nothing depends on what came before. The parts are shelving, not sequence:</w:t>
+      </w:r>
+      <w:r>
+        <w:t xml:space="preserve"> </w:t>
+      </w:r>
+      <w:r>
+        <w:t xml:space="preserve">a menu for readers who want more of a particular flavor of evidence.</w:t>
+      </w:r>
+      <w:r>
+        <w:t xml:space="preserve"> </w:t>
+      </w:r>
+      <w:r>
+        <w:t xml:space="preserve">Cross-references between chapters are optional</w:t>
+      </w:r>
+      <w:r>
+        <w:t xml:space="preserve"> </w:t>
+      </w:r>
+      <w:r>
+        <w:t xml:space="preserve">“</w:t>
+      </w:r>
+      <w:r>
+        <w:t xml:space="preserve">if you liked this one</w:t>
+      </w:r>
+      <w:r>
+        <w:t xml:space="preserve">”</w:t>
+      </w:r>
+      <w:r>
+        <w:t xml:space="preserve"> </w:t>
+      </w:r>
+      <w:r>
+        <w:t xml:space="preserve">pointers, never homework.</w:t>
+      </w:r>
+    </w:p>
+    <w:p>
       <w:r>
         <w:pict>
           <v:rect style="width:0;height:1.5pt" o:hralign="center" o:hrstd="t" o:hr="t"/>
@@ -829,7 +883,7 @@
           <w:bCs/>
           <w:b/>
         </w:rPr>
-        <w:t xml:space="preserve">Your Rental Car Snitched on You</w:t>
+        <w:t xml:space="preserve">Never Rent a Getaway Car</w:t>
       </w:r>
       <w:r>
         <w:t xml:space="preserve"> </w:t>
@@ -848,10 +902,37 @@
         <w:t xml:space="preserve">R. v. Dosanjh</w:t>
       </w:r>
       <w:r>
-        <w:t xml:space="preserve"> </w:t>
-      </w:r>
-      <w:r>
-        <w:t xml:space="preserve">(ON CA, 2022) — infotainment GPS log</w:t>
+        <w:t xml:space="preserve">, 2022 ONCA 689 ✍️</w:t>
+      </w:r>
+      <w:r>
+        <w:t xml:space="preserve"> </w:t>
+      </w:r>
+      <w:r>
+        <w:rPr>
+          <w:iCs/>
+          <w:i/>
+        </w:rPr>
+        <w:t xml:space="preserve">drafted</w:t>
+      </w:r>
+      <w:r>
+        <w:t xml:space="preserve"> </w:t>
+      </w:r>
+      <w:r>
+        <w:rPr>
+          <w:iCs/>
+          <w:i/>
+        </w:rPr>
+        <w:t xml:space="preserve">Hook:</w:t>
+      </w:r>
+      <w:r>
+        <w:t xml:space="preserve"> </w:t>
+      </w:r>
+      <w:r>
+        <w:rPr>
+          <w:bCs/>
+          <w:b/>
+        </w:rPr>
+        <w:t xml:space="preserve">He rented the getaway car under a fake name — and the fake name is exactly why the car’s testimony could never be thrown out.</w:t>
       </w:r>
     </w:p>
     <w:p>
@@ -1332,7 +1413,7 @@
           <w:bCs/>
           <w:b/>
         </w:rPr>
-        <w:t xml:space="preserve">The Steps a Dead Woman Kept Taking</w:t>
+        <w:t xml:space="preserve">Don’t Murder a Woman Wearing a Fitbit</w:t>
       </w:r>
       <w:r>
         <w:t xml:space="preserve"> </w:t>
@@ -1351,10 +1432,37 @@
         <w:t xml:space="preserve">State v. Dabate</w:t>
       </w:r>
       <w:r>
-        <w:t xml:space="preserve"> </w:t>
-      </w:r>
-      <w:r>
-        <w:t xml:space="preserve">(Conn., 2025) — the Fitbit murder</w:t>
+        <w:t xml:space="preserve">, 351 Conn. 428 (2025) ✍️</w:t>
+      </w:r>
+      <w:r>
+        <w:t xml:space="preserve"> </w:t>
+      </w:r>
+      <w:r>
+        <w:rPr>
+          <w:iCs/>
+          <w:i/>
+        </w:rPr>
+        <w:t xml:space="preserve">drafted</w:t>
+      </w:r>
+      <w:r>
+        <w:t xml:space="preserve"> </w:t>
+      </w:r>
+      <w:r>
+        <w:rPr>
+          <w:iCs/>
+          <w:i/>
+        </w:rPr>
+        <w:t xml:space="preserve">Hook:</w:t>
+      </w:r>
+      <w:r>
+        <w:t xml:space="preserve"> </w:t>
+      </w:r>
+      <w:r>
+        <w:rPr>
+          <w:bCs/>
+          <w:b/>
+        </w:rPr>
+        <w:t xml:space="preserve">Her husband told police she was already dead. Her Fitbit kept counting.</w:t>
       </w:r>
     </w:p>
     <w:p>
@@ -1370,7 +1478,7 @@
           <w:bCs/>
           <w:b/>
         </w:rPr>
-        <w:t xml:space="preserve">Twelve Steps Cleared the Wrong Man</w:t>
+        <w:t xml:space="preserve">Twelve Steps</w:t>
       </w:r>
       <w:r>
         <w:t xml:space="preserve"> </w:t>
@@ -1389,10 +1497,37 @@
         <w:t xml:space="preserve">State v. Burch</w:t>
       </w:r>
       <w:r>
-        <w:t xml:space="preserve"> </w:t>
-      </w:r>
-      <w:r>
-        <w:t xml:space="preserve">(Wis., 2021) — a Fitbit alibi, then the real killer</w:t>
+        <w:t xml:space="preserve">, 2021 WI 68 ✍️</w:t>
+      </w:r>
+      <w:r>
+        <w:t xml:space="preserve"> </w:t>
+      </w:r>
+      <w:r>
+        <w:rPr>
+          <w:iCs/>
+          <w:i/>
+        </w:rPr>
+        <w:t xml:space="preserve">drafted</w:t>
+      </w:r>
+      <w:r>
+        <w:t xml:space="preserve"> </w:t>
+      </w:r>
+      <w:r>
+        <w:rPr>
+          <w:iCs/>
+          <w:i/>
+        </w:rPr>
+        <w:t xml:space="preserve">Hook:</w:t>
+      </w:r>
+      <w:r>
+        <w:t xml:space="preserve"> </w:t>
+      </w:r>
+      <w:r>
+        <w:rPr>
+          <w:bCs/>
+          <w:b/>
+        </w:rPr>
+        <w:t xml:space="preserve">The Fitbit cleared the boyfriend. A cellphone handed over in a fender-bender case buried the man who did it.</w:t>
       </w:r>
     </w:p>
     <w:p>
@@ -2479,13 +2614,13 @@
     </w:p>
     <w:bookmarkEnd w:id="32"/>
     <w:bookmarkEnd w:id="33"/>
-    <w:bookmarkStart w:id="40" w:name="X9203c5d96f35499ac85be75e6ac11cd798292f8"/>
+    <w:bookmarkStart w:id="39" w:name="chapter-11-never-rent-a-getaway-car"/>
     <w:p>
       <w:pPr>
         <w:pStyle w:val="Heading1"/>
       </w:pPr>
       <w:r>
-        <w:t xml:space="preserve">Chapter 21 — Don’t Murder a Woman Wearing a Fitbit</w:t>
+        <w:t xml:space="preserve">Chapter 11 — Never Rent a Getaway Car</w:t>
       </w:r>
     </w:p>
     <w:p>
@@ -2497,7 +2632,21 @@
           <w:bCs/>
           <w:b/>
         </w:rPr>
-        <w:t xml:space="preserve">Her husband told police she was already dead. Her Fitbit kept counting.</w:t>
+        <w:t xml:space="preserve">He rented the getaway car under a fake name — and the fake name is exactly</w:t>
+      </w:r>
+      <w:r>
+        <w:rPr>
+          <w:bCs/>
+          <w:b/>
+        </w:rPr>
+        <w:t xml:space="preserve"> </w:t>
+      </w:r>
+      <w:r>
+        <w:rPr>
+          <w:bCs/>
+          <w:b/>
+        </w:rPr>
+        <w:t xml:space="preserve">why the car’s testimony could never be thrown out.</w:t>
       </w:r>
     </w:p>
     <w:p>
@@ -2505,7 +2654,19 @@
         <w:pStyle w:val="BodyText"/>
       </w:pPr>
       <w:r>
-        <w:t xml:space="preserve">Two days before Christmas 2015, Richard Dabate had a story ready.</w:t>
+        <w:t xml:space="preserve">At 4:38 on the afternoon of March 1, 2016, Aly Sunderani stepped out of his</w:t>
+      </w:r>
+      <w:r>
+        <w:t xml:space="preserve"> </w:t>
+      </w:r>
+      <w:r>
+        <w:t xml:space="preserve">Range Rover under the carport of the Comfort Inn in Guelph, Ontario. He was the</w:t>
+      </w:r>
+      <w:r>
+        <w:t xml:space="preserve"> </w:t>
+      </w:r>
+      <w:r>
+        <w:t xml:space="preserve">hotel’s manager; this was his workplace; it was broad daylight.</w:t>
       </w:r>
     </w:p>
     <w:p>
@@ -2513,37 +2674,25 @@
         <w:pStyle w:val="BodyText"/>
       </w:pPr>
       <w:r>
-        <w:t xml:space="preserve">A man in camouflage, he told Connecticut State Police, had been hiding inside</w:t>
-      </w:r>
-      <w:r>
-        <w:t xml:space="preserve"> </w:t>
-      </w:r>
-      <w:r>
-        <w:t xml:space="preserve">his Ellington home. The intruder chased his wife Connie into the basement and</w:t>
-      </w:r>
-      <w:r>
-        <w:t xml:space="preserve"> </w:t>
-      </w:r>
-      <w:r>
-        <w:t xml:space="preserve">shot her with the Dabates’ own gun. Then he turned on Richard — zip-tied him to</w:t>
-      </w:r>
-      <w:r>
-        <w:t xml:space="preserve"> </w:t>
-      </w:r>
-      <w:r>
-        <w:t xml:space="preserve">a folding chair, cut him with a box cutter, burned him with a blowtorch — until</w:t>
-      </w:r>
-      <w:r>
-        <w:t xml:space="preserve"> </w:t>
-      </w:r>
-      <w:r>
-        <w:t xml:space="preserve">Richard heroically shoved the torch back toward the man’s face and drove him</w:t>
-      </w:r>
-      <w:r>
-        <w:t xml:space="preserve"> </w:t>
-      </w:r>
-      <w:r>
-        <w:t xml:space="preserve">off. Bleeding, bound, he triggered the home’s panic alarm and called 911.</w:t>
+        <w:t xml:space="preserve">A gunman walked up to him and opened fire with a submachine gun. Sunderani</w:t>
+      </w:r>
+      <w:r>
+        <w:t xml:space="preserve"> </w:t>
+      </w:r>
+      <w:r>
+        <w:t xml:space="preserve">suffered thirty-one gunshot wounds — some from bullets that passed through him</w:t>
+      </w:r>
+      <w:r>
+        <w:t xml:space="preserve"> </w:t>
+      </w:r>
+      <w:r>
+        <w:t xml:space="preserve">and struck again — three of them in his heart. The shooter dropped the gun</w:t>
+      </w:r>
+      <w:r>
+        <w:t xml:space="preserve"> </w:t>
+      </w:r>
+      <w:r>
+        <w:t xml:space="preserve">beside the body, climbed into a waiting black Infiniti QX60, and was gone.</w:t>
       </w:r>
     </w:p>
     <w:p>
@@ -2551,13 +2700,25 @@
         <w:pStyle w:val="BodyText"/>
       </w:pPr>
       <w:r>
-        <w:t xml:space="preserve">When officers arrived they found Connie’s body in the basement. They found the</w:t>
-      </w:r>
-      <w:r>
-        <w:t xml:space="preserve"> </w:t>
-      </w:r>
-      <w:r>
-        <w:t xml:space="preserve">gun. They found a butane torch, a box cutter, burnt debris, droplets of blood.</w:t>
+        <w:t xml:space="preserve">No masked figure in the night. No hidden body. A public execution in front of a</w:t>
+      </w:r>
+      <w:r>
+        <w:t xml:space="preserve"> </w:t>
+      </w:r>
+      <w:r>
+        <w:t xml:space="preserve">hotel lobby, on camera. And yet the case that followed was entirely</w:t>
+      </w:r>
+      <w:r>
+        <w:t xml:space="preserve"> </w:t>
+      </w:r>
+      <w:r>
+        <w:t xml:space="preserve">circumstantial — because the one thing the cameras never captured was the</w:t>
+      </w:r>
+      <w:r>
+        <w:t xml:space="preserve"> </w:t>
+      </w:r>
+      <w:r>
+        <w:t xml:space="preserve">gunman’s face.</w:t>
       </w:r>
     </w:p>
     <w:p>
@@ -2565,7 +2726,67 @@
         <w:pStyle w:val="BodyText"/>
       </w:pPr>
       <w:r>
-        <w:t xml:space="preserve">They found, in other words, exactly the scene Richard had described.</w:t>
+        <w:t xml:space="preserve">What the Crown had instead, when Raja Dosanjh stood trial for first-degree</w:t>
+      </w:r>
+      <w:r>
+        <w:t xml:space="preserve"> </w:t>
+      </w:r>
+      <w:r>
+        <w:t xml:space="preserve">murder three years later, were four pillars. His DNA on the grip of the</w:t>
+      </w:r>
+      <w:r>
+        <w:t xml:space="preserve"> </w:t>
+      </w:r>
+      <w:r>
+        <w:t xml:space="preserve">submachine gun left at the scene — a mixed profile 3.7 million times more</w:t>
+      </w:r>
+      <w:r>
+        <w:t xml:space="preserve"> </w:t>
+      </w:r>
+      <w:r>
+        <w:t xml:space="preserve">likely to include him than not. The getaway QX60, rented from a Mississauga</w:t>
+      </w:r>
+      <w:r>
+        <w:t xml:space="preserve"> </w:t>
+      </w:r>
+      <w:r>
+        <w:t xml:space="preserve">agency just hours before the shooting by a man using the false name</w:t>
+      </w:r>
+      <w:r>
+        <w:t xml:space="preserve"> </w:t>
+      </w:r>
+      <w:r>
+        <w:t xml:space="preserve">“</w:t>
+      </w:r>
+      <w:r>
+        <w:t xml:space="preserve">Jaspinder</w:t>
+      </w:r>
+      <w:r>
+        <w:t xml:space="preserve"> </w:t>
+      </w:r>
+      <w:r>
+        <w:t xml:space="preserve">Nagra</w:t>
+      </w:r>
+      <w:r>
+        <w:t xml:space="preserve">”</w:t>
+      </w:r>
+      <w:r>
+        <w:t xml:space="preserve"> </w:t>
+      </w:r>
+      <w:r>
+        <w:t xml:space="preserve">— a man who was, undisputedly, Dosanjh. The rental agency’s cameras,</w:t>
+      </w:r>
+      <w:r>
+        <w:t xml:space="preserve"> </w:t>
+      </w:r>
+      <w:r>
+        <w:t xml:space="preserve">which caught that man’s pants, shirt, and shoes — the same clothing worn by the</w:t>
+      </w:r>
+      <w:r>
+        <w:t xml:space="preserve"> </w:t>
+      </w:r>
+      <w:r>
+        <w:t xml:space="preserve">gunman captured chest-down on the hotel’s video.</w:t>
       </w:r>
     </w:p>
     <w:p>
@@ -2573,16 +2794,16 @@
         <w:pStyle w:val="BodyText"/>
       </w:pPr>
       <w:r>
-        <w:t xml:space="preserve">The problem was everything the scene couldn’t say — and one device that could.</w:t>
-      </w:r>
-    </w:p>
-    <w:bookmarkStart w:id="34" w:name="X7b11d94e34298c01d860c15ea739cb0dfca6508"/>
+        <w:t xml:space="preserve">And the fourth pillar: the car itself had been keeping a diary.</w:t>
+      </w:r>
+    </w:p>
+    <w:bookmarkStart w:id="34" w:name="the-minute-by-minute-confession"/>
     <w:p>
       <w:pPr>
         <w:pStyle w:val="Heading2"/>
       </w:pPr>
       <w:r>
-        <w:t xml:space="preserve">The morning, as the machines remembered it</w:t>
+        <w:t xml:space="preserve">The minute-by-minute confession</w:t>
       </w:r>
     </w:p>
     <w:p>
@@ -2590,13 +2811,31 @@
         <w:pStyle w:val="FirstParagraph"/>
       </w:pPr>
       <w:r>
-        <w:t xml:space="preserve">Here is the morning of December 23, 2015, as the jury ultimately found it — not</w:t>
-      </w:r>
-      <w:r>
-        <w:t xml:space="preserve"> </w:t>
-      </w:r>
-      <w:r>
-        <w:t xml:space="preserve">from any witness, but from the electronic wake the household left behind.</w:t>
+        <w:t xml:space="preserve">The QX60 came equipped with an infotainment system — the touchscreen console</w:t>
+      </w:r>
+      <w:r>
+        <w:t xml:space="preserve"> </w:t>
+      </w:r>
+      <w:r>
+        <w:t xml:space="preserve">that runs the maps and the music — which, like most modern vehicles, quietly</w:t>
+      </w:r>
+      <w:r>
+        <w:t xml:space="preserve"> </w:t>
+      </w:r>
+      <w:r>
+        <w:t xml:space="preserve">and automatically logged everywhere the car went. When Ontario Provincial</w:t>
+      </w:r>
+      <w:r>
+        <w:t xml:space="preserve"> </w:t>
+      </w:r>
+      <w:r>
+        <w:t xml:space="preserve">Police forensic analysts extracted the tracklog, they could read the day of the</w:t>
+      </w:r>
+      <w:r>
+        <w:t xml:space="preserve"> </w:t>
+      </w:r>
+      <w:r>
+        <w:t xml:space="preserve">murder like an itinerary:</w:t>
       </w:r>
     </w:p>
     <w:p>
@@ -2604,25 +2843,83 @@
         <w:pStyle w:val="BodyText"/>
       </w:pPr>
       <w:r>
-        <w:t xml:space="preserve">Connie Dabate left for the gym at 8:46 a.m. Her class was cancelled, so she came</w:t>
-      </w:r>
-      <w:r>
-        <w:t xml:space="preserve"> </w:t>
-      </w:r>
-      <w:r>
-        <w:t xml:space="preserve">home at 9:18. She talked to her mother on the phone. She posted on Facebook. She</w:t>
-      </w:r>
-      <w:r>
-        <w:t xml:space="preserve"> </w:t>
-      </w:r>
-      <w:r>
-        <w:t xml:space="preserve">messaged a friend. An ordinary woman, running an ordinary errand, two days</w:t>
-      </w:r>
-      <w:r>
-        <w:t xml:space="preserve"> </w:t>
-      </w:r>
-      <w:r>
-        <w:t xml:space="preserve">before Christmas.</w:t>
+        <w:rPr>
+          <w:bCs/>
+          <w:b/>
+        </w:rPr>
+        <w:t xml:space="preserve">1:16 p.m.</w:t>
+      </w:r>
+      <w:r>
+        <w:t xml:space="preserve"> </w:t>
+      </w:r>
+      <w:r>
+        <w:t xml:space="preserve">— the QX60 pulls out of the rental lot in Mississauga.</w:t>
+      </w:r>
+      <w:r>
+        <w:t xml:space="preserve"> </w:t>
+      </w:r>
+      <w:r>
+        <w:rPr>
+          <w:bCs/>
+          <w:b/>
+        </w:rPr>
+        <w:t xml:space="preserve">1:28 p.m.</w:t>
+      </w:r>
+      <w:r>
+        <w:t xml:space="preserve"> </w:t>
+      </w:r>
+      <w:r>
+        <w:t xml:space="preserve">— it arrives at the home of the parents of Dalvir Passi,</w:t>
+      </w:r>
+      <w:r>
+        <w:t xml:space="preserve"> </w:t>
+      </w:r>
+      <w:r>
+        <w:t xml:space="preserve">Dosanjh’s brother-in-law. It stays eleven minutes.</w:t>
+      </w:r>
+      <w:r>
+        <w:t xml:space="preserve"> </w:t>
+      </w:r>
+      <w:r>
+        <w:rPr>
+          <w:bCs/>
+          <w:b/>
+        </w:rPr>
+        <w:t xml:space="preserve">3:52 p.m.</w:t>
+      </w:r>
+      <w:r>
+        <w:t xml:space="preserve"> </w:t>
+      </w:r>
+      <w:r>
+        <w:t xml:space="preserve">— it enters the Comfort Inn parking lot in Guelph and parks</w:t>
+      </w:r>
+      <w:r>
+        <w:t xml:space="preserve"> </w:t>
+      </w:r>
+      <w:r>
+        <w:t xml:space="preserve">behind the hotel, where it sits for the better part of an hour.</w:t>
+      </w:r>
+      <w:r>
+        <w:t xml:space="preserve"> </w:t>
+      </w:r>
+      <w:r>
+        <w:rPr>
+          <w:bCs/>
+          <w:b/>
+        </w:rPr>
+        <w:t xml:space="preserve">4:38 p.m.</w:t>
+      </w:r>
+      <w:r>
+        <w:t xml:space="preserve"> </w:t>
+      </w:r>
+      <w:r>
+        <w:t xml:space="preserve">— the exact minute Aly Sunderani is shot — the QX60 moves to the</w:t>
+      </w:r>
+      <w:r>
+        <w:t xml:space="preserve"> </w:t>
+      </w:r>
+      <w:r>
+        <w:t xml:space="preserve">front of the hotel, then immediately drives away.</w:t>
       </w:r>
     </w:p>
     <w:p>
@@ -2630,56 +2927,19 @@
         <w:pStyle w:val="BodyText"/>
       </w:pPr>
       <w:r>
-        <w:t xml:space="preserve">Richard never left the house. In those same quiet morning hours, the home’s own</w:t>
-      </w:r>
-      <w:r>
-        <w:t xml:space="preserve"> </w:t>
-      </w:r>
-      <w:r>
-        <w:t xml:space="preserve">records caught him opening the basement door</w:t>
-      </w:r>
-      <w:r>
-        <w:t xml:space="preserve"> </w:t>
-      </w:r>
-      <w:r>
-        <w:rPr>
-          <w:iCs/>
-          <w:i/>
-        </w:rPr>
-        <w:t xml:space="preserve">eight times</w:t>
-      </w:r>
-      <w:r>
-        <w:t xml:space="preserve">. Arming and</w:t>
-      </w:r>
-      <w:r>
-        <w:t xml:space="preserve"> </w:t>
-      </w:r>
-      <w:r>
-        <w:t xml:space="preserve">disarming the security system, again and again. At some point he walked outside</w:t>
-      </w:r>
-      <w:r>
-        <w:t xml:space="preserve"> </w:t>
-      </w:r>
-      <w:r>
-        <w:t xml:space="preserve">and placed his own wallet near the basement bulkhead stairs — set dressing for</w:t>
-      </w:r>
-      <w:r>
-        <w:t xml:space="preserve"> </w:t>
-      </w:r>
-      <w:r>
-        <w:t xml:space="preserve">the burglary to come. In between, he answered work emails and played music on</w:t>
-      </w:r>
-      <w:r>
-        <w:t xml:space="preserve"> </w:t>
-      </w:r>
-      <w:r>
-        <w:t xml:space="preserve">his phone. When he heard Connie come home earlier than he expected, he did</w:t>
-      </w:r>
-      <w:r>
-        <w:t xml:space="preserve"> </w:t>
-      </w:r>
-      <w:r>
-        <w:t xml:space="preserve">something almost unbearably mundane: he checked the gym schedule.</w:t>
+        <w:t xml:space="preserve">From there the diary continues: back to the Passi parents’ home, then on to the</w:t>
+      </w:r>
+      <w:r>
+        <w:t xml:space="preserve"> </w:t>
+      </w:r>
+      <w:r>
+        <w:t xml:space="preserve">home of Dosanjh’s sister and brother-in-law. The hotel’s surveillance video</w:t>
+      </w:r>
+      <w:r>
+        <w:t xml:space="preserve"> </w:t>
+      </w:r>
+      <w:r>
+        <w:t xml:space="preserve">confirmed the tracklog’s account frame for frame.</w:t>
       </w:r>
     </w:p>
     <w:p>
@@ -2687,13 +2947,85 @@
         <w:pStyle w:val="BodyText"/>
       </w:pPr>
       <w:r>
-        <w:t xml:space="preserve">At 10:05 a.m., he lured his wife down to the basement and shot her with a</w:t>
-      </w:r>
-      <w:r>
-        <w:t xml:space="preserve"> </w:t>
-      </w:r>
-      <w:r>
-        <w:t xml:space="preserve">pistol the couple had bought only two months earlier.</w:t>
+        <w:t xml:space="preserve">One more entry completed the portrait. The next evening, Dosanjh returned the</w:t>
+      </w:r>
+      <w:r>
+        <w:t xml:space="preserve"> </w:t>
+      </w:r>
+      <w:r>
+        <w:t xml:space="preserve">QX60 to the rental agency — and asked his brother-in-law to pick him up not at</w:t>
+      </w:r>
+      <w:r>
+        <w:t xml:space="preserve"> </w:t>
+      </w:r>
+      <w:r>
+        <w:t xml:space="preserve">the agency, but waiting in a gas-station parking lot across a busy street. A</w:t>
+      </w:r>
+      <w:r>
+        <w:t xml:space="preserve"> </w:t>
+      </w:r>
+      <w:r>
+        <w:t xml:space="preserve">small, careful separation between himself and the car. The kind of detail a</w:t>
+      </w:r>
+      <w:r>
+        <w:t xml:space="preserve"> </w:t>
+      </w:r>
+      <w:r>
+        <w:t xml:space="preserve">man arranges when he knows exactly what the car has been part of.</w:t>
+      </w:r>
+    </w:p>
+    <w:bookmarkEnd w:id="34"/>
+    <w:bookmarkStart w:id="35" w:name="the-two-bald-men"/>
+    <w:p>
+      <w:pPr>
+        <w:pStyle w:val="Heading2"/>
+      </w:pPr>
+      <w:r>
+        <w:t xml:space="preserve">The two bald men</w:t>
+      </w:r>
+    </w:p>
+    <w:p>
+      <w:pPr>
+        <w:pStyle w:val="FirstParagraph"/>
+      </w:pPr>
+      <w:r>
+        <w:t xml:space="preserve">The defence answered with an alternate suspect story, delivered by the</w:t>
+      </w:r>
+      <w:r>
+        <w:t xml:space="preserve"> </w:t>
+      </w:r>
+      <w:r>
+        <w:t xml:space="preserve">brother-in-law himself. Passi testified that after the rental, two tall, white,</w:t>
+      </w:r>
+      <w:r>
+        <w:t xml:space="preserve"> </w:t>
+      </w:r>
+      <w:r>
+        <w:t xml:space="preserve">bald or balding strangers — men he had never seen before — arrived at his</w:t>
+      </w:r>
+      <w:r>
+        <w:t xml:space="preserve"> </w:t>
+      </w:r>
+      <w:r>
+        <w:t xml:space="preserve">parents’ home, borrowed the QX60 from Dosanjh to complete a drug transaction,</w:t>
+      </w:r>
+      <w:r>
+        <w:t xml:space="preserve"> </w:t>
+      </w:r>
+      <w:r>
+        <w:t xml:space="preserve">and brought it back later that day. While the Infiniti was allegedly off</w:t>
+      </w:r>
+      <w:r>
+        <w:t xml:space="preserve"> </w:t>
+      </w:r>
+      <w:r>
+        <w:t xml:space="preserve">murdering a hotel manager, Passi and Dosanjh were, he said, playing video</w:t>
+      </w:r>
+      <w:r>
+        <w:t xml:space="preserve"> </w:t>
+      </w:r>
+      <w:r>
+        <w:t xml:space="preserve">games.</w:t>
       </w:r>
     </w:p>
     <w:p>
@@ -2701,29 +3033,85 @@
         <w:pStyle w:val="BodyText"/>
       </w:pPr>
       <w:r>
-        <w:t xml:space="preserve">We can put a time on it because Connie was wearing a Fitbit One clipped to her</w:t>
-      </w:r>
-      <w:r>
-        <w:t xml:space="preserve"> </w:t>
-      </w:r>
-      <w:r>
-        <w:t xml:space="preserve">hip — a device that does exactly one thing, tirelessly: it counts its wearer’s</w:t>
-      </w:r>
-      <w:r>
-        <w:t xml:space="preserve"> </w:t>
-      </w:r>
-      <w:r>
-        <w:t xml:space="preserve">steps, minute by minute. At 10:05 a.m., it stopped.</w:t>
-      </w:r>
-    </w:p>
-    <w:bookmarkEnd w:id="34"/>
-    <w:bookmarkStart w:id="35" w:name="Xe67b992d38f8a0f7b4654d7ff9a0bd5ed378ef7"/>
+        <w:t xml:space="preserve">The story had one genuine asset: the Comfort Inn’s front-desk manager, who</w:t>
+      </w:r>
+      <w:r>
+        <w:t xml:space="preserve"> </w:t>
+      </w:r>
+      <w:r>
+        <w:t xml:space="preserve">watched the shooting through the lobby window, described the gunman as fair,</w:t>
+      </w:r>
+      <w:r>
+        <w:t xml:space="preserve"> </w:t>
+      </w:r>
+      <w:r>
+        <w:t xml:space="preserve">white-complexioned, with</w:t>
+      </w:r>
+      <w:r>
+        <w:t xml:space="preserve"> </w:t>
+      </w:r>
+      <w:r>
+        <w:t xml:space="preserve">“</w:t>
+      </w:r>
+      <w:r>
+        <w:t xml:space="preserve">less hairs on his head.</w:t>
+      </w:r>
+      <w:r>
+        <w:t xml:space="preserve">”</w:t>
+      </w:r>
+      <w:r>
+        <w:t xml:space="preserve"> </w:t>
+      </w:r>
+      <w:r>
+        <w:t xml:space="preserve">Dosanjh’s own lawyer</w:t>
+      </w:r>
+      <w:r>
+        <w:t xml:space="preserve"> </w:t>
+      </w:r>
+      <w:r>
+        <w:t xml:space="preserve">described his client as a tall, brown-skinned young man with a full head of</w:t>
+      </w:r>
+      <w:r>
+        <w:t xml:space="preserve"> </w:t>
+      </w:r>
+      <w:r>
+        <w:t xml:space="preserve">dark hair. Two other eyewitnesses pointed the other way.</w:t>
+      </w:r>
+    </w:p>
+    <w:p>
+      <w:pPr>
+        <w:pStyle w:val="BodyText"/>
+      </w:pPr>
+      <w:r>
+        <w:t xml:space="preserve">The jury weighed the bald strangers against the DNA on the gun grip, the</w:t>
+      </w:r>
+      <w:r>
+        <w:t xml:space="preserve"> </w:t>
+      </w:r>
+      <w:r>
+        <w:t xml:space="preserve">clothing on two videotapes, and a tracklog that put the car Dosanjh rented at</w:t>
+      </w:r>
+      <w:r>
+        <w:t xml:space="preserve"> </w:t>
+      </w:r>
+      <w:r>
+        <w:t xml:space="preserve">the murder scene at the killing minute. On August 1, 2019, it convicted him of</w:t>
+      </w:r>
+      <w:r>
+        <w:t xml:space="preserve"> </w:t>
+      </w:r>
+      <w:r>
+        <w:t xml:space="preserve">first-degree murder.</w:t>
+      </w:r>
+    </w:p>
+    <w:bookmarkEnd w:id="35"/>
+    <w:bookmarkStart w:id="36" w:name="the-trap-inside-the-fake-name"/>
     <w:p>
       <w:pPr>
         <w:pStyle w:val="Heading2"/>
       </w:pPr>
       <w:r>
-        <w:t xml:space="preserve">The story that couldn’t survive its own timeline</w:t>
+        <w:t xml:space="preserve">The trap inside the fake name</w:t>
       </w:r>
     </w:p>
     <w:p>
@@ -2731,41 +3119,19 @@
         <w:pStyle w:val="FirstParagraph"/>
       </w:pPr>
       <w:r>
-        <w:t xml:space="preserve">Richard’s account put a masked killer in the house while Connie fled for her</w:t>
-      </w:r>
-      <w:r>
-        <w:t xml:space="preserve"> </w:t>
-      </w:r>
-      <w:r>
-        <w:t xml:space="preserve">life. But her Fitbit — together with her Facebook activity — showed the jury</w:t>
-      </w:r>
-      <w:r>
-        <w:t xml:space="preserve"> </w:t>
-      </w:r>
-      <w:r>
-        <w:t xml:space="preserve">something devastating: Connie was alive, moving, posting, messaging,</w:t>
-      </w:r>
-      <w:r>
-        <w:t xml:space="preserve"> </w:t>
-      </w:r>
-      <w:r>
-        <w:rPr>
-          <w:iCs/>
-          <w:i/>
-        </w:rPr>
-        <w:t xml:space="preserve">after</w:t>
-      </w:r>
-      <w:r>
-        <w:t xml:space="preserve"> </w:t>
-      </w:r>
-      <w:r>
-        <w:t xml:space="preserve">the point where Richard’s story needed her to be dead. As the Connecticut</w:t>
-      </w:r>
-      <w:r>
-        <w:t xml:space="preserve"> </w:t>
-      </w:r>
-      <w:r>
-        <w:t xml:space="preserve">Supreme Court later put it, the electronic evidence</w:t>
+        <w:t xml:space="preserve">On appeal, Dosanjh’s lawyers went after the diary. The police, they argued,</w:t>
+      </w:r>
+      <w:r>
+        <w:t xml:space="preserve"> </w:t>
+      </w:r>
+      <w:r>
+        <w:t xml:space="preserve">had searched the infotainment system unlawfully — rummaging through GPS data</w:t>
+      </w:r>
+      <w:r>
+        <w:t xml:space="preserve"> </w:t>
+      </w:r>
+      <w:r>
+        <w:t xml:space="preserve">that revealed his movements, a</w:t>
       </w:r>
       <w:r>
         <w:t xml:space="preserve"> </w:t>
@@ -2774,36 +3140,117 @@
         <w:t xml:space="preserve">“</w:t>
       </w:r>
       <w:r>
-        <w:t xml:space="preserve">demonstrated to the jury</w:t>
-      </w:r>
-      <w:r>
-        <w:t xml:space="preserve"> </w:t>
-      </w:r>
-      <w:r>
-        <w:t xml:space="preserve">that the victim was alive at the time that the defendant claimed that she had</w:t>
-      </w:r>
-      <w:r>
-        <w:t xml:space="preserve"> </w:t>
-      </w:r>
-      <w:r>
-        <w:t xml:space="preserve">been murdered by a third party.</w:t>
+        <w:t xml:space="preserve">biographical core</w:t>
       </w:r>
       <w:r>
         <w:t xml:space="preserve">”</w:t>
       </w:r>
+      <w:r>
+        <w:t xml:space="preserve"> </w:t>
+      </w:r>
+      <w:r>
+        <w:t xml:space="preserve">of personal information</w:t>
+      </w:r>
+      <w:r>
+        <w:t xml:space="preserve"> </w:t>
+      </w:r>
+      <w:r>
+        <w:t xml:space="preserve">protected by section 8 of the Charter. If the search was unconstitutional, the</w:t>
+      </w:r>
+      <w:r>
+        <w:t xml:space="preserve"> </w:t>
+      </w:r>
+      <w:r>
+        <w:t xml:space="preserve">tracklog could be excluded, and the fourth pillar would fall.</w:t>
+      </w:r>
     </w:p>
     <w:p>
       <w:pPr>
         <w:pStyle w:val="BodyText"/>
       </w:pPr>
       <w:r>
-        <w:t xml:space="preserve">The rest of the case fell in behind the timeline like iron filings behind a</w:t>
-      </w:r>
-      <w:r>
-        <w:t xml:space="preserve"> </w:t>
-      </w:r>
-      <w:r>
-        <w:t xml:space="preserve">magnet.</w:t>
+        <w:t xml:space="preserve">The Court of Appeal for Ontario’s answer, delivered by Associate Chief Justice</w:t>
+      </w:r>
+      <w:r>
+        <w:t xml:space="preserve"> </w:t>
+      </w:r>
+      <w:r>
+        <w:t xml:space="preserve">Fairburn in October 2022, is the dark joke at the heart of this chapter.</w:t>
+      </w:r>
+      <w:r>
+        <w:t xml:space="preserve"> </w:t>
+      </w:r>
+      <w:r>
+        <w:t xml:space="preserve">Privacy claims belong to people with a legitimate connection to the thing</w:t>
+      </w:r>
+      <w:r>
+        <w:t xml:space="preserve"> </w:t>
+      </w:r>
+      <w:r>
+        <w:t xml:space="preserve">searched — through ownership, control, a right to be where they were. Dosanjh’s</w:t>
+      </w:r>
+      <w:r>
+        <w:t xml:space="preserve"> </w:t>
+      </w:r>
+      <w:r>
+        <w:t xml:space="preserve">connection to the QX60 was a rental contract signed in the name of a man who</w:t>
+      </w:r>
+      <w:r>
+        <w:t xml:space="preserve"> </w:t>
+      </w:r>
+      <w:r>
+        <w:t xml:space="preserve">did not exist. The GPS data, the court noted, came from a vehicle he had</w:t>
+      </w:r>
+      <w:r>
+        <w:t xml:space="preserve"> </w:t>
+      </w:r>
+      <w:r>
+        <w:t xml:space="preserve">“</w:t>
+      </w:r>
+      <w:r>
+        <w:t xml:space="preserve">no</w:t>
+      </w:r>
+      <w:r>
+        <w:t xml:space="preserve"> </w:t>
+      </w:r>
+      <w:r>
+        <w:t xml:space="preserve">right to be driving</w:t>
+      </w:r>
+      <w:r>
+        <w:t xml:space="preserve">”</w:t>
+      </w:r>
+      <w:r>
+        <w:t xml:space="preserve">; the synced contact list wasn’t even his phone’s. Tracking</w:t>
+      </w:r>
+      <w:r>
+        <w:t xml:space="preserve"> </w:t>
+      </w:r>
+      <w:r>
+        <w:t xml:space="preserve">data, the court added, sits far down the privacy spectrum to begin with — it</w:t>
+      </w:r>
+      <w:r>
+        <w:t xml:space="preserve"> </w:t>
+      </w:r>
+      <w:r>
+        <w:t xml:space="preserve">reveals where a car went, not the contents of a mind. He had no reasonable</w:t>
+      </w:r>
+      <w:r>
+        <w:t xml:space="preserve"> </w:t>
+      </w:r>
+      <w:r>
+        <w:t xml:space="preserve">expectation of privacy, and therefore no standing to complain; and even if the</w:t>
+      </w:r>
+      <w:r>
+        <w:t xml:space="preserve"> </w:t>
+      </w:r>
+      <w:r>
+        <w:t xml:space="preserve">search had breached the Charter, the evidence was reliable, the breach minimal,</w:t>
+      </w:r>
+      <w:r>
+        <w:t xml:space="preserve"> </w:t>
+      </w:r>
+      <w:r>
+        <w:t xml:space="preserve">and it would have been admitted anyway.</w:t>
       </w:r>
     </w:p>
     <w:p>
@@ -2811,49 +3258,19 @@
         <w:pStyle w:val="BodyText"/>
       </w:pPr>
       <w:r>
-        <w:t xml:space="preserve">A state police canine swept the house and found no scent of any third person.</w:t>
-      </w:r>
-      <w:r>
-        <w:t xml:space="preserve"> </w:t>
-      </w:r>
-      <w:r>
-        <w:t xml:space="preserve">The forensic laboratory found Richard’s DNA where the intruder’s should have</w:t>
-      </w:r>
-      <w:r>
-        <w:t xml:space="preserve"> </w:t>
-      </w:r>
-      <w:r>
-        <w:t xml:space="preserve">been: on the basement safe, on the back of the folding chair he’d been</w:t>
-      </w:r>
-      <w:r>
-        <w:t xml:space="preserve"> </w:t>
-      </w:r>
-      <w:r>
-        <w:t xml:space="preserve">“</w:t>
-      </w:r>
-      <w:r>
-        <w:t xml:space="preserve">bound</w:t>
-      </w:r>
-      <w:r>
-        <w:t xml:space="preserve">”</w:t>
-      </w:r>
-      <w:r>
-        <w:t xml:space="preserve"> </w:t>
-      </w:r>
-      <w:r>
-        <w:t xml:space="preserve">to, on the handle of the gun, on the box cutter. His zip ties were tied loose.</w:t>
-      </w:r>
-      <w:r>
-        <w:t xml:space="preserve"> </w:t>
-      </w:r>
-      <w:r>
-        <w:t xml:space="preserve">His wounds — thighs, chest, a finger — were the shallow geometry of</w:t>
-      </w:r>
-      <w:r>
-        <w:t xml:space="preserve"> </w:t>
-      </w:r>
-      <w:r>
-        <w:t xml:space="preserve">self-infliction, not torture.</w:t>
+        <w:t xml:space="preserve">The fake name was supposed to make the car untraceable to him. Instead it made</w:t>
+      </w:r>
+      <w:r>
+        <w:t xml:space="preserve"> </w:t>
+      </w:r>
+      <w:r>
+        <w:t xml:space="preserve">the car’s memory untouchable by him. He had disowned the Infiniti so</w:t>
+      </w:r>
+      <w:r>
+        <w:t xml:space="preserve"> </w:t>
+      </w:r>
+      <w:r>
+        <w:t xml:space="preserve">thoroughly that when it testified, he had no legal voice to object.</w:t>
       </w:r>
     </w:p>
     <w:p>
@@ -2861,98 +3278,17 @@
         <w:pStyle w:val="BodyText"/>
       </w:pPr>
       <w:r>
-        <w:t xml:space="preserve">And then there was the motive, which Richard himself handed to detectives from</w:t>
-      </w:r>
-      <w:r>
-        <w:t xml:space="preserve"> </w:t>
-      </w:r>
-      <w:r>
-        <w:t xml:space="preserve">a bed at Hartford Hospital. For seven years he had been carrying on an affair</w:t>
-      </w:r>
-      <w:r>
-        <w:t xml:space="preserve"> </w:t>
-      </w:r>
-      <w:r>
-        <w:t xml:space="preserve">with a woman named Sara Ganzer. In June 2015 she became pregnant with his</w:t>
-      </w:r>
-      <w:r>
-        <w:t xml:space="preserve"> </w:t>
-      </w:r>
-      <w:r>
-        <w:t xml:space="preserve">child; he told her he was divorcing Connie and had already moved half his</w:t>
-      </w:r>
-      <w:r>
-        <w:t xml:space="preserve"> </w:t>
-      </w:r>
-      <w:r>
-        <w:t xml:space="preserve">things out. He was lying. He never called a divorce lawyer — a divorce, he</w:t>
-      </w:r>
-      <w:r>
-        <w:t xml:space="preserve"> </w:t>
-      </w:r>
-      <w:r>
-        <w:t xml:space="preserve">feared, would wreck him financially and detonate his family. When detectives</w:t>
-      </w:r>
-      <w:r>
-        <w:t xml:space="preserve"> </w:t>
-      </w:r>
-      <w:r>
-        <w:t xml:space="preserve">first asked, he floated an audacious cover story: he and Connie couldn’t have</w:t>
-      </w:r>
-      <w:r>
-        <w:t xml:space="preserve"> </w:t>
-      </w:r>
-      <w:r>
-        <w:t xml:space="preserve">another child, so Sara was carrying the baby as their</w:t>
-      </w:r>
-      <w:r>
-        <w:t xml:space="preserve"> </w:t>
-      </w:r>
-      <w:r>
-        <w:rPr>
-          <w:iCs/>
-          <w:i/>
-        </w:rPr>
-        <w:t xml:space="preserve">surrogate</w:t>
-      </w:r>
-      <w:r>
-        <w:t xml:space="preserve">. Under</w:t>
-      </w:r>
-      <w:r>
-        <w:t xml:space="preserve"> </w:t>
-      </w:r>
-      <w:r>
-        <w:t xml:space="preserve">pressure, that collapsed into the truth. The detectives told him, almost</w:t>
-      </w:r>
-      <w:r>
-        <w:t xml:space="preserve"> </w:t>
-      </w:r>
-      <w:r>
-        <w:t xml:space="preserve">gently, that his account of the morning would be easy to check against the</w:t>
-      </w:r>
-      <w:r>
-        <w:t xml:space="preserve"> </w:t>
-      </w:r>
-      <w:r>
-        <w:t xml:space="preserve">electronic records. Richard asked for a lawyer.</w:t>
-      </w:r>
-    </w:p>
-    <w:p>
-      <w:pPr>
-        <w:pStyle w:val="BodyText"/>
-      </w:pPr>
-      <w:r>
-        <w:t xml:space="preserve">Sixteen months later he was arrested for murder.</w:t>
-      </w:r>
-    </w:p>
-    <w:bookmarkEnd w:id="35"/>
-    <w:bookmarkStart w:id="36" w:name="Xb2f571a3ce5b829599892b5c7bae5c141c375a5"/>
+        <w:t xml:space="preserve">The appeal was dismissed.</w:t>
+      </w:r>
+    </w:p>
+    <w:bookmarkEnd w:id="36"/>
+    <w:bookmarkStart w:id="38" w:name="howd-he-get-caught"/>
     <w:p>
       <w:pPr>
         <w:pStyle w:val="Heading2"/>
       </w:pPr>
       <w:r>
-        <w:t xml:space="preserve">The science: making a step-counter testify</w:t>
+        <w:t xml:space="preserve">How’d he get caught?</w:t>
       </w:r>
     </w:p>
     <w:p>
@@ -2960,311 +3296,49 @@
         <w:pStyle w:val="FirstParagraph"/>
       </w:pPr>
       <w:r>
-        <w:t xml:space="preserve">Getting a fitness tracker’s word into a murder trial is not automatic. Dabate’s</w:t>
-      </w:r>
-      <w:r>
-        <w:t xml:space="preserve"> </w:t>
-      </w:r>
-      <w:r>
-        <w:t xml:space="preserve">lawyers fought it hard, and the fight is what makes this case a landmark.</w:t>
-      </w:r>
-    </w:p>
-    <w:p>
-      <w:pPr>
-        <w:pStyle w:val="BodyText"/>
-      </w:pPr>
-      <w:r>
-        <w:t xml:space="preserve">Connecticut screens novel scientific evidence under</w:t>
-      </w:r>
-      <w:r>
-        <w:t xml:space="preserve"> </w:t>
-      </w:r>
-      <w:r>
-        <w:rPr>
-          <w:iCs/>
-          <w:i/>
-        </w:rPr>
-        <w:t xml:space="preserve">State v. Porter</w:t>
-      </w:r>
-      <w:r>
-        <w:t xml:space="preserve"> </w:t>
-      </w:r>
-      <w:r>
-        <w:t xml:space="preserve">— its</w:t>
-      </w:r>
-      <w:r>
-        <w:t xml:space="preserve"> </w:t>
-      </w:r>
-      <w:r>
-        <w:t xml:space="preserve">version of the federal</w:t>
-      </w:r>
-      <w:r>
-        <w:t xml:space="preserve"> </w:t>
-      </w:r>
-      <w:r>
-        <w:rPr>
-          <w:iCs/>
-          <w:i/>
-        </w:rPr>
-        <w:t xml:space="preserve">Daubert</w:t>
-      </w:r>
-      <w:r>
-        <w:t xml:space="preserve"> </w:t>
-      </w:r>
-      <w:r>
-        <w:t xml:space="preserve">standard. Before the Fitbit data could reach</w:t>
-      </w:r>
-      <w:r>
-        <w:t xml:space="preserve"> </w:t>
-      </w:r>
-      <w:r>
-        <w:t xml:space="preserve">the jury, a judge had to be satisfied the technology was genuinely reliable:</w:t>
-      </w:r>
-      <w:r>
-        <w:t xml:space="preserve"> </w:t>
-      </w:r>
-      <w:r>
-        <w:t xml:space="preserve">tested, peer-reviewed, accepted in the scientific community, not something</w:t>
-      </w:r>
-      <w:r>
-        <w:t xml:space="preserve"> </w:t>
-      </w:r>
-      <w:r>
-        <w:t xml:space="preserve">cooked up for courtrooms.</w:t>
-      </w:r>
-    </w:p>
-    <w:p>
-      <w:pPr>
-        <w:pStyle w:val="BodyText"/>
-      </w:pPr>
-      <w:r>
-        <w:t xml:space="preserve">The state’s answer was Keith Diaz, a professor of behavioral medicine at</w:t>
-      </w:r>
-      <w:r>
-        <w:t xml:space="preserve"> </w:t>
-      </w:r>
-      <w:r>
-        <w:t xml:space="preserve">Columbia University Medical Center and director of its Wearable Device Reading</w:t>
-      </w:r>
-      <w:r>
-        <w:t xml:space="preserve"> </w:t>
-      </w:r>
-      <w:r>
-        <w:t xml:space="preserve">Center. Diaz had run an NIH-funded validation study of consumer fitness</w:t>
-      </w:r>
-      <w:r>
-        <w:t xml:space="preserve"> </w:t>
-      </w:r>
-      <w:r>
-        <w:t xml:space="preserve">trackers, and his findings were quietly remarkable: the Fitbit is</w:t>
-      </w:r>
-      <w:r>
-        <w:t xml:space="preserve"> </w:t>
-      </w:r>
-      <w:r>
-        <w:rPr>
-          <w:iCs/>
-          <w:i/>
-        </w:rPr>
-        <w:t xml:space="preserve">very</w:t>
-      </w:r>
-      <w:r>
-        <w:t xml:space="preserve"> </w:t>
-      </w:r>
-      <w:r>
-        <w:t xml:space="preserve">accurate at counting steps — more accurate, in fact, than the Actical, a</w:t>
-      </w:r>
-      <w:r>
-        <w:t xml:space="preserve"> </w:t>
-      </w:r>
-      <w:r>
-        <w:t xml:space="preserve">research-grade device scientists use. And it is at its most accurate when worn</w:t>
-      </w:r>
-      <w:r>
-        <w:t xml:space="preserve"> </w:t>
-      </w:r>
-      <w:r>
-        <w:t xml:space="preserve">on the hip.</w:t>
-      </w:r>
-    </w:p>
-    <w:p>
-      <w:pPr>
-        <w:pStyle w:val="BodyText"/>
-      </w:pPr>
-      <w:r>
-        <w:t xml:space="preserve">Connie wore hers on her hip.</w:t>
-      </w:r>
-    </w:p>
-    <w:p>
-      <w:pPr>
-        <w:pStyle w:val="BodyText"/>
-      </w:pPr>
-      <w:r>
-        <w:t xml:space="preserve">The defense’s best punch was a clever one: Diaz couldn’t explain Fitbit’s</w:t>
-      </w:r>
-      <w:r>
-        <w:t xml:space="preserve"> </w:t>
-      </w:r>
-      <w:r>
-        <w:t xml:space="preserve">proprietary internal algorithm — the secret code that turns raw motion into a</w:t>
-      </w:r>
-      <w:r>
-        <w:t xml:space="preserve"> </w:t>
-      </w:r>
-      <w:r>
-        <w:t xml:space="preserve">step count. If the expert can’t open the black box, how can the court trust</w:t>
-      </w:r>
-      <w:r>
-        <w:t xml:space="preserve"> </w:t>
-      </w:r>
-      <w:r>
-        <w:t xml:space="preserve">what comes out of it? The Connecticut Supreme Court’s answer will echo through</w:t>
-      </w:r>
-      <w:r>
-        <w:t xml:space="preserve"> </w:t>
-      </w:r>
-      <w:r>
-        <w:t xml:space="preserve">every device case to come: an expert doesn’t need the source code to prove a</w:t>
-      </w:r>
-      <w:r>
-        <w:t xml:space="preserve"> </w:t>
-      </w:r>
-      <w:r>
-        <w:t xml:space="preserve">machine’s output is reliable, any more than he needs Ford’s blueprints to</w:t>
-      </w:r>
-      <w:r>
-        <w:t xml:space="preserve"> </w:t>
-      </w:r>
-      <w:r>
-        <w:t xml:space="preserve">testify that a speedometer works. What matters is validation — testing the</w:t>
-      </w:r>
-      <w:r>
-        <w:t xml:space="preserve"> </w:t>
-      </w:r>
-      <w:r>
-        <w:t xml:space="preserve">device against ground truth, publishing the results, letting other scientists</w:t>
-      </w:r>
-      <w:r>
-        <w:t xml:space="preserve"> </w:t>
-      </w:r>
-      <w:r>
-        <w:t xml:space="preserve">tear at them.</w:t>
-      </w:r>
-    </w:p>
-    <w:p>
-      <w:pPr>
-        <w:pStyle w:val="BodyText"/>
-      </w:pPr>
-      <w:r>
-        <w:t xml:space="preserve">The jury convicted Richard Dabate of murder, tampering with evidence, and</w:t>
-      </w:r>
-      <w:r>
-        <w:t xml:space="preserve"> </w:t>
-      </w:r>
-      <w:r>
-        <w:t xml:space="preserve">making a false statement. He was sentenced to sixty-five years. In March 2025,</w:t>
-      </w:r>
-      <w:r>
-        <w:t xml:space="preserve"> </w:t>
-      </w:r>
-      <w:r>
-        <w:t xml:space="preserve">the Connecticut Supreme Court affirmed it all — even while scolding the</w:t>
-      </w:r>
-      <w:r>
-        <w:t xml:space="preserve"> </w:t>
-      </w:r>
-      <w:r>
-        <w:t xml:space="preserve">prosecutor for four separate instances of courtroom impropriety, including the</w:t>
-      </w:r>
-      <w:r>
-        <w:t xml:space="preserve"> </w:t>
-      </w:r>
-      <w:r>
-        <w:t xml:space="preserve">moment he asked Dabate whether he’d been</w:t>
-      </w:r>
-      <w:r>
-        <w:t xml:space="preserve"> </w:t>
-      </w:r>
-      <w:r>
-        <w:t xml:space="preserve">“</w:t>
-      </w:r>
-      <w:r>
-        <w:t xml:space="preserve">trying to create a little mini</w:t>
-      </w:r>
-      <w:r>
-        <w:t xml:space="preserve"> </w:t>
-      </w:r>
-      <w:r>
-        <w:t xml:space="preserve">Cheshire scene,</w:t>
-      </w:r>
-      <w:r>
-        <w:t xml:space="preserve">”</w:t>
-      </w:r>
-      <w:r>
-        <w:t xml:space="preserve"> </w:t>
-      </w:r>
-      <w:r>
-        <w:t xml:space="preserve">a forbidden reference to Connecticut’s most notorious real</w:t>
-      </w:r>
-      <w:r>
-        <w:t xml:space="preserve"> </w:t>
-      </w:r>
-      <w:r>
-        <w:t xml:space="preserve">home invasion. The improprieties were real, the court held; the case against</w:t>
-      </w:r>
-      <w:r>
-        <w:t xml:space="preserve"> </w:t>
-      </w:r>
-      <w:r>
-        <w:t xml:space="preserve">Dabate was simply overwhelming with or without them.</w:t>
-      </w:r>
-    </w:p>
-    <w:bookmarkEnd w:id="36"/>
-    <w:bookmarkStart w:id="39" w:name="howd-he-get-caught"/>
-    <w:p>
-      <w:pPr>
-        <w:pStyle w:val="Heading2"/>
-      </w:pPr>
-      <w:r>
-        <w:t xml:space="preserve">How’d he get caught?</w:t>
-      </w:r>
-    </w:p>
-    <w:p>
-      <w:pPr>
-        <w:pStyle w:val="FirstParagraph"/>
-      </w:pPr>
-      <w:r>
-        <w:t xml:space="preserve">He staged a home invasion for an audience of police officers — and forgot the</w:t>
-      </w:r>
-      <w:r>
-        <w:t xml:space="preserve"> </w:t>
-      </w:r>
-      <w:r>
-        <w:t xml:space="preserve">other witnesses in the house. The security panel logged his rehearsal. Facebook</w:t>
-      </w:r>
-      <w:r>
-        <w:t xml:space="preserve"> </w:t>
-      </w:r>
-      <w:r>
-        <w:t xml:space="preserve">logged his wife’s final ordinary hour. And a $99 step-counter on her hip logged</w:t>
-      </w:r>
-      <w:r>
-        <w:t xml:space="preserve"> </w:t>
-      </w:r>
-      <w:r>
-        <w:t xml:space="preserve">the exact minute her life ended, an hour out of sync with the story her husband</w:t>
-      </w:r>
-      <w:r>
-        <w:t xml:space="preserve"> </w:t>
-      </w:r>
-      <w:r>
-        <w:t xml:space="preserve">was already telling. Richard Dabate built an alibi out of words. Connie’s</w:t>
-      </w:r>
-      <w:r>
-        <w:t xml:space="preserve"> </w:t>
-      </w:r>
-      <w:r>
-        <w:t xml:space="preserve">Fitbit outlived it.</w:t>
+        <w:t xml:space="preserve">He planned everything except the passenger seat. The false identity, the</w:t>
+      </w:r>
+      <w:r>
+        <w:t xml:space="preserve"> </w:t>
+      </w:r>
+      <w:r>
+        <w:t xml:space="preserve">borrowed-strangers story, the gas station across the street — all of it was</w:t>
+      </w:r>
+      <w:r>
+        <w:t xml:space="preserve"> </w:t>
+      </w:r>
+      <w:r>
+        <w:t xml:space="preserve">built to keep Raja Dosanjh’s name off the getaway car. But the car didn’t need</w:t>
+      </w:r>
+      <w:r>
+        <w:t xml:space="preserve"> </w:t>
+      </w:r>
+      <w:r>
+        <w:t xml:space="preserve">his name. It logged the rental lot, the family home, the hotel, and the murder</w:t>
+      </w:r>
+      <w:r>
+        <w:t xml:space="preserve"> </w:t>
+      </w:r>
+      <w:r>
+        <w:t xml:space="preserve">minute all on its own, his DNA rode the gun grip, and the same cameras that</w:t>
+      </w:r>
+      <w:r>
+        <w:t xml:space="preserve"> </w:t>
+      </w:r>
+      <w:r>
+        <w:t xml:space="preserve">never saw his face remembered his shoes. The modern getaway car is the worst</w:t>
+      </w:r>
+      <w:r>
+        <w:t xml:space="preserve"> </w:t>
+      </w:r>
+      <w:r>
+        <w:t xml:space="preserve">accomplice in crime: it goes everywhere you go, remembers everything, and owes</w:t>
+      </w:r>
+      <w:r>
+        <w:t xml:space="preserve"> </w:t>
+      </w:r>
+      <w:r>
+        <w:t xml:space="preserve">you nothing — especially if you were never really its driver.</w:t>
       </w:r>
     </w:p>
     <w:p>
@@ -3293,6 +3367,872 @@
           <w:iCs/>
           <w:i/>
         </w:rPr>
+        <w:t xml:space="preserve">R. v. Dosanjh</w:t>
+      </w:r>
+      <w:r>
+        <w:t xml:space="preserve">, 2022 ONCA 689, Court of</w:t>
+      </w:r>
+      <w:r>
+        <w:t xml:space="preserve"> </w:t>
+      </w:r>
+      <w:r>
+        <w:t xml:space="preserve">Appeal for Ontario, decided October 7, 2022.</w:t>
+      </w:r>
+      <w:r>
+        <w:t xml:space="preserve"> </w:t>
+      </w:r>
+      <w:r>
+        <w:t xml:space="preserve">Free online:</w:t>
+      </w:r>
+      <w:r>
+        <w:t xml:space="preserve"> </w:t>
+      </w:r>
+      <w:hyperlink r:id="rId37">
+        <w:r>
+          <w:rPr>
+            <w:rStyle w:val="Hyperlink"/>
+          </w:rPr>
+          <w:t xml:space="preserve">CanLII</w:t>
+        </w:r>
+      </w:hyperlink>
+      <w:r>
+        <w:t xml:space="preserve">.</w:t>
+      </w:r>
+      <w:r>
+        <w:t xml:space="preserve"> </w:t>
+      </w:r>
+      <w:r>
+        <w:t xml:space="preserve">The factual matrix is set out in the Overview and Factual Context; the</w:t>
+      </w:r>
+      <w:r>
+        <w:t xml:space="preserve"> </w:t>
+      </w:r>
+      <w:r>
+        <w:t xml:space="preserve">infotainment/GPS privacy analysis begins at the section on the search of the</w:t>
+      </w:r>
+      <w:r>
+        <w:t xml:space="preserve"> </w:t>
+      </w:r>
+      <w:r>
+        <w:t xml:space="preserve">getaway vehicle.</w:t>
+      </w:r>
+    </w:p>
+    <w:bookmarkEnd w:id="38"/>
+    <w:bookmarkEnd w:id="39"/>
+    <w:bookmarkStart w:id="46" w:name="X9203c5d96f35499ac85be75e6ac11cd798292f8"/>
+    <w:p>
+      <w:pPr>
+        <w:pStyle w:val="Heading1"/>
+      </w:pPr>
+      <w:r>
+        <w:t xml:space="preserve">Chapter 21 — Don’t Murder a Woman Wearing a Fitbit</w:t>
+      </w:r>
+    </w:p>
+    <w:p>
+      <w:pPr>
+        <w:pStyle w:val="FirstParagraph"/>
+      </w:pPr>
+      <w:r>
+        <w:rPr>
+          <w:bCs/>
+          <w:b/>
+        </w:rPr>
+        <w:t xml:space="preserve">Her husband told police she was already dead. Her Fitbit kept counting.</w:t>
+      </w:r>
+    </w:p>
+    <w:p>
+      <w:pPr>
+        <w:pStyle w:val="BodyText"/>
+      </w:pPr>
+      <w:r>
+        <w:t xml:space="preserve">Two days before Christmas 2015, Richard Dabate had a story ready.</w:t>
+      </w:r>
+    </w:p>
+    <w:p>
+      <w:pPr>
+        <w:pStyle w:val="BodyText"/>
+      </w:pPr>
+      <w:r>
+        <w:t xml:space="preserve">A man in camouflage, he told Connecticut State Police, had been hiding inside</w:t>
+      </w:r>
+      <w:r>
+        <w:t xml:space="preserve"> </w:t>
+      </w:r>
+      <w:r>
+        <w:t xml:space="preserve">his Ellington home. The intruder chased his wife Connie into the basement and</w:t>
+      </w:r>
+      <w:r>
+        <w:t xml:space="preserve"> </w:t>
+      </w:r>
+      <w:r>
+        <w:t xml:space="preserve">shot her with the Dabates’ own gun. Then he turned on Richard — zip-tied him to</w:t>
+      </w:r>
+      <w:r>
+        <w:t xml:space="preserve"> </w:t>
+      </w:r>
+      <w:r>
+        <w:t xml:space="preserve">a folding chair, cut him with a box cutter, burned him with a blowtorch — until</w:t>
+      </w:r>
+      <w:r>
+        <w:t xml:space="preserve"> </w:t>
+      </w:r>
+      <w:r>
+        <w:t xml:space="preserve">Richard heroically shoved the torch back toward the man’s face and drove him</w:t>
+      </w:r>
+      <w:r>
+        <w:t xml:space="preserve"> </w:t>
+      </w:r>
+      <w:r>
+        <w:t xml:space="preserve">off. Bleeding, bound, he triggered the home’s panic alarm and called 911.</w:t>
+      </w:r>
+    </w:p>
+    <w:p>
+      <w:pPr>
+        <w:pStyle w:val="BodyText"/>
+      </w:pPr>
+      <w:r>
+        <w:t xml:space="preserve">When officers arrived they found Connie’s body in the basement. They found the</w:t>
+      </w:r>
+      <w:r>
+        <w:t xml:space="preserve"> </w:t>
+      </w:r>
+      <w:r>
+        <w:t xml:space="preserve">gun. They found a butane torch, a box cutter, burnt debris, droplets of blood.</w:t>
+      </w:r>
+    </w:p>
+    <w:p>
+      <w:pPr>
+        <w:pStyle w:val="BodyText"/>
+      </w:pPr>
+      <w:r>
+        <w:t xml:space="preserve">They found, in other words, exactly the scene Richard had described.</w:t>
+      </w:r>
+    </w:p>
+    <w:p>
+      <w:pPr>
+        <w:pStyle w:val="BodyText"/>
+      </w:pPr>
+      <w:r>
+        <w:t xml:space="preserve">The problem was everything the scene couldn’t say — and one device that could.</w:t>
+      </w:r>
+    </w:p>
+    <w:bookmarkStart w:id="40" w:name="X7b11d94e34298c01d860c15ea739cb0dfca6508"/>
+    <w:p>
+      <w:pPr>
+        <w:pStyle w:val="Heading2"/>
+      </w:pPr>
+      <w:r>
+        <w:t xml:space="preserve">The morning, as the machines remembered it</w:t>
+      </w:r>
+    </w:p>
+    <w:p>
+      <w:pPr>
+        <w:pStyle w:val="FirstParagraph"/>
+      </w:pPr>
+      <w:r>
+        <w:t xml:space="preserve">Here is the morning of December 23, 2015, as the jury ultimately found it — not</w:t>
+      </w:r>
+      <w:r>
+        <w:t xml:space="preserve"> </w:t>
+      </w:r>
+      <w:r>
+        <w:t xml:space="preserve">from any witness, but from the electronic wake the household left behind.</w:t>
+      </w:r>
+    </w:p>
+    <w:p>
+      <w:pPr>
+        <w:pStyle w:val="BodyText"/>
+      </w:pPr>
+      <w:r>
+        <w:t xml:space="preserve">Connie Dabate left for the gym at 8:46 a.m. Her class was cancelled, so she came</w:t>
+      </w:r>
+      <w:r>
+        <w:t xml:space="preserve"> </w:t>
+      </w:r>
+      <w:r>
+        <w:t xml:space="preserve">home at 9:18. She talked to her mother on the phone. She posted on Facebook. She</w:t>
+      </w:r>
+      <w:r>
+        <w:t xml:space="preserve"> </w:t>
+      </w:r>
+      <w:r>
+        <w:t xml:space="preserve">messaged a friend. An ordinary woman, running an ordinary errand, two days</w:t>
+      </w:r>
+      <w:r>
+        <w:t xml:space="preserve"> </w:t>
+      </w:r>
+      <w:r>
+        <w:t xml:space="preserve">before Christmas.</w:t>
+      </w:r>
+    </w:p>
+    <w:p>
+      <w:pPr>
+        <w:pStyle w:val="BodyText"/>
+      </w:pPr>
+      <w:r>
+        <w:t xml:space="preserve">Richard never left the house. In those same quiet morning hours, the home’s own</w:t>
+      </w:r>
+      <w:r>
+        <w:t xml:space="preserve"> </w:t>
+      </w:r>
+      <w:r>
+        <w:t xml:space="preserve">records caught him opening the basement door</w:t>
+      </w:r>
+      <w:r>
+        <w:t xml:space="preserve"> </w:t>
+      </w:r>
+      <w:r>
+        <w:rPr>
+          <w:iCs/>
+          <w:i/>
+        </w:rPr>
+        <w:t xml:space="preserve">eight times</w:t>
+      </w:r>
+      <w:r>
+        <w:t xml:space="preserve">. Arming and</w:t>
+      </w:r>
+      <w:r>
+        <w:t xml:space="preserve"> </w:t>
+      </w:r>
+      <w:r>
+        <w:t xml:space="preserve">disarming the security system, again and again. At some point he walked outside</w:t>
+      </w:r>
+      <w:r>
+        <w:t xml:space="preserve"> </w:t>
+      </w:r>
+      <w:r>
+        <w:t xml:space="preserve">and placed his own wallet near the basement bulkhead stairs — set dressing for</w:t>
+      </w:r>
+      <w:r>
+        <w:t xml:space="preserve"> </w:t>
+      </w:r>
+      <w:r>
+        <w:t xml:space="preserve">the burglary to come. In between, he answered work emails and played music on</w:t>
+      </w:r>
+      <w:r>
+        <w:t xml:space="preserve"> </w:t>
+      </w:r>
+      <w:r>
+        <w:t xml:space="preserve">his phone. When he heard Connie come home earlier than he expected, he did</w:t>
+      </w:r>
+      <w:r>
+        <w:t xml:space="preserve"> </w:t>
+      </w:r>
+      <w:r>
+        <w:t xml:space="preserve">something almost unbearably mundane: he checked the gym schedule.</w:t>
+      </w:r>
+    </w:p>
+    <w:p>
+      <w:pPr>
+        <w:pStyle w:val="BodyText"/>
+      </w:pPr>
+      <w:r>
+        <w:t xml:space="preserve">At 10:05 a.m., he lured his wife down to the basement and shot her with a</w:t>
+      </w:r>
+      <w:r>
+        <w:t xml:space="preserve"> </w:t>
+      </w:r>
+      <w:r>
+        <w:t xml:space="preserve">pistol the couple had bought only two months earlier.</w:t>
+      </w:r>
+    </w:p>
+    <w:p>
+      <w:pPr>
+        <w:pStyle w:val="BodyText"/>
+      </w:pPr>
+      <w:r>
+        <w:t xml:space="preserve">We can put a time on it because Connie was wearing a Fitbit One clipped to her</w:t>
+      </w:r>
+      <w:r>
+        <w:t xml:space="preserve"> </w:t>
+      </w:r>
+      <w:r>
+        <w:t xml:space="preserve">hip — a device that does exactly one thing, tirelessly: it counts its wearer’s</w:t>
+      </w:r>
+      <w:r>
+        <w:t xml:space="preserve"> </w:t>
+      </w:r>
+      <w:r>
+        <w:t xml:space="preserve">steps, minute by minute. At 10:05 a.m., it stopped.</w:t>
+      </w:r>
+    </w:p>
+    <w:bookmarkEnd w:id="40"/>
+    <w:bookmarkStart w:id="41" w:name="Xe67b992d38f8a0f7b4654d7ff9a0bd5ed378ef7"/>
+    <w:p>
+      <w:pPr>
+        <w:pStyle w:val="Heading2"/>
+      </w:pPr>
+      <w:r>
+        <w:t xml:space="preserve">The story that couldn’t survive its own timeline</w:t>
+      </w:r>
+    </w:p>
+    <w:p>
+      <w:pPr>
+        <w:pStyle w:val="FirstParagraph"/>
+      </w:pPr>
+      <w:r>
+        <w:t xml:space="preserve">Richard’s account put a masked killer in the house while Connie fled for her</w:t>
+      </w:r>
+      <w:r>
+        <w:t xml:space="preserve"> </w:t>
+      </w:r>
+      <w:r>
+        <w:t xml:space="preserve">life. But her Fitbit — together with her Facebook activity — showed the jury</w:t>
+      </w:r>
+      <w:r>
+        <w:t xml:space="preserve"> </w:t>
+      </w:r>
+      <w:r>
+        <w:t xml:space="preserve">something devastating: Connie was alive, moving, posting, messaging,</w:t>
+      </w:r>
+      <w:r>
+        <w:t xml:space="preserve"> </w:t>
+      </w:r>
+      <w:r>
+        <w:rPr>
+          <w:iCs/>
+          <w:i/>
+        </w:rPr>
+        <w:t xml:space="preserve">after</w:t>
+      </w:r>
+      <w:r>
+        <w:t xml:space="preserve"> </w:t>
+      </w:r>
+      <w:r>
+        <w:t xml:space="preserve">the point where Richard’s story needed her to be dead. As the Connecticut</w:t>
+      </w:r>
+      <w:r>
+        <w:t xml:space="preserve"> </w:t>
+      </w:r>
+      <w:r>
+        <w:t xml:space="preserve">Supreme Court later put it, the electronic evidence</w:t>
+      </w:r>
+      <w:r>
+        <w:t xml:space="preserve"> </w:t>
+      </w:r>
+      <w:r>
+        <w:t xml:space="preserve">“</w:t>
+      </w:r>
+      <w:r>
+        <w:t xml:space="preserve">demonstrated to the jury</w:t>
+      </w:r>
+      <w:r>
+        <w:t xml:space="preserve"> </w:t>
+      </w:r>
+      <w:r>
+        <w:t xml:space="preserve">that the victim was alive at the time that the defendant claimed that she had</w:t>
+      </w:r>
+      <w:r>
+        <w:t xml:space="preserve"> </w:t>
+      </w:r>
+      <w:r>
+        <w:t xml:space="preserve">been murdered by a third party.</w:t>
+      </w:r>
+      <w:r>
+        <w:t xml:space="preserve">”</w:t>
+      </w:r>
+    </w:p>
+    <w:p>
+      <w:pPr>
+        <w:pStyle w:val="BodyText"/>
+      </w:pPr>
+      <w:r>
+        <w:t xml:space="preserve">The rest of the case fell in behind the timeline like iron filings behind a</w:t>
+      </w:r>
+      <w:r>
+        <w:t xml:space="preserve"> </w:t>
+      </w:r>
+      <w:r>
+        <w:t xml:space="preserve">magnet.</w:t>
+      </w:r>
+    </w:p>
+    <w:p>
+      <w:pPr>
+        <w:pStyle w:val="BodyText"/>
+      </w:pPr>
+      <w:r>
+        <w:t xml:space="preserve">A state police canine swept the house and found no scent of any third person.</w:t>
+      </w:r>
+      <w:r>
+        <w:t xml:space="preserve"> </w:t>
+      </w:r>
+      <w:r>
+        <w:t xml:space="preserve">The forensic laboratory found Richard’s DNA where the intruder’s should have</w:t>
+      </w:r>
+      <w:r>
+        <w:t xml:space="preserve"> </w:t>
+      </w:r>
+      <w:r>
+        <w:t xml:space="preserve">been: on the basement safe, on the back of the folding chair he’d been</w:t>
+      </w:r>
+      <w:r>
+        <w:t xml:space="preserve"> </w:t>
+      </w:r>
+      <w:r>
+        <w:t xml:space="preserve">“</w:t>
+      </w:r>
+      <w:r>
+        <w:t xml:space="preserve">bound</w:t>
+      </w:r>
+      <w:r>
+        <w:t xml:space="preserve">”</w:t>
+      </w:r>
+      <w:r>
+        <w:t xml:space="preserve"> </w:t>
+      </w:r>
+      <w:r>
+        <w:t xml:space="preserve">to, on the handle of the gun, on the box cutter. His zip ties were tied loose.</w:t>
+      </w:r>
+      <w:r>
+        <w:t xml:space="preserve"> </w:t>
+      </w:r>
+      <w:r>
+        <w:t xml:space="preserve">His wounds — thighs, chest, a finger — were the shallow geometry of</w:t>
+      </w:r>
+      <w:r>
+        <w:t xml:space="preserve"> </w:t>
+      </w:r>
+      <w:r>
+        <w:t xml:space="preserve">self-infliction, not torture.</w:t>
+      </w:r>
+    </w:p>
+    <w:p>
+      <w:pPr>
+        <w:pStyle w:val="BodyText"/>
+      </w:pPr>
+      <w:r>
+        <w:t xml:space="preserve">And then there was the motive, which Richard himself handed to detectives from</w:t>
+      </w:r>
+      <w:r>
+        <w:t xml:space="preserve"> </w:t>
+      </w:r>
+      <w:r>
+        <w:t xml:space="preserve">a bed at Hartford Hospital. For seven years he had been carrying on an affair</w:t>
+      </w:r>
+      <w:r>
+        <w:t xml:space="preserve"> </w:t>
+      </w:r>
+      <w:r>
+        <w:t xml:space="preserve">with a woman named Sara Ganzer. In June 2015 she became pregnant with his</w:t>
+      </w:r>
+      <w:r>
+        <w:t xml:space="preserve"> </w:t>
+      </w:r>
+      <w:r>
+        <w:t xml:space="preserve">child; he told her he was divorcing Connie and had already moved half his</w:t>
+      </w:r>
+      <w:r>
+        <w:t xml:space="preserve"> </w:t>
+      </w:r>
+      <w:r>
+        <w:t xml:space="preserve">things out. He was lying. He never called a divorce lawyer — a divorce, he</w:t>
+      </w:r>
+      <w:r>
+        <w:t xml:space="preserve"> </w:t>
+      </w:r>
+      <w:r>
+        <w:t xml:space="preserve">feared, would wreck him financially and detonate his family. When detectives</w:t>
+      </w:r>
+      <w:r>
+        <w:t xml:space="preserve"> </w:t>
+      </w:r>
+      <w:r>
+        <w:t xml:space="preserve">first asked, he floated an audacious cover story: he and Connie couldn’t have</w:t>
+      </w:r>
+      <w:r>
+        <w:t xml:space="preserve"> </w:t>
+      </w:r>
+      <w:r>
+        <w:t xml:space="preserve">another child, so Sara was carrying the baby as their</w:t>
+      </w:r>
+      <w:r>
+        <w:t xml:space="preserve"> </w:t>
+      </w:r>
+      <w:r>
+        <w:rPr>
+          <w:iCs/>
+          <w:i/>
+        </w:rPr>
+        <w:t xml:space="preserve">surrogate</w:t>
+      </w:r>
+      <w:r>
+        <w:t xml:space="preserve">. Under</w:t>
+      </w:r>
+      <w:r>
+        <w:t xml:space="preserve"> </w:t>
+      </w:r>
+      <w:r>
+        <w:t xml:space="preserve">pressure, that collapsed into the truth. The detectives told him, almost</w:t>
+      </w:r>
+      <w:r>
+        <w:t xml:space="preserve"> </w:t>
+      </w:r>
+      <w:r>
+        <w:t xml:space="preserve">gently, that his account of the morning would be easy to check against the</w:t>
+      </w:r>
+      <w:r>
+        <w:t xml:space="preserve"> </w:t>
+      </w:r>
+      <w:r>
+        <w:t xml:space="preserve">electronic records. Richard asked for a lawyer.</w:t>
+      </w:r>
+    </w:p>
+    <w:p>
+      <w:pPr>
+        <w:pStyle w:val="BodyText"/>
+      </w:pPr>
+      <w:r>
+        <w:t xml:space="preserve">Sixteen months later he was arrested for murder.</w:t>
+      </w:r>
+    </w:p>
+    <w:bookmarkEnd w:id="41"/>
+    <w:bookmarkStart w:id="42" w:name="Xb2f571a3ce5b829599892b5c7bae5c141c375a5"/>
+    <w:p>
+      <w:pPr>
+        <w:pStyle w:val="Heading2"/>
+      </w:pPr>
+      <w:r>
+        <w:t xml:space="preserve">The science: making a step-counter testify</w:t>
+      </w:r>
+    </w:p>
+    <w:p>
+      <w:pPr>
+        <w:pStyle w:val="FirstParagraph"/>
+      </w:pPr>
+      <w:r>
+        <w:t xml:space="preserve">Getting a fitness tracker’s word into a murder trial is not automatic. Dabate’s</w:t>
+      </w:r>
+      <w:r>
+        <w:t xml:space="preserve"> </w:t>
+      </w:r>
+      <w:r>
+        <w:t xml:space="preserve">lawyers fought it hard, and the fight is what makes this case a landmark.</w:t>
+      </w:r>
+    </w:p>
+    <w:p>
+      <w:pPr>
+        <w:pStyle w:val="BodyText"/>
+      </w:pPr>
+      <w:r>
+        <w:t xml:space="preserve">Connecticut screens novel scientific evidence under</w:t>
+      </w:r>
+      <w:r>
+        <w:t xml:space="preserve"> </w:t>
+      </w:r>
+      <w:r>
+        <w:rPr>
+          <w:iCs/>
+          <w:i/>
+        </w:rPr>
+        <w:t xml:space="preserve">State v. Porter</w:t>
+      </w:r>
+      <w:r>
+        <w:t xml:space="preserve"> </w:t>
+      </w:r>
+      <w:r>
+        <w:t xml:space="preserve">— its</w:t>
+      </w:r>
+      <w:r>
+        <w:t xml:space="preserve"> </w:t>
+      </w:r>
+      <w:r>
+        <w:t xml:space="preserve">version of the federal</w:t>
+      </w:r>
+      <w:r>
+        <w:t xml:space="preserve"> </w:t>
+      </w:r>
+      <w:r>
+        <w:rPr>
+          <w:iCs/>
+          <w:i/>
+        </w:rPr>
+        <w:t xml:space="preserve">Daubert</w:t>
+      </w:r>
+      <w:r>
+        <w:t xml:space="preserve"> </w:t>
+      </w:r>
+      <w:r>
+        <w:t xml:space="preserve">standard. Before the Fitbit data could reach</w:t>
+      </w:r>
+      <w:r>
+        <w:t xml:space="preserve"> </w:t>
+      </w:r>
+      <w:r>
+        <w:t xml:space="preserve">the jury, a judge had to be satisfied the technology was genuinely reliable:</w:t>
+      </w:r>
+      <w:r>
+        <w:t xml:space="preserve"> </w:t>
+      </w:r>
+      <w:r>
+        <w:t xml:space="preserve">tested, peer-reviewed, accepted in the scientific community, not something</w:t>
+      </w:r>
+      <w:r>
+        <w:t xml:space="preserve"> </w:t>
+      </w:r>
+      <w:r>
+        <w:t xml:space="preserve">cooked up for courtrooms.</w:t>
+      </w:r>
+    </w:p>
+    <w:p>
+      <w:pPr>
+        <w:pStyle w:val="BodyText"/>
+      </w:pPr>
+      <w:r>
+        <w:t xml:space="preserve">The state’s answer was Keith Diaz, a professor of behavioral medicine at</w:t>
+      </w:r>
+      <w:r>
+        <w:t xml:space="preserve"> </w:t>
+      </w:r>
+      <w:r>
+        <w:t xml:space="preserve">Columbia University Medical Center and director of its Wearable Device Reading</w:t>
+      </w:r>
+      <w:r>
+        <w:t xml:space="preserve"> </w:t>
+      </w:r>
+      <w:r>
+        <w:t xml:space="preserve">Center. Diaz had run an NIH-funded validation study of consumer fitness</w:t>
+      </w:r>
+      <w:r>
+        <w:t xml:space="preserve"> </w:t>
+      </w:r>
+      <w:r>
+        <w:t xml:space="preserve">trackers, and his findings were quietly remarkable: the Fitbit is</w:t>
+      </w:r>
+      <w:r>
+        <w:t xml:space="preserve"> </w:t>
+      </w:r>
+      <w:r>
+        <w:rPr>
+          <w:iCs/>
+          <w:i/>
+        </w:rPr>
+        <w:t xml:space="preserve">very</w:t>
+      </w:r>
+      <w:r>
+        <w:t xml:space="preserve"> </w:t>
+      </w:r>
+      <w:r>
+        <w:t xml:space="preserve">accurate at counting steps — more accurate, in fact, than the Actical, a</w:t>
+      </w:r>
+      <w:r>
+        <w:t xml:space="preserve"> </w:t>
+      </w:r>
+      <w:r>
+        <w:t xml:space="preserve">research-grade device scientists use. And it is at its most accurate when worn</w:t>
+      </w:r>
+      <w:r>
+        <w:t xml:space="preserve"> </w:t>
+      </w:r>
+      <w:r>
+        <w:t xml:space="preserve">on the hip.</w:t>
+      </w:r>
+    </w:p>
+    <w:p>
+      <w:pPr>
+        <w:pStyle w:val="BodyText"/>
+      </w:pPr>
+      <w:r>
+        <w:t xml:space="preserve">Connie wore hers on her hip.</w:t>
+      </w:r>
+    </w:p>
+    <w:p>
+      <w:pPr>
+        <w:pStyle w:val="BodyText"/>
+      </w:pPr>
+      <w:r>
+        <w:t xml:space="preserve">The defense’s best punch was a clever one: Diaz couldn’t explain Fitbit’s</w:t>
+      </w:r>
+      <w:r>
+        <w:t xml:space="preserve"> </w:t>
+      </w:r>
+      <w:r>
+        <w:t xml:space="preserve">proprietary internal algorithm — the secret code that turns raw motion into a</w:t>
+      </w:r>
+      <w:r>
+        <w:t xml:space="preserve"> </w:t>
+      </w:r>
+      <w:r>
+        <w:t xml:space="preserve">step count. If the expert can’t open the black box, how can the court trust</w:t>
+      </w:r>
+      <w:r>
+        <w:t xml:space="preserve"> </w:t>
+      </w:r>
+      <w:r>
+        <w:t xml:space="preserve">what comes out of it? The Connecticut Supreme Court’s answer will echo through</w:t>
+      </w:r>
+      <w:r>
+        <w:t xml:space="preserve"> </w:t>
+      </w:r>
+      <w:r>
+        <w:t xml:space="preserve">every device case to come: an expert doesn’t need the source code to prove a</w:t>
+      </w:r>
+      <w:r>
+        <w:t xml:space="preserve"> </w:t>
+      </w:r>
+      <w:r>
+        <w:t xml:space="preserve">machine’s output is reliable, any more than he needs Ford’s blueprints to</w:t>
+      </w:r>
+      <w:r>
+        <w:t xml:space="preserve"> </w:t>
+      </w:r>
+      <w:r>
+        <w:t xml:space="preserve">testify that a speedometer works. What matters is validation — testing the</w:t>
+      </w:r>
+      <w:r>
+        <w:t xml:space="preserve"> </w:t>
+      </w:r>
+      <w:r>
+        <w:t xml:space="preserve">device against ground truth, publishing the results, letting other scientists</w:t>
+      </w:r>
+      <w:r>
+        <w:t xml:space="preserve"> </w:t>
+      </w:r>
+      <w:r>
+        <w:t xml:space="preserve">tear at them.</w:t>
+      </w:r>
+    </w:p>
+    <w:p>
+      <w:pPr>
+        <w:pStyle w:val="BodyText"/>
+      </w:pPr>
+      <w:r>
+        <w:t xml:space="preserve">The jury convicted Richard Dabate of murder, tampering with evidence, and</w:t>
+      </w:r>
+      <w:r>
+        <w:t xml:space="preserve"> </w:t>
+      </w:r>
+      <w:r>
+        <w:t xml:space="preserve">making a false statement. He was sentenced to sixty-five years. In March 2025,</w:t>
+      </w:r>
+      <w:r>
+        <w:t xml:space="preserve"> </w:t>
+      </w:r>
+      <w:r>
+        <w:t xml:space="preserve">the Connecticut Supreme Court affirmed it all — even while scolding the</w:t>
+      </w:r>
+      <w:r>
+        <w:t xml:space="preserve"> </w:t>
+      </w:r>
+      <w:r>
+        <w:t xml:space="preserve">prosecutor for four separate instances of courtroom impropriety, including the</w:t>
+      </w:r>
+      <w:r>
+        <w:t xml:space="preserve"> </w:t>
+      </w:r>
+      <w:r>
+        <w:t xml:space="preserve">moment he asked Dabate whether he’d been</w:t>
+      </w:r>
+      <w:r>
+        <w:t xml:space="preserve"> </w:t>
+      </w:r>
+      <w:r>
+        <w:t xml:space="preserve">“</w:t>
+      </w:r>
+      <w:r>
+        <w:t xml:space="preserve">trying to create a little mini</w:t>
+      </w:r>
+      <w:r>
+        <w:t xml:space="preserve"> </w:t>
+      </w:r>
+      <w:r>
+        <w:t xml:space="preserve">Cheshire scene,</w:t>
+      </w:r>
+      <w:r>
+        <w:t xml:space="preserve">”</w:t>
+      </w:r>
+      <w:r>
+        <w:t xml:space="preserve"> </w:t>
+      </w:r>
+      <w:r>
+        <w:t xml:space="preserve">a forbidden reference to Connecticut’s most notorious real</w:t>
+      </w:r>
+      <w:r>
+        <w:t xml:space="preserve"> </w:t>
+      </w:r>
+      <w:r>
+        <w:t xml:space="preserve">home invasion. The improprieties were real, the court held; the case against</w:t>
+      </w:r>
+      <w:r>
+        <w:t xml:space="preserve"> </w:t>
+      </w:r>
+      <w:r>
+        <w:t xml:space="preserve">Dabate was simply overwhelming with or without them.</w:t>
+      </w:r>
+    </w:p>
+    <w:bookmarkEnd w:id="42"/>
+    <w:bookmarkStart w:id="45" w:name="howd-he-get-caught-1"/>
+    <w:p>
+      <w:pPr>
+        <w:pStyle w:val="Heading2"/>
+      </w:pPr>
+      <w:r>
+        <w:t xml:space="preserve">How’d he get caught?</w:t>
+      </w:r>
+    </w:p>
+    <w:p>
+      <w:pPr>
+        <w:pStyle w:val="FirstParagraph"/>
+      </w:pPr>
+      <w:r>
+        <w:t xml:space="preserve">He staged a home invasion for an audience of police officers — and forgot the</w:t>
+      </w:r>
+      <w:r>
+        <w:t xml:space="preserve"> </w:t>
+      </w:r>
+      <w:r>
+        <w:t xml:space="preserve">other witnesses in the house. The security panel logged his rehearsal. Facebook</w:t>
+      </w:r>
+      <w:r>
+        <w:t xml:space="preserve"> </w:t>
+      </w:r>
+      <w:r>
+        <w:t xml:space="preserve">logged his wife’s final ordinary hour. And a $99 step-counter on her hip logged</w:t>
+      </w:r>
+      <w:r>
+        <w:t xml:space="preserve"> </w:t>
+      </w:r>
+      <w:r>
+        <w:t xml:space="preserve">the exact minute her life ended, an hour out of sync with the story her husband</w:t>
+      </w:r>
+      <w:r>
+        <w:t xml:space="preserve"> </w:t>
+      </w:r>
+      <w:r>
+        <w:t xml:space="preserve">was already telling. Richard Dabate built an alibi out of words. Connie’s</w:t>
+      </w:r>
+      <w:r>
+        <w:t xml:space="preserve"> </w:t>
+      </w:r>
+      <w:r>
+        <w:t xml:space="preserve">Fitbit outlived it.</w:t>
+      </w:r>
+    </w:p>
+    <w:p>
+      <w:r>
+        <w:pict>
+          <v:rect style="width:0;height:1.5pt" o:hralign="center" o:hrstd="t" o:hr="t"/>
+        </w:pict>
+      </w:r>
+    </w:p>
+    <w:p>
+      <w:pPr>
+        <w:pStyle w:val="BlockText"/>
+      </w:pPr>
+      <w:r>
+        <w:rPr>
+          <w:bCs/>
+          <w:b/>
+        </w:rPr>
+        <w:t xml:space="preserve">📖 Read the case yourself:</w:t>
+      </w:r>
+      <w:r>
+        <w:t xml:space="preserve"> </w:t>
+      </w:r>
+      <w:r>
+        <w:rPr>
+          <w:iCs/>
+          <w:i/>
+        </w:rPr>
         <w:t xml:space="preserve">State v. Dabate</w:t>
       </w:r>
       <w:r>
@@ -3313,7 +4253,7 @@
       <w:r>
         <w:t xml:space="preserve"> </w:t>
       </w:r>
-      <w:hyperlink r:id="rId37">
+      <w:hyperlink r:id="rId43">
         <w:r>
           <w:rPr>
             <w:rStyle w:val="Hyperlink"/>
@@ -3330,7 +4270,7 @@
       <w:r>
         <w:t xml:space="preserve"> </w:t>
       </w:r>
-      <w:hyperlink r:id="rId38">
+      <w:hyperlink r:id="rId44">
         <w:r>
           <w:rPr>
             <w:rStyle w:val="Hyperlink"/>
@@ -3354,8 +4294,903 @@
         <w:t xml:space="preserve">admissibility ruling is Part II.</w:t>
       </w:r>
     </w:p>
-    <w:bookmarkEnd w:id="39"/>
-    <w:bookmarkEnd w:id="40"/>
+    <w:bookmarkEnd w:id="45"/>
+    <w:bookmarkEnd w:id="46"/>
+    <w:bookmarkStart w:id="54" w:name="chapter-22-twelve-steps"/>
+    <w:p>
+      <w:pPr>
+        <w:pStyle w:val="Heading1"/>
+      </w:pPr>
+      <w:r>
+        <w:t xml:space="preserve">Chapter 22 — Twelve Steps</w:t>
+      </w:r>
+    </w:p>
+    <w:p>
+      <w:pPr>
+        <w:pStyle w:val="FirstParagraph"/>
+      </w:pPr>
+      <w:r>
+        <w:rPr>
+          <w:bCs/>
+          <w:b/>
+        </w:rPr>
+        <w:t xml:space="preserve">The Fitbit cleared the boyfriend. A cellphone handed over in a fender-bender</w:t>
+      </w:r>
+      <w:r>
+        <w:rPr>
+          <w:bCs/>
+          <w:b/>
+        </w:rPr>
+        <w:t xml:space="preserve"> </w:t>
+      </w:r>
+      <w:r>
+        <w:rPr>
+          <w:bCs/>
+          <w:b/>
+        </w:rPr>
+        <w:t xml:space="preserve">case buried the man who did it.</w:t>
+      </w:r>
+    </w:p>
+    <w:p>
+      <w:pPr>
+        <w:pStyle w:val="BodyText"/>
+      </w:pPr>
+      <w:r>
+        <w:t xml:space="preserve">When police find a woman murdered, they look first at the man she loved. It is</w:t>
+      </w:r>
+      <w:r>
+        <w:t xml:space="preserve"> </w:t>
+      </w:r>
+      <w:r>
+        <w:t xml:space="preserve">grim arithmetic, but it is arithmetic that usually works.</w:t>
+      </w:r>
+    </w:p>
+    <w:p>
+      <w:pPr>
+        <w:pStyle w:val="BodyText"/>
+      </w:pPr>
+      <w:r>
+        <w:t xml:space="preserve">On the night of May 20, 2016, Nicole VanderHeyden went to a bar near Green Bay,</w:t>
+      </w:r>
+      <w:r>
+        <w:t xml:space="preserve"> </w:t>
+      </w:r>
+      <w:r>
+        <w:t xml:space="preserve">Wisconsin, with her boyfriend, Douglass Detrie. They got separated. A phone</w:t>
+      </w:r>
+      <w:r>
+        <w:t xml:space="preserve"> </w:t>
+      </w:r>
+      <w:r>
+        <w:t xml:space="preserve">call and a string of text messages turned into an argument, and Detrie went</w:t>
+      </w:r>
+      <w:r>
+        <w:t xml:space="preserve"> </w:t>
+      </w:r>
+      <w:r>
+        <w:t xml:space="preserve">home alone to the house they shared.</w:t>
+      </w:r>
+    </w:p>
+    <w:p>
+      <w:pPr>
+        <w:pStyle w:val="BodyText"/>
+      </w:pPr>
+      <w:r>
+        <w:t xml:space="preserve">The next day, Nicole’s body was discovered next to a field. Her blood-stained</w:t>
+      </w:r>
+      <w:r>
+        <w:t xml:space="preserve"> </w:t>
+      </w:r>
+      <w:r>
+        <w:t xml:space="preserve">clothing turned up discarded along a freeway on-ramp. Some of her blood and</w:t>
+      </w:r>
+      <w:r>
+        <w:t xml:space="preserve"> </w:t>
+      </w:r>
+      <w:r>
+        <w:t xml:space="preserve">hair was found outside a neighbor’s house. The Brown County Sheriff’s Office</w:t>
+      </w:r>
+      <w:r>
+        <w:t xml:space="preserve"> </w:t>
+      </w:r>
+      <w:r>
+        <w:t xml:space="preserve">opened a homicide investigation, and the grim arithmetic did its work: Detrie —</w:t>
+      </w:r>
+      <w:r>
+        <w:t xml:space="preserve"> </w:t>
+      </w:r>
+      <w:r>
+        <w:t xml:space="preserve">the boyfriend, the argument, the last man with her — became the first suspect.</w:t>
+      </w:r>
+    </w:p>
+    <w:p>
+      <w:pPr>
+        <w:pStyle w:val="BodyText"/>
+      </w:pPr>
+      <w:r>
+        <w:t xml:space="preserve">Then investigators looked at his wrist.</w:t>
+      </w:r>
+    </w:p>
+    <w:p>
+      <w:pPr>
+        <w:pStyle w:val="BodyText"/>
+      </w:pPr>
+      <w:r>
+        <w:t xml:space="preserve">Detrie wore a Fitbit Flex, a small band that does nothing but count its</w:t>
+      </w:r>
+      <w:r>
+        <w:t xml:space="preserve"> </w:t>
+      </w:r>
+      <w:r>
+        <w:t xml:space="preserve">wearer’s steps, hour after hour, whether or not anyone ever asks. During the</w:t>
+      </w:r>
+      <w:r>
+        <w:t xml:space="preserve"> </w:t>
+      </w:r>
+      <w:r>
+        <w:t xml:space="preserve">hours of Nicole VanderHeyden’s death, Detrie’s Fitbit logged</w:t>
+      </w:r>
+      <w:r>
+        <w:t xml:space="preserve"> </w:t>
+      </w:r>
+      <w:r>
+        <w:rPr>
+          <w:bCs/>
+          <w:b/>
+        </w:rPr>
+        <w:t xml:space="preserve">twelve steps</w:t>
+      </w:r>
+      <w:r>
+        <w:t xml:space="preserve">.</w:t>
+      </w:r>
+    </w:p>
+    <w:p>
+      <w:pPr>
+        <w:pStyle w:val="BodyText"/>
+      </w:pPr>
+      <w:r>
+        <w:t xml:space="preserve">Twelve steps is a man getting up for a glass of water. It is not a man beating</w:t>
+      </w:r>
+      <w:r>
+        <w:t xml:space="preserve"> </w:t>
+      </w:r>
+      <w:r>
+        <w:t xml:space="preserve">a woman, moving her body to a field, and scattering her clothes along a</w:t>
+      </w:r>
+      <w:r>
+        <w:t xml:space="preserve"> </w:t>
+      </w:r>
+      <w:r>
+        <w:t xml:space="preserve">freeway. The investigation turned away from Detrie — and for months, it had</w:t>
+      </w:r>
+      <w:r>
+        <w:t xml:space="preserve"> </w:t>
+      </w:r>
+      <w:r>
+        <w:t xml:space="preserve">nowhere else to go.</w:t>
+      </w:r>
+    </w:p>
+    <w:bookmarkStart w:id="47" w:name="the-phone-in-the-evidence-locker"/>
+    <w:p>
+      <w:pPr>
+        <w:pStyle w:val="Heading2"/>
+      </w:pPr>
+      <w:r>
+        <w:t xml:space="preserve">The phone in the evidence locker</w:t>
+      </w:r>
+    </w:p>
+    <w:p>
+      <w:pPr>
+        <w:pStyle w:val="FirstParagraph"/>
+      </w:pPr>
+      <w:r>
+        <w:t xml:space="preserve">Here is where this case becomes something stranger and more instructive than</w:t>
+      </w:r>
+      <w:r>
+        <w:t xml:space="preserve"> </w:t>
+      </w:r>
+      <w:r>
+        <w:t xml:space="preserve">any episode of television: the killer had already given the police everything</w:t>
+      </w:r>
+      <w:r>
+        <w:t xml:space="preserve"> </w:t>
+      </w:r>
+      <w:r>
+        <w:t xml:space="preserve">they needed. Voluntarily. With a signed form.</w:t>
+      </w:r>
+    </w:p>
+    <w:p>
+      <w:pPr>
+        <w:pStyle w:val="BodyText"/>
+      </w:pPr>
+      <w:r>
+        <w:t xml:space="preserve">Three weeks after the murder, the Green Bay Police Department — a different</w:t>
+      </w:r>
+      <w:r>
+        <w:t xml:space="preserve"> </w:t>
+      </w:r>
+      <w:r>
+        <w:t xml:space="preserve">agency entirely — was investigating three minor incidents involving the same</w:t>
+      </w:r>
+      <w:r>
+        <w:t xml:space="preserve"> </w:t>
+      </w:r>
+      <w:r>
+        <w:t xml:space="preserve">vehicle: a stolen-vehicle report, a vehicle fire, and a hit-and-run. Their</w:t>
+      </w:r>
+      <w:r>
+        <w:t xml:space="preserve"> </w:t>
+      </w:r>
+      <w:r>
+        <w:t xml:space="preserve">suspect was a man named George Burch. An officer asked Burch if he could take</w:t>
+      </w:r>
+      <w:r>
+        <w:t xml:space="preserve"> </w:t>
+      </w:r>
+      <w:r>
+        <w:t xml:space="preserve">a look at the text messages on his phone to check his alibi. Burch agreed. The</w:t>
+      </w:r>
+      <w:r>
+        <w:t xml:space="preserve"> </w:t>
+      </w:r>
+      <w:r>
+        <w:t xml:space="preserve">officer explained it was easier to download the phone’s contents than to</w:t>
+      </w:r>
+      <w:r>
+        <w:t xml:space="preserve"> </w:t>
+      </w:r>
+      <w:r>
+        <w:t xml:space="preserve">photograph the screen, and Burch said that would be fine. He signed a consent</w:t>
+      </w:r>
+      <w:r>
+        <w:t xml:space="preserve"> </w:t>
+      </w:r>
+      <w:r>
+        <w:t xml:space="preserve">form:</w:t>
+      </w:r>
+      <w:r>
+        <w:t xml:space="preserve"> </w:t>
+      </w:r>
+      <w:r>
+        <w:rPr>
+          <w:iCs/>
+          <w:i/>
+        </w:rPr>
+        <w:t xml:space="preserve">“</w:t>
+      </w:r>
+      <w:r>
+        <w:rPr>
+          <w:iCs/>
+          <w:i/>
+        </w:rPr>
+        <w:t xml:space="preserve">I, George Stephen Burch . . . voluntarily give . . . permission to</w:t>
+      </w:r>
+      <w:r>
+        <w:rPr>
+          <w:iCs/>
+          <w:i/>
+        </w:rPr>
+        <w:t xml:space="preserve"> </w:t>
+      </w:r>
+      <w:r>
+        <w:rPr>
+          <w:iCs/>
+          <w:i/>
+        </w:rPr>
+        <w:t xml:space="preserve">search my . . . Samsung cellphone.</w:t>
+      </w:r>
+      <w:r>
+        <w:rPr>
+          <w:iCs/>
+          <w:i/>
+        </w:rPr>
+        <w:t xml:space="preserve">”</w:t>
+      </w:r>
+    </w:p>
+    <w:p>
+      <w:pPr>
+        <w:pStyle w:val="BodyText"/>
+      </w:pPr>
+      <w:r>
+        <w:t xml:space="preserve">The department’s forensic examiner did what forensic examiners do: a full</w:t>
+      </w:r>
+      <w:r>
+        <w:t xml:space="preserve"> </w:t>
+      </w:r>
+      <w:r>
+        <w:t xml:space="preserve">physical extraction of everything on the device, saved to long-term storage,</w:t>
+      </w:r>
+      <w:r>
+        <w:t xml:space="preserve"> </w:t>
+      </w:r>
+      <w:r>
+        <w:t xml:space="preserve">standard practice. Burch got his phone back. The file sat in the archive.</w:t>
+      </w:r>
+    </w:p>
+    <w:p>
+      <w:pPr>
+        <w:pStyle w:val="BodyText"/>
+      </w:pPr>
+      <w:r>
+        <w:t xml:space="preserve">Two months later, the Sheriff’s Office — still working the VanderHeyden</w:t>
+      </w:r>
+      <w:r>
+        <w:t xml:space="preserve"> </w:t>
+      </w:r>
+      <w:r>
+        <w:t xml:space="preserve">homicide — matched a DNA sample from Nicole’s sock to George Burch. When</w:t>
+      </w:r>
+      <w:r>
+        <w:t xml:space="preserve"> </w:t>
+      </w:r>
+      <w:r>
+        <w:t xml:space="preserve">detectives searched local records for prior police contact with him, they</w:t>
+      </w:r>
+      <w:r>
+        <w:t xml:space="preserve"> </w:t>
+      </w:r>
+      <w:r>
+        <w:t xml:space="preserve">found the Green Bay file: the consent form, and a complete copy of everything</w:t>
+      </w:r>
+      <w:r>
+        <w:t xml:space="preserve"> </w:t>
+      </w:r>
+      <w:r>
+        <w:t xml:space="preserve">that had been on his phone.</w:t>
+      </w:r>
+    </w:p>
+    <w:p>
+      <w:pPr>
+        <w:pStyle w:val="BodyText"/>
+      </w:pPr>
+      <w:r>
+        <w:t xml:space="preserve">What was on his phone was damning twice over. His internet history included</w:t>
+      </w:r>
+      <w:r>
+        <w:t xml:space="preserve"> </w:t>
+      </w:r>
+      <w:r>
+        <w:rPr>
+          <w:bCs/>
+          <w:b/>
+        </w:rPr>
+        <w:t xml:space="preserve">sixty-four viewings of news stories about Nicole VanderHeyden’s death</w:t>
+      </w:r>
+      <w:r>
+        <w:t xml:space="preserve"> </w:t>
+      </w:r>
+      <w:r>
+        <w:t xml:space="preserve">— a</w:t>
+      </w:r>
+      <w:r>
+        <w:t xml:space="preserve"> </w:t>
+      </w:r>
+      <w:r>
+        <w:t xml:space="preserve">man compulsively watching the coverage of a murder he claimed to know nothing</w:t>
+      </w:r>
+      <w:r>
+        <w:t xml:space="preserve"> </w:t>
+      </w:r>
+      <w:r>
+        <w:t xml:space="preserve">about. And the phone pointed to a Google account. With a warrant, detectives</w:t>
+      </w:r>
+      <w:r>
+        <w:t xml:space="preserve"> </w:t>
+      </w:r>
+      <w:r>
+        <w:t xml:space="preserve">obtained Burch’s</w:t>
+      </w:r>
+      <w:r>
+        <w:t xml:space="preserve"> </w:t>
+      </w:r>
+      <w:r>
+        <w:t xml:space="preserve">“</w:t>
+      </w:r>
+      <w:r>
+        <w:t xml:space="preserve">Google Dashboard</w:t>
+      </w:r>
+      <w:r>
+        <w:t xml:space="preserve">”</w:t>
+      </w:r>
+      <w:r>
+        <w:t xml:space="preserve"> </w:t>
+      </w:r>
+      <w:r>
+        <w:t xml:space="preserve">data, and Google’s location records placed</w:t>
+      </w:r>
+      <w:r>
+        <w:t xml:space="preserve"> </w:t>
+      </w:r>
+      <w:r>
+        <w:t xml:space="preserve">his phone at the bar Nicole visited that night, near her residence, at the</w:t>
+      </w:r>
+      <w:r>
+        <w:t xml:space="preserve"> </w:t>
+      </w:r>
+      <w:r>
+        <w:t xml:space="preserve">field where her body was found — and at the on-ramp where her bloody clothing</w:t>
+      </w:r>
+      <w:r>
+        <w:t xml:space="preserve"> </w:t>
+      </w:r>
+      <w:r>
+        <w:t xml:space="preserve">had been thrown from a vehicle.</w:t>
+      </w:r>
+    </w:p>
+    <w:p>
+      <w:pPr>
+        <w:pStyle w:val="BodyText"/>
+      </w:pPr>
+      <w:r>
+        <w:t xml:space="preserve">The phone had followed him through every stop of the crime, and then he had</w:t>
+      </w:r>
+      <w:r>
+        <w:t xml:space="preserve"> </w:t>
+      </w:r>
+      <w:r>
+        <w:t xml:space="preserve">handed it to a police officer over a fender-bender.</w:t>
+      </w:r>
+    </w:p>
+    <w:bookmarkEnd w:id="47"/>
+    <w:bookmarkStart w:id="48" w:name="the-story-he-told-the-jury"/>
+    <w:p>
+      <w:pPr>
+        <w:pStyle w:val="Heading2"/>
+      </w:pPr>
+      <w:r>
+        <w:t xml:space="preserve">The story he told the jury</w:t>
+      </w:r>
+    </w:p>
+    <w:p>
+      <w:pPr>
+        <w:pStyle w:val="FirstParagraph"/>
+      </w:pPr>
+      <w:r>
+        <w:t xml:space="preserve">At trial, Burch admitted he was with Nicole the night she died — he had to;</w:t>
+      </w:r>
+      <w:r>
+        <w:t xml:space="preserve"> </w:t>
+      </w:r>
+      <w:r>
+        <w:t xml:space="preserve">the data left him no choice. So he told the jury a story. They met at a bar,</w:t>
+      </w:r>
+      <w:r>
+        <w:t xml:space="preserve"> </w:t>
+      </w:r>
+      <w:r>
+        <w:t xml:space="preserve">he said, left together, parked near her house, became intimate. Then, he</w:t>
+      </w:r>
+      <w:r>
+        <w:t xml:space="preserve"> </w:t>
+      </w:r>
+      <w:r>
+        <w:t xml:space="preserve">claimed, he blacked out — and woke up on the ground with Nicole dead and</w:t>
+      </w:r>
+      <w:r>
+        <w:t xml:space="preserve"> </w:t>
+      </w:r>
+      <w:r>
+        <w:rPr>
+          <w:iCs/>
+          <w:i/>
+        </w:rPr>
+        <w:t xml:space="preserve">Detrie</w:t>
+      </w:r>
+      <w:r>
+        <w:t xml:space="preserve"> </w:t>
+      </w:r>
+      <w:r>
+        <w:t xml:space="preserve">standing over them with a gun. In Burch’s telling, the boyfriend</w:t>
+      </w:r>
+      <w:r>
+        <w:t xml:space="preserve"> </w:t>
+      </w:r>
+      <w:r>
+        <w:t xml:space="preserve">forced him at gunpoint to load Nicole’s body into his own vehicle, drive it to</w:t>
+      </w:r>
+      <w:r>
+        <w:t xml:space="preserve"> </w:t>
+      </w:r>
+      <w:r>
+        <w:t xml:space="preserve">the field, and carry her into the ditch. Only then did Burch heroically shove</w:t>
+      </w:r>
+      <w:r>
+        <w:t xml:space="preserve"> </w:t>
+      </w:r>
+      <w:r>
+        <w:t xml:space="preserve">Detrie, run to his vehicle, and escape — pausing, on the drive home, to throw</w:t>
+      </w:r>
+      <w:r>
+        <w:t xml:space="preserve"> </w:t>
+      </w:r>
+      <w:r>
+        <w:t xml:space="preserve">Nicole’s clothing out the window</w:t>
+      </w:r>
+      <w:r>
+        <w:t xml:space="preserve"> </w:t>
+      </w:r>
+      <w:r>
+        <w:t xml:space="preserve">“</w:t>
+      </w:r>
+      <w:r>
+        <w:t xml:space="preserve">in a panic.</w:t>
+      </w:r>
+      <w:r>
+        <w:t xml:space="preserve">”</w:t>
+      </w:r>
+    </w:p>
+    <w:p>
+      <w:pPr>
+        <w:pStyle w:val="BodyText"/>
+      </w:pPr>
+      <w:r>
+        <w:t xml:space="preserve">He had, of course, mentioned this to no one — not during the months police</w:t>
+      </w:r>
+      <w:r>
+        <w:t xml:space="preserve"> </w:t>
+      </w:r>
+      <w:r>
+        <w:t xml:space="preserve">publicly begged for tips, not to a single friend.</w:t>
+      </w:r>
+    </w:p>
+    <w:p>
+      <w:pPr>
+        <w:pStyle w:val="BodyText"/>
+      </w:pPr>
+      <w:r>
+        <w:t xml:space="preserve">The jury was asked to believe that the man whose Fitbit counted twelve steps</w:t>
+      </w:r>
+      <w:r>
+        <w:t xml:space="preserve"> </w:t>
+      </w:r>
+      <w:r>
+        <w:t xml:space="preserve">that night had orchestrated all of it. They deliberated and convicted George</w:t>
+      </w:r>
+      <w:r>
+        <w:t xml:space="preserve"> </w:t>
+      </w:r>
+      <w:r>
+        <w:t xml:space="preserve">Burch of first-degree intentional homicide. He was sentenced to life.</w:t>
+      </w:r>
+    </w:p>
+    <w:bookmarkEnd w:id="48"/>
+    <w:bookmarkStart w:id="49" w:name="what-the-appeal-decided"/>
+    <w:p>
+      <w:pPr>
+        <w:pStyle w:val="Heading2"/>
+      </w:pPr>
+      <w:r>
+        <w:t xml:space="preserve">What the appeal decided</w:t>
+      </w:r>
+    </w:p>
+    <w:p>
+      <w:pPr>
+        <w:pStyle w:val="FirstParagraph"/>
+      </w:pPr>
+      <w:r>
+        <w:t xml:space="preserve">Burch’s appeal reached the Wisconsin Supreme Court, and it is the reason this</w:t>
+      </w:r>
+      <w:r>
+        <w:t xml:space="preserve"> </w:t>
+      </w:r>
+      <w:r>
+        <w:t xml:space="preserve">case matters far beyond Green Bay. He argued the police had betrayed him twice:</w:t>
+      </w:r>
+      <w:r>
+        <w:t xml:space="preserve"> </w:t>
+      </w:r>
+      <w:r>
+        <w:t xml:space="preserve">first when Green Bay downloaded his</w:t>
+      </w:r>
+      <w:r>
+        <w:t xml:space="preserve"> </w:t>
+      </w:r>
+      <w:r>
+        <w:rPr>
+          <w:iCs/>
+          <w:i/>
+        </w:rPr>
+        <w:t xml:space="preserve">entire</w:t>
+      </w:r>
+      <w:r>
+        <w:t xml:space="preserve"> </w:t>
+      </w:r>
+      <w:r>
+        <w:t xml:space="preserve">phone after he’d only discussed</w:t>
+      </w:r>
+      <w:r>
+        <w:t xml:space="preserve"> </w:t>
+      </w:r>
+      <w:r>
+        <w:t xml:space="preserve">text messages, and again when a different department mined that download,</w:t>
+      </w:r>
+      <w:r>
+        <w:t xml:space="preserve"> </w:t>
+      </w:r>
+      <w:r>
+        <w:t xml:space="preserve">months later, for a murder he’d never consented to being investigated for.</w:t>
+      </w:r>
+    </w:p>
+    <w:p>
+      <w:pPr>
+        <w:pStyle w:val="BodyText"/>
+      </w:pPr>
+      <w:r>
+        <w:t xml:space="preserve">The court was unmoved (June 29, 2021, in a decision with several separate</w:t>
+      </w:r>
+      <w:r>
+        <w:t xml:space="preserve"> </w:t>
+      </w:r>
+      <w:r>
+        <w:t xml:space="preserve">writings — the justices themselves disagreed about how far digital consent</w:t>
+      </w:r>
+      <w:r>
+        <w:t xml:space="preserve"> </w:t>
+      </w:r>
+      <w:r>
+        <w:t xml:space="preserve">should stretch). Burch had signed a form authorizing a search of his cellphone,</w:t>
+      </w:r>
+      <w:r>
+        <w:t xml:space="preserve"> </w:t>
+      </w:r>
+      <w:r>
+        <w:t xml:space="preserve">full stop; nothing in his conversation with the officer limited it to texts.</w:t>
+      </w:r>
+      <w:r>
+        <w:t xml:space="preserve"> </w:t>
+      </w:r>
+      <w:r>
+        <w:t xml:space="preserve">And once the data lawfully sat in police storage, one department sharing it</w:t>
+      </w:r>
+      <w:r>
+        <w:t xml:space="preserve"> </w:t>
+      </w:r>
+      <w:r>
+        <w:t xml:space="preserve">with another was, in the circuit court’s words, a common and long-understood</w:t>
+      </w:r>
+      <w:r>
+        <w:t xml:space="preserve"> </w:t>
+      </w:r>
+      <w:r>
+        <w:t xml:space="preserve">practice.</w:t>
+      </w:r>
+    </w:p>
+    <w:p>
+      <w:pPr>
+        <w:pStyle w:val="BodyText"/>
+      </w:pPr>
+      <w:r>
+        <w:t xml:space="preserve">The Fitbit ruling was quieter but just as consequential. Burch — in a mirror</w:t>
+      </w:r>
+      <w:r>
+        <w:t xml:space="preserve"> </w:t>
+      </w:r>
+      <w:r>
+        <w:t xml:space="preserve">image of the fight in</w:t>
+      </w:r>
+      <w:r>
+        <w:t xml:space="preserve"> </w:t>
+      </w:r>
+      <w:r>
+        <w:rPr>
+          <w:iCs/>
+          <w:i/>
+        </w:rPr>
+        <w:t xml:space="preserve">State v. Dabate</w:t>
+      </w:r>
+      <w:r>
+        <w:t xml:space="preserve"> </w:t>
+      </w:r>
+      <w:r>
+        <w:t xml:space="preserve">(Chapter 21) — demanded the State</w:t>
+      </w:r>
+      <w:r>
+        <w:t xml:space="preserve"> </w:t>
+      </w:r>
+      <w:r>
+        <w:t xml:space="preserve">produce an expert to prove the science of Detrie’s Fitbit before the twelve</w:t>
+      </w:r>
+      <w:r>
+        <w:t xml:space="preserve"> </w:t>
+      </w:r>
+      <w:r>
+        <w:t xml:space="preserve">steps could clear his rival. The court held the step-count records could come</w:t>
+      </w:r>
+      <w:r>
+        <w:t xml:space="preserve"> </w:t>
+      </w:r>
+      <w:r>
+        <w:t xml:space="preserve">in</w:t>
+      </w:r>
+      <w:r>
+        <w:t xml:space="preserve"> </w:t>
+      </w:r>
+      <w:r>
+        <w:rPr>
+          <w:iCs/>
+          <w:i/>
+        </w:rPr>
+        <w:t xml:space="preserve">without</w:t>
+      </w:r>
+      <w:r>
+        <w:t xml:space="preserve"> </w:t>
+      </w:r>
+      <w:r>
+        <w:t xml:space="preserve">expert testimony on the underlying technology. Where Connecticut</w:t>
+      </w:r>
+      <w:r>
+        <w:t xml:space="preserve"> </w:t>
+      </w:r>
+      <w:r>
+        <w:t xml:space="preserve">would put a Columbia professor on the stand to validate the device, Wisconsin</w:t>
+      </w:r>
+      <w:r>
+        <w:t xml:space="preserve"> </w:t>
+      </w:r>
+      <w:r>
+        <w:t xml:space="preserve">let the little band speak for itself.</w:t>
+      </w:r>
+    </w:p>
+    <w:bookmarkEnd w:id="49"/>
+    <w:bookmarkStart w:id="53" w:name="howd-he-get-caught-2"/>
+    <w:p>
+      <w:pPr>
+        <w:pStyle w:val="Heading2"/>
+      </w:pPr>
+      <w:r>
+        <w:t xml:space="preserve">How’d he get caught?</w:t>
+      </w:r>
+    </w:p>
+    <w:p>
+      <w:pPr>
+        <w:pStyle w:val="FirstParagraph"/>
+      </w:pPr>
+      <w:r>
+        <w:t xml:space="preserve">He was caught by his own helpfulness. A murderer, three weeks clear of the</w:t>
+      </w:r>
+      <w:r>
+        <w:t xml:space="preserve"> </w:t>
+      </w:r>
+      <w:r>
+        <w:t xml:space="preserve">crime, signed a consent form in a trivial case to make himself look</w:t>
+      </w:r>
+      <w:r>
+        <w:t xml:space="preserve"> </w:t>
+      </w:r>
+      <w:r>
+        <w:t xml:space="preserve">cooperative — and handed police a complete map of the killing: his phone at</w:t>
+      </w:r>
+      <w:r>
+        <w:t xml:space="preserve"> </w:t>
+      </w:r>
+      <w:r>
+        <w:t xml:space="preserve">the bar, at her house, at the field, at the on-ramp, and sixty-four anxious</w:t>
+      </w:r>
+      <w:r>
+        <w:t xml:space="preserve"> </w:t>
+      </w:r>
+      <w:r>
+        <w:t xml:space="preserve">returns to the news coverage. Meanwhile, the man the arithmetic said should go</w:t>
+      </w:r>
+      <w:r>
+        <w:t xml:space="preserve"> </w:t>
+      </w:r>
+      <w:r>
+        <w:t xml:space="preserve">to prison was saved by a $99 wristband that had counted him fast asleep.</w:t>
+      </w:r>
+      <w:r>
+        <w:t xml:space="preserve"> </w:t>
+      </w:r>
+      <w:r>
+        <w:t xml:space="preserve">Twelve steps.</w:t>
+      </w:r>
+    </w:p>
+    <w:p>
+      <w:r>
+        <w:pict>
+          <v:rect style="width:0;height:1.5pt" o:hralign="center" o:hrstd="t" o:hr="t"/>
+        </w:pict>
+      </w:r>
+    </w:p>
+    <w:p>
+      <w:pPr>
+        <w:pStyle w:val="BlockText"/>
+      </w:pPr>
+      <w:r>
+        <w:rPr>
+          <w:bCs/>
+          <w:b/>
+        </w:rPr>
+        <w:t xml:space="preserve">📖 Read the case yourself:</w:t>
+      </w:r>
+      <w:r>
+        <w:t xml:space="preserve"> </w:t>
+      </w:r>
+      <w:r>
+        <w:rPr>
+          <w:iCs/>
+          <w:i/>
+        </w:rPr>
+        <w:t xml:space="preserve">State v. Burch</w:t>
+      </w:r>
+      <w:r>
+        <w:t xml:space="preserve">, 2021 WI 68, 398 Wis. 2d 1,</w:t>
+      </w:r>
+      <w:r>
+        <w:t xml:space="preserve"> </w:t>
+      </w:r>
+      <w:r>
+        <w:t xml:space="preserve">961 N.W.2d 314, Wisconsin Supreme Court, decided June 29, 2021.</w:t>
+      </w:r>
+      <w:r>
+        <w:t xml:space="preserve"> </w:t>
+      </w:r>
+      <w:r>
+        <w:t xml:space="preserve">Free online:</w:t>
+      </w:r>
+      <w:r>
+        <w:t xml:space="preserve"> </w:t>
+      </w:r>
+      <w:hyperlink r:id="rId50">
+        <w:r>
+          <w:rPr>
+            <w:rStyle w:val="Hyperlink"/>
+          </w:rPr>
+          <w:t xml:space="preserve">CourtListener</w:t>
+        </w:r>
+      </w:hyperlink>
+      <w:r>
+        <w:t xml:space="preserve"> </w:t>
+      </w:r>
+      <w:r>
+        <w:t xml:space="preserve">·</w:t>
+      </w:r>
+      <w:r>
+        <w:t xml:space="preserve"> </w:t>
+      </w:r>
+      <w:hyperlink r:id="rId51">
+        <w:r>
+          <w:rPr>
+            <w:rStyle w:val="Hyperlink"/>
+          </w:rPr>
+          <w:t xml:space="preserve">Justia</w:t>
+        </w:r>
+      </w:hyperlink>
+      <w:r>
+        <w:t xml:space="preserve"> </w:t>
+      </w:r>
+      <w:r>
+        <w:t xml:space="preserve">· official PDF via</w:t>
+      </w:r>
+      <w:r>
+        <w:t xml:space="preserve"> </w:t>
+      </w:r>
+      <w:hyperlink r:id="rId52">
+        <w:r>
+          <w:rPr>
+            <w:rStyle w:val="Hyperlink"/>
+          </w:rPr>
+          <w:t xml:space="preserve">wicourts.gov</w:t>
+        </w:r>
+      </w:hyperlink>
+      <w:r>
+        <w:t xml:space="preserve">.</w:t>
+      </w:r>
+      <w:r>
+        <w:t xml:space="preserve"> </w:t>
+      </w:r>
+      <w:r>
+        <w:t xml:space="preserve">The facts are set out in the Background section; the cellphone-consent and</w:t>
+      </w:r>
+      <w:r>
+        <w:t xml:space="preserve"> </w:t>
+      </w:r>
+      <w:r>
+        <w:t xml:space="preserve">Fitbit rulings follow in the Discussion.</w:t>
+      </w:r>
+    </w:p>
+    <w:bookmarkEnd w:id="53"/>
+    <w:bookmarkEnd w:id="54"/>
     <w:sectPr/>
   </w:body>
 </w:document>

</xml_diff>

<commit_message>
Bring the three grave chapters up to the new descriptive voice (humor held off)
Revise Garland (16), Todorovic (17), and Hart (31) to match the
detective-novel description and pacing of the rest of the book, while
keeping the comedy off out of respect - each has a child victim.

- ch16 Garland: sharper scene-setting; one restrained, non-comic
  observation on the DNA-destruction files he saved and hid
- ch17 Todorovic: tightened and re-voiced; stays grave; sourcing note kept
- ch31 Hart: reframed as the book's conscience chapter; the 13,268 sting
  cost carries the weight, no jokes near the drowned children

All em-dash-free; Word docs and master (12 chapters) rebuilt.

Co-Authored-By: Claude Opus 4.8 <noreply@anthropic.com>
Claude-Session: https://claude.ai/code/session_016HAHAXcMmaZghEz1kJrDWU
</commit_message>
<xml_diff>
--- a/book/word/How Not to Get Away With Murder - Master.docx
+++ b/book/word/How Not to Get Away With Murder - Master.docx
@@ -6073,7 +6073,7 @@
           <w:bCs/>
           <w:b/>
         </w:rPr>
-        <w:t xml:space="preserve">The patent he felt cheated over never earned a dollar. He killed three people</w:t>
+        <w:t xml:space="preserve">He researched how to destroy DNA evidence and saved the research to a hard</w:t>
       </w:r>
       <w:r>
         <w:rPr>
@@ -6087,7 +6087,7 @@
           <w:bCs/>
           <w:b/>
         </w:rPr>
-        <w:t xml:space="preserve">for it anyway, and hid a hard drive that remembered every search.</w:t>
+        <w:t xml:space="preserve">drive. Then he hid the hard drive instead of burning it.</w:t>
       </w:r>
     </w:p>
     <w:p>
@@ -6095,7 +6095,13 @@
         <w:pStyle w:val="BodyText"/>
       </w:pPr>
       <w:r>
-        <w:t xml:space="preserve">Douglas Garland kept score.</w:t>
+        <w:t xml:space="preserve">Douglas Garland was a man who kept score, and the ledger he kept was a strange</w:t>
+      </w:r>
+      <w:r>
+        <w:t xml:space="preserve"> </w:t>
+      </w:r>
+      <w:r>
+        <w:t xml:space="preserve">one, because the debt he was collecting on had never actually existed.</w:t>
       </w:r>
     </w:p>
     <w:p>
@@ -6103,43 +6109,43 @@
         <w:pStyle w:val="BodyText"/>
       </w:pPr>
       <w:r>
-        <w:t xml:space="preserve">He was fifty-seven years old, described in the Alberta Court of Appeal’s</w:t>
-      </w:r>
-      <w:r>
-        <w:t xml:space="preserve"> </w:t>
-      </w:r>
-      <w:r>
-        <w:t xml:space="preserve">judgment as a highly intelligent loner with an expertise in computers;</w:t>
-      </w:r>
-      <w:r>
-        <w:t xml:space="preserve"> </w:t>
-      </w:r>
-      <w:r>
-        <w:t xml:space="preserve">unmarried, usually unemployed, living with his parents on a small farm north</w:t>
-      </w:r>
-      <w:r>
-        <w:t xml:space="preserve"> </w:t>
-      </w:r>
-      <w:r>
-        <w:t xml:space="preserve">of Calgary and driving a 1994 Ford pickup. Years earlier he had worked for one</w:t>
-      </w:r>
-      <w:r>
-        <w:t xml:space="preserve"> </w:t>
-      </w:r>
-      <w:r>
-        <w:t xml:space="preserve">of Alvin Liknes’s oil-and-gas businesses, and the two men had fallen out over</w:t>
-      </w:r>
-      <w:r>
-        <w:t xml:space="preserve"> </w:t>
-      </w:r>
-      <w:r>
-        <w:t xml:space="preserve">a pump Liknes patented. Garland believed he had contributed significantly to</w:t>
-      </w:r>
-      <w:r>
-        <w:t xml:space="preserve"> </w:t>
-      </w:r>
-      <w:r>
-        <w:t xml:space="preserve">its creation and had been cheated of the credit.</w:t>
+        <w:t xml:space="preserve">He was fifty-seven, and the Alberta Court of Appeal describes him with a few cold</w:t>
+      </w:r>
+      <w:r>
+        <w:t xml:space="preserve"> </w:t>
+      </w:r>
+      <w:r>
+        <w:t xml:space="preserve">words that tell you almost everything: a highly intelligent loner, an expert with</w:t>
+      </w:r>
+      <w:r>
+        <w:t xml:space="preserve"> </w:t>
+      </w:r>
+      <w:r>
+        <w:t xml:space="preserve">computers, unmarried, usually unemployed, living with his parents on a small farm</w:t>
+      </w:r>
+      <w:r>
+        <w:t xml:space="preserve"> </w:t>
+      </w:r>
+      <w:r>
+        <w:t xml:space="preserve">north of Calgary and driving an old 1994 Ford pickup. Years earlier he had worked</w:t>
+      </w:r>
+      <w:r>
+        <w:t xml:space="preserve"> </w:t>
+      </w:r>
+      <w:r>
+        <w:t xml:space="preserve">for one of Alvin Liknes’s oil-and-gas ventures, and the two had fallen out over a</w:t>
+      </w:r>
+      <w:r>
+        <w:t xml:space="preserve"> </w:t>
+      </w:r>
+      <w:r>
+        <w:t xml:space="preserve">pump Liknes patented. Garland believed he’d helped invent it and had been robbed</w:t>
+      </w:r>
+      <w:r>
+        <w:t xml:space="preserve"> </w:t>
+      </w:r>
+      <w:r>
+        <w:t xml:space="preserve">of the credit.</w:t>
       </w:r>
     </w:p>
     <w:p>
@@ -6147,32 +6153,31 @@
         <w:pStyle w:val="BodyText"/>
       </w:pPr>
       <w:r>
-        <w:t xml:space="preserve">Here is the detail the court records almost in passing, and that should stop</w:t>
-      </w:r>
-      <w:r>
-        <w:t xml:space="preserve"> </w:t>
-      </w:r>
-      <w:r>
-        <w:t xml:space="preserve">you cold: the pump was not economically viable. It had never earned any money.</w:t>
-      </w:r>
-      <w:r>
-        <w:t xml:space="preserve"> </w:t>
-      </w:r>
-      <w:r>
-        <w:t xml:space="preserve">There was nothing to be cheated</w:t>
-      </w:r>
-      <w:r>
-        <w:t xml:space="preserve"> </w:t>
-      </w:r>
-      <w:r>
-        <w:rPr>
-          <w:iCs/>
-          <w:i/>
-        </w:rPr>
-        <w:t xml:space="preserve">of</w:t>
-      </w:r>
-      <w:r>
-        <w:t xml:space="preserve">.</w:t>
+        <w:t xml:space="preserve">Here is the detail the court sets down almost in passing, and it should stop you</w:t>
+      </w:r>
+      <w:r>
+        <w:t xml:space="preserve"> </w:t>
+      </w:r>
+      <w:r>
+        <w:t xml:space="preserve">where you sit: the pump was not economically viable. It never earned a single</w:t>
+      </w:r>
+      <w:r>
+        <w:t xml:space="preserve"> </w:t>
+      </w:r>
+      <w:r>
+        <w:t xml:space="preserve">dollar. There was, in the most literal sense, nothing to have been cheated out</w:t>
+      </w:r>
+      <w:r>
+        <w:t xml:space="preserve"> </w:t>
+      </w:r>
+      <w:r>
+        <w:t xml:space="preserve">of. The grievance was pure invention, a wound Garland had drawn on himself and</w:t>
+      </w:r>
+      <w:r>
+        <w:t xml:space="preserve"> </w:t>
+      </w:r>
+      <w:r>
+        <w:t xml:space="preserve">then nursed for the better part of a decade.</w:t>
       </w:r>
     </w:p>
     <w:p>
@@ -6180,31 +6185,31 @@
         <w:pStyle w:val="BodyText"/>
       </w:pPr>
       <w:r>
-        <w:t xml:space="preserve">It didn’t matter. For years, Garland kept tabs on Alvin Liknes. His obsession</w:t>
-      </w:r>
-      <w:r>
-        <w:t xml:space="preserve"> </w:t>
-      </w:r>
-      <w:r>
-        <w:t xml:space="preserve">grew to include Alvin’s wife, Kathy. He monitored the couple’s activities</w:t>
-      </w:r>
-      <w:r>
-        <w:t xml:space="preserve"> </w:t>
-      </w:r>
-      <w:r>
-        <w:t xml:space="preserve">through regular computer searches, a private surveillance program running</w:t>
-      </w:r>
-      <w:r>
-        <w:t xml:space="preserve"> </w:t>
-      </w:r>
-      <w:r>
-        <w:t xml:space="preserve">quietly out of a farmhouse. In December 2013, he came to believe Alvin had</w:t>
-      </w:r>
-      <w:r>
-        <w:t xml:space="preserve"> </w:t>
-      </w:r>
-      <w:r>
-        <w:t xml:space="preserve">stolen items from the Garland farm, and the old wound reopened.</w:t>
+        <w:t xml:space="preserve">He kept tabs on Alvin Liknes for years, and over time the fixation spread to</w:t>
+      </w:r>
+      <w:r>
+        <w:t xml:space="preserve"> </w:t>
+      </w:r>
+      <w:r>
+        <w:t xml:space="preserve">Alvin’s wife, Kathy. He tracked the couple through regular computer searches, a</w:t>
+      </w:r>
+      <w:r>
+        <w:t xml:space="preserve"> </w:t>
+      </w:r>
+      <w:r>
+        <w:t xml:space="preserve">private surveillance operation running quietly out of a farmhouse basement. In</w:t>
+      </w:r>
+      <w:r>
+        <w:t xml:space="preserve"> </w:t>
+      </w:r>
+      <w:r>
+        <w:t xml:space="preserve">December 2013 he convinced himself Alvin had stolen items from the Garland</w:t>
+      </w:r>
+      <w:r>
+        <w:t xml:space="preserve"> </w:t>
+      </w:r>
+      <w:r>
+        <w:t xml:space="preserve">property, and the old imaginary wound tore open again.</w:t>
       </w:r>
     </w:p>
     <w:p>
@@ -6212,31 +6217,25 @@
         <w:pStyle w:val="BodyText"/>
       </w:pPr>
       <w:r>
-        <w:t xml:space="preserve">Then, in early 2014, the Likneses announced they were leaving. They listed</w:t>
-      </w:r>
-      <w:r>
-        <w:t xml:space="preserve"> </w:t>
-      </w:r>
-      <w:r>
-        <w:t xml:space="preserve">their Calgary house, planned a retirement move to Evansburg, and advertised an</w:t>
-      </w:r>
-      <w:r>
-        <w:t xml:space="preserve"> </w:t>
-      </w:r>
-      <w:r>
-        <w:t xml:space="preserve">estate sale on Kijiji for the last week of June. Whatever clock had been</w:t>
-      </w:r>
-      <w:r>
-        <w:t xml:space="preserve"> </w:t>
-      </w:r>
-      <w:r>
-        <w:t xml:space="preserve">ticking inside Douglas Garland ran out. If he was going to settle the score,</w:t>
-      </w:r>
-      <w:r>
-        <w:t xml:space="preserve"> </w:t>
-      </w:r>
-      <w:r>
-        <w:t xml:space="preserve">it had to be now.</w:t>
+        <w:t xml:space="preserve">Then, in early 2014, the Likneses announced they were leaving. They listed their</w:t>
+      </w:r>
+      <w:r>
+        <w:t xml:space="preserve"> </w:t>
+      </w:r>
+      <w:r>
+        <w:t xml:space="preserve">Calgary home, planned a retirement move to the town of Evansburg, and advertised</w:t>
+      </w:r>
+      <w:r>
+        <w:t xml:space="preserve"> </w:t>
+      </w:r>
+      <w:r>
+        <w:t xml:space="preserve">an estate sale on Kijiji for the final week of June. Whatever clock had been</w:t>
+      </w:r>
+      <w:r>
+        <w:t xml:space="preserve"> </w:t>
+      </w:r>
+      <w:r>
+        <w:t xml:space="preserve">ticking inside Douglas Garland had just been handed a deadline.</w:t>
       </w:r>
     </w:p>
     <w:bookmarkStart w:id="53" w:name="the-preparations"/>
@@ -6253,37 +6252,45 @@
         <w:pStyle w:val="FirstParagraph"/>
       </w:pPr>
       <w:r>
-        <w:t xml:space="preserve">What Garland did next, the trial evidence showed, he did methodically. He</w:t>
-      </w:r>
-      <w:r>
-        <w:t xml:space="preserve"> </w:t>
-      </w:r>
-      <w:r>
-        <w:t xml:space="preserve">began researching online how to kill and dismember people. He accumulated</w:t>
-      </w:r>
-      <w:r>
-        <w:t xml:space="preserve"> </w:t>
-      </w:r>
-      <w:r>
-        <w:t xml:space="preserve">restraints; handcuffs, straightjackets, tasers. He visited a butcher supply</w:t>
-      </w:r>
-      <w:r>
-        <w:t xml:space="preserve"> </w:t>
-      </w:r>
-      <w:r>
-        <w:t xml:space="preserve">shop and bought meat hooks, butcher knives, and a meat saw. He researched how</w:t>
-      </w:r>
-      <w:r>
-        <w:t xml:space="preserve"> </w:t>
-      </w:r>
-      <w:r>
-        <w:t xml:space="preserve">to defeat one specific model of Schlage lock, the kind securing the Liknes</w:t>
-      </w:r>
-      <w:r>
-        <w:t xml:space="preserve"> </w:t>
-      </w:r>
-      <w:r>
-        <w:t xml:space="preserve">front door. And through it all he browsed what the court describes as</w:t>
+        <w:t xml:space="preserve">What Garland did next he did with the patient, methodical care of a man who</w:t>
+      </w:r>
+      <w:r>
+        <w:t xml:space="preserve"> </w:t>
+      </w:r>
+      <w:r>
+        <w:t xml:space="preserve">plans, and the record of that planning is its own kind of horror.</w:t>
+      </w:r>
+    </w:p>
+    <w:p>
+      <w:pPr>
+        <w:pStyle w:val="BodyText"/>
+      </w:pPr>
+      <w:r>
+        <w:t xml:space="preserve">He began researching, online, how to kill and dismember a human being. He</w:t>
+      </w:r>
+      <w:r>
+        <w:t xml:space="preserve"> </w:t>
+      </w:r>
+      <w:r>
+        <w:t xml:space="preserve">gathered restraints: handcuffs, straightjackets, tasers. He went to a butcher’s</w:t>
+      </w:r>
+      <w:r>
+        <w:t xml:space="preserve"> </w:t>
+      </w:r>
+      <w:r>
+        <w:t xml:space="preserve">supply shop and bought meat hooks, butcher knives, and a meat saw. He studied how</w:t>
+      </w:r>
+      <w:r>
+        <w:t xml:space="preserve"> </w:t>
+      </w:r>
+      <w:r>
+        <w:t xml:space="preserve">to defeat one specific model of Schlage lock, the exact lock that secured the</w:t>
+      </w:r>
+      <w:r>
+        <w:t xml:space="preserve"> </w:t>
+      </w:r>
+      <w:r>
+        <w:t xml:space="preserve">Liknes front door. And in the same weeks, the same browser carried him through</w:t>
       </w:r>
       <w:r>
         <w:t xml:space="preserve"> </w:t>
@@ -6301,7 +6308,13 @@
         <w:t xml:space="preserve"> </w:t>
       </w:r>
       <w:r>
-        <w:t xml:space="preserve">sites showing bodies being dissected and dismembered.</w:t>
+        <w:t xml:space="preserve">sites showing bodies being dissected and taken apart, the appetite and the</w:t>
+      </w:r>
+      <w:r>
+        <w:t xml:space="preserve"> </w:t>
+      </w:r>
+      <w:r>
+        <w:t xml:space="preserve">instruction manual feeding each other.</w:t>
       </w:r>
     </w:p>
     <w:p>
@@ -6309,25 +6322,25 @@
         <w:pStyle w:val="BodyText"/>
       </w:pPr>
       <w:r>
-        <w:t xml:space="preserve">On the evening of June 29, 2014, Kathy Liknes’s daughter Jennifer brought her</w:t>
-      </w:r>
-      <w:r>
-        <w:t xml:space="preserve"> </w:t>
-      </w:r>
-      <w:r>
-        <w:t xml:space="preserve">two little boys, Nathan, five, and Max, three, to their grandparents’ house</w:t>
-      </w:r>
-      <w:r>
-        <w:t xml:space="preserve"> </w:t>
-      </w:r>
-      <w:r>
-        <w:t xml:space="preserve">for dinner and one last sleepover before the move. Max was restless and</w:t>
-      </w:r>
-      <w:r>
-        <w:t xml:space="preserve"> </w:t>
-      </w:r>
-      <w:r>
-        <w:t xml:space="preserve">couldn’t sleep, so around 11:30 p.m. Jennifer took him home. Nathan stayed.</w:t>
+        <w:t xml:space="preserve">On the evening of June 29, 2014, Kathy Liknes’s daughter Jennifer brought her two</w:t>
+      </w:r>
+      <w:r>
+        <w:t xml:space="preserve"> </w:t>
+      </w:r>
+      <w:r>
+        <w:t xml:space="preserve">little boys, Nathan, five, and Max, three, to their grandparents’ house for dinner</w:t>
+      </w:r>
+      <w:r>
+        <w:t xml:space="preserve"> </w:t>
+      </w:r>
+      <w:r>
+        <w:t xml:space="preserve">and a last sleepover before the move. Max would not settle, so around 11:30 p.m.</w:t>
+      </w:r>
+      <w:r>
+        <w:t xml:space="preserve"> </w:t>
+      </w:r>
+      <w:r>
+        <w:t xml:space="preserve">Jennifer drove him home. Nathan stayed behind.</w:t>
       </w:r>
     </w:p>
     <w:p>
@@ -6335,25 +6348,31 @@
         <w:pStyle w:val="BodyText"/>
       </w:pPr>
       <w:r>
-        <w:t xml:space="preserve">About three hours later, Garland arrived. He disabled the home’s wireless</w:t>
-      </w:r>
-      <w:r>
-        <w:t xml:space="preserve"> </w:t>
-      </w:r>
-      <w:r>
-        <w:t xml:space="preserve">router. He drilled out the Schlage lock. What followed, in the court’s words,</w:t>
-      </w:r>
-      <w:r>
-        <w:t xml:space="preserve"> </w:t>
-      </w:r>
-      <w:r>
-        <w:t xml:space="preserve">was a violent attack that ended with Alvin, Kathy, and five-year-old Nathan</w:t>
-      </w:r>
-      <w:r>
-        <w:t xml:space="preserve"> </w:t>
-      </w:r>
-      <w:r>
-        <w:t xml:space="preserve">being overpowered and taken from the home.</w:t>
+        <w:t xml:space="preserve">About three hours later, in the dead middle of the night, Garland came. He</w:t>
+      </w:r>
+      <w:r>
+        <w:t xml:space="preserve"> </w:t>
+      </w:r>
+      <w:r>
+        <w:t xml:space="preserve">disabled the home’s wireless router. He drilled out the Schlage lock he had</w:t>
+      </w:r>
+      <w:r>
+        <w:t xml:space="preserve"> </w:t>
+      </w:r>
+      <w:r>
+        <w:t xml:space="preserve">studied. And then, in the court’s spare language, there followed a violent attack</w:t>
+      </w:r>
+      <w:r>
+        <w:t xml:space="preserve"> </w:t>
+      </w:r>
+      <w:r>
+        <w:t xml:space="preserve">that ended with Alvin, Kathy, and five-year-old Nathan overpowered and taken from</w:t>
+      </w:r>
+      <w:r>
+        <w:t xml:space="preserve"> </w:t>
+      </w:r>
+      <w:r>
+        <w:t xml:space="preserve">the house.</w:t>
       </w:r>
     </w:p>
     <w:p>
@@ -6361,31 +6380,37 @@
         <w:pStyle w:val="BodyText"/>
       </w:pPr>
       <w:r>
-        <w:t xml:space="preserve">When Jennifer returned the next morning to pick up her son, she walked into</w:t>
-      </w:r>
-      <w:r>
-        <w:t xml:space="preserve"> </w:t>
-      </w:r>
-      <w:r>
-        <w:t xml:space="preserve">the aftermath; blood throughout the house, mixed with broken teeth. A</w:t>
-      </w:r>
-      <w:r>
-        <w:t xml:space="preserve"> </w:t>
-      </w:r>
-      <w:r>
-        <w:t xml:space="preserve">forensic pathologist brought to the scene offered investigators a sliver of</w:t>
-      </w:r>
-      <w:r>
-        <w:t xml:space="preserve"> </w:t>
-      </w:r>
-      <w:r>
-        <w:t xml:space="preserve">terrible hope: this much blood meant someone was seriously injured, but</w:t>
-      </w:r>
-      <w:r>
-        <w:t xml:space="preserve"> </w:t>
-      </w:r>
-      <w:r>
-        <w:t xml:space="preserve">perhaps still alive.</w:t>
+        <w:t xml:space="preserve">When Jennifer returned the next morning to collect her son, she walked into the</w:t>
+      </w:r>
+      <w:r>
+        <w:t xml:space="preserve"> </w:t>
+      </w:r>
+      <w:r>
+        <w:t xml:space="preserve">aftermath: blood through the house, mixed with broken teeth. A forensic</w:t>
+      </w:r>
+      <w:r>
+        <w:t xml:space="preserve"> </w:t>
+      </w:r>
+      <w:r>
+        <w:t xml:space="preserve">pathologist called to the scene offered the investigators a single thread of</w:t>
+      </w:r>
+      <w:r>
+        <w:t xml:space="preserve"> </w:t>
+      </w:r>
+      <w:r>
+        <w:t xml:space="preserve">terrible hope. This much blood, she said, meant one or more of the victims was</w:t>
+      </w:r>
+      <w:r>
+        <w:t xml:space="preserve"> </w:t>
+      </w:r>
+      <w:r>
+        <w:t xml:space="preserve">seriously hurt, but perhaps still alive. That thread, and the race it started,</w:t>
+      </w:r>
+      <w:r>
+        <w:t xml:space="preserve"> </w:t>
+      </w:r>
+      <w:r>
+        <w:t xml:space="preserve">would shape everything that came next.</w:t>
       </w:r>
     </w:p>
     <w:bookmarkEnd w:id="53"/>
@@ -6403,13 +6428,31 @@
         <w:pStyle w:val="FirstParagraph"/>
       </w:pPr>
       <w:r>
-        <w:t xml:space="preserve">That sliver of hope drove everything that followed, including the legal fight</w:t>
-      </w:r>
-      <w:r>
-        <w:t xml:space="preserve"> </w:t>
-      </w:r>
-      <w:r>
-        <w:t xml:space="preserve">this case became.</w:t>
+        <w:t xml:space="preserve">Blood is loud, and this house was screaming. Security cameras on neighbouring</w:t>
+      </w:r>
+      <w:r>
+        <w:t xml:space="preserve"> </w:t>
+      </w:r>
+      <w:r>
+        <w:t xml:space="preserve">homes had caught a truck closely matching Garland’s distinctive old Ford passing</w:t>
+      </w:r>
+      <w:r>
+        <w:t xml:space="preserve"> </w:t>
+      </w:r>
+      <w:r>
+        <w:t xml:space="preserve">the Liknes house at 3:10 a.m. and again at 7:45. When police released the image,</w:t>
+      </w:r>
+      <w:r>
+        <w:t xml:space="preserve"> </w:t>
+      </w:r>
+      <w:r>
+        <w:t xml:space="preserve">Garland’s own sister and brother-in-law came forward: that was almost certainly</w:t>
+      </w:r>
+      <w:r>
+        <w:t xml:space="preserve"> </w:t>
+      </w:r>
+      <w:r>
+        <w:t xml:space="preserve">Douglas’s truck, and Douglas had carried a grudge against Alvin Liknes for years.</w:t>
       </w:r>
     </w:p>
     <w:p>
@@ -6417,31 +6460,43 @@
         <w:pStyle w:val="BodyText"/>
       </w:pPr>
       <w:r>
-        <w:t xml:space="preserve">Security cameras on neighbouring homes caught a truck closely resembling</w:t>
-      </w:r>
-      <w:r>
-        <w:t xml:space="preserve"> </w:t>
-      </w:r>
-      <w:r>
-        <w:t xml:space="preserve">Garland’s distinctive old Ford passing the Liknes house at 3:10 a.m., and</w:t>
-      </w:r>
-      <w:r>
-        <w:t xml:space="preserve"> </w:t>
-      </w:r>
-      <w:r>
-        <w:t xml:space="preserve">again at 7:45 a.m. When police released the image to the media, Garland’s own</w:t>
-      </w:r>
-      <w:r>
-        <w:t xml:space="preserve"> </w:t>
-      </w:r>
-      <w:r>
-        <w:t xml:space="preserve">sister and brother-in-law came forward: the truck was almost certainly</w:t>
-      </w:r>
-      <w:r>
-        <w:t xml:space="preserve"> </w:t>
-      </w:r>
-      <w:r>
-        <w:t xml:space="preserve">Douglas’s, and Douglas had carried a grudge against Alvin Liknes for years.</w:t>
+        <w:t xml:space="preserve">The router sealed it. The device was built to check in with its server every six</w:t>
+      </w:r>
+      <w:r>
+        <w:t xml:space="preserve"> </w:t>
+      </w:r>
+      <w:r>
+        <w:t xml:space="preserve">hours; it reported at 2:10 a.m. and then went silent, never calling home again.</w:t>
+      </w:r>
+      <w:r>
+        <w:t xml:space="preserve"> </w:t>
+      </w:r>
+      <w:r>
+        <w:t xml:space="preserve">Someone who understood computers had pulled the plug to keep his devices off the</w:t>
+      </w:r>
+      <w:r>
+        <w:t xml:space="preserve"> </w:t>
+      </w:r>
+      <w:r>
+        <w:t xml:space="preserve">network, and the police were now looking for exactly that someone: a loner with</w:t>
+      </w:r>
+      <w:r>
+        <w:t xml:space="preserve"> </w:t>
+      </w:r>
+      <w:r>
+        <w:t xml:space="preserve">computer expertise, driving a truck seen forty kilometres from his own farm at</w:t>
+      </w:r>
+      <w:r>
+        <w:t xml:space="preserve"> </w:t>
+      </w:r>
+      <w:r>
+        <w:t xml:space="preserve">3:10 in the morning, holding an old and specific hatred. On July 4 they came to</w:t>
+      </w:r>
+      <w:r>
+        <w:t xml:space="preserve"> </w:t>
+      </w:r>
+      <w:r>
+        <w:t xml:space="preserve">the Garland farm.</w:t>
       </w:r>
     </w:p>
     <w:p>
@@ -6449,31 +6504,37 @@
         <w:pStyle w:val="BodyText"/>
       </w:pPr>
       <w:r>
-        <w:t xml:space="preserve">The router sealed the suspicion. It was set to check in with its server every</w:t>
-      </w:r>
-      <w:r>
-        <w:t xml:space="preserve"> </w:t>
-      </w:r>
-      <w:r>
-        <w:t xml:space="preserve">six hours; it reported at 2:10 a.m. and never again. Someone who understood</w:t>
-      </w:r>
-      <w:r>
-        <w:t xml:space="preserve"> </w:t>
-      </w:r>
-      <w:r>
-        <w:t xml:space="preserve">computers had unplugged it to keep his devices off the network. A loner with</w:t>
-      </w:r>
-      <w:r>
-        <w:t xml:space="preserve"> </w:t>
-      </w:r>
-      <w:r>
-        <w:t xml:space="preserve">computer expertise, a matching truck forty kilometres from home at 3:10 a.m.,</w:t>
-      </w:r>
-      <w:r>
-        <w:t xml:space="preserve"> </w:t>
-      </w:r>
-      <w:r>
-        <w:t xml:space="preserve">and an abiding grudge: on July 4, police descended on the Garland farm.</w:t>
+        <w:t xml:space="preserve">They arrived at a brutal fork. Wait for a warrant, or go in now, on the slim</w:t>
+      </w:r>
+      <w:r>
+        <w:t xml:space="preserve"> </w:t>
+      </w:r>
+      <w:r>
+        <w:t xml:space="preserve">chance that a man, a woman, or a small boy was still alive somewhere on the</w:t>
+      </w:r>
+      <w:r>
+        <w:t xml:space="preserve"> </w:t>
+      </w:r>
+      <w:r>
+        <w:t xml:space="preserve">property and could be saved. They went in, under strict orders to search only the</w:t>
+      </w:r>
+      <w:r>
+        <w:t xml:space="preserve"> </w:t>
+      </w:r>
+      <w:r>
+        <w:t xml:space="preserve">places large enough to hide a body. They found a large firepit, still smouldering.</w:t>
+      </w:r>
+      <w:r>
+        <w:t xml:space="preserve"> </w:t>
+      </w:r>
+      <w:r>
+        <w:t xml:space="preserve">Fresh cut marks scored into the recently cleaned floor of a greenhouse.</w:t>
+      </w:r>
+      <w:r>
+        <w:t xml:space="preserve"> </w:t>
+      </w:r>
+      <w:r>
+        <w:t xml:space="preserve">Restraints. No people.</w:t>
       </w:r>
     </w:p>
     <w:p>
@@ -6481,31 +6542,31 @@
         <w:pStyle w:val="BodyText"/>
       </w:pPr>
       <w:r>
-        <w:t xml:space="preserve">They faced a brutal choice. Wait for a warrant, or go in immediately, on the</w:t>
-      </w:r>
-      <w:r>
-        <w:t xml:space="preserve"> </w:t>
-      </w:r>
-      <w:r>
-        <w:t xml:space="preserve">chance that a man, a woman, or a little boy was still alive somewhere on that</w:t>
-      </w:r>
-      <w:r>
-        <w:t xml:space="preserve"> </w:t>
-      </w:r>
-      <w:r>
-        <w:t xml:space="preserve">property. They went in, under orders to search only places large enough to</w:t>
-      </w:r>
-      <w:r>
-        <w:t xml:space="preserve"> </w:t>
-      </w:r>
-      <w:r>
-        <w:t xml:space="preserve">conceal a body. They found a large smouldering firepit. Fresh cut marks on the</w:t>
-      </w:r>
-      <w:r>
-        <w:t xml:space="preserve"> </w:t>
-      </w:r>
-      <w:r>
-        <w:t xml:space="preserve">recently cleaned floor of a greenhouse. Restraints. No bodies.</w:t>
+        <w:t xml:space="preserve">Garland was stopped as he drove away from the farm and held in investigative</w:t>
+      </w:r>
+      <w:r>
+        <w:t xml:space="preserve"> </w:t>
+      </w:r>
+      <w:r>
+        <w:t xml:space="preserve">detention; police seized his shoes, and a victim’s blood was on them. The next</w:t>
+      </w:r>
+      <w:r>
+        <w:t xml:space="preserve"> </w:t>
+      </w:r>
+      <w:r>
+        <w:t xml:space="preserve">day, warrant in hand, they searched in earnest. In the firepit, and on a meat</w:t>
+      </w:r>
+      <w:r>
+        <w:t xml:space="preserve"> </w:t>
+      </w:r>
+      <w:r>
+        <w:t xml:space="preserve">hook and a meat saw, they found DNA, blood and flesh both, from all three</w:t>
+      </w:r>
+      <w:r>
+        <w:t xml:space="preserve"> </w:t>
+      </w:r>
+      <w:r>
+        <w:t xml:space="preserve">victims.</w:t>
       </w:r>
     </w:p>
     <w:p>
@@ -6513,33 +6574,13 @@
         <w:pStyle w:val="BodyText"/>
       </w:pPr>
       <w:r>
-        <w:t xml:space="preserve">Garland was stopped driving away from the farm and detained; his shoes were</w:t>
-      </w:r>
-      <w:r>
-        <w:t xml:space="preserve"> </w:t>
-      </w:r>
-      <w:r>
-        <w:t xml:space="preserve">seized, and a victim’s blood was on them. The next day, warrant in hand,</w:t>
-      </w:r>
-      <w:r>
-        <w:t xml:space="preserve"> </w:t>
-      </w:r>
-      <w:r>
-        <w:t xml:space="preserve">police searched the farm thoroughly. In the firepit, and on a meat hook and a</w:t>
-      </w:r>
-      <w:r>
-        <w:t xml:space="preserve"> </w:t>
-      </w:r>
-      <w:r>
-        <w:t xml:space="preserve">meat saw, they found DNA, blood and flesh, from all three victims.</w:t>
-      </w:r>
-    </w:p>
-    <w:p>
-      <w:pPr>
-        <w:pStyle w:val="BodyText"/>
-      </w:pPr>
-      <w:r>
-        <w:t xml:space="preserve">And in the rafters of the house, hidden, they found a computer hard drive.</w:t>
+        <w:t xml:space="preserve">And tucked up in the rafters of the house, hidden, they found a computer hard</w:t>
+      </w:r>
+      <w:r>
+        <w:t xml:space="preserve"> </w:t>
+      </w:r>
+      <w:r>
+        <w:t xml:space="preserve">drive.</w:t>
       </w:r>
     </w:p>
     <w:bookmarkEnd w:id="54"/>
@@ -6557,19 +6598,19 @@
         <w:pStyle w:val="FirstParagraph"/>
       </w:pPr>
       <w:r>
-        <w:t xml:space="preserve">The forensic examination of that drive laid Garland’s inner life out like an</w:t>
-      </w:r>
-      <w:r>
-        <w:t xml:space="preserve"> </w:t>
-      </w:r>
-      <w:r>
-        <w:t xml:space="preserve">autopsy. Months of computer surveillance of Alvin and Kathy Liknes. Articles</w:t>
-      </w:r>
-      <w:r>
-        <w:t xml:space="preserve"> </w:t>
-      </w:r>
-      <w:r>
-        <w:t xml:space="preserve">with titles like</w:t>
+        <w:t xml:space="preserve">The forensic examination of that drive opened Garland’s inner life like an</w:t>
+      </w:r>
+      <w:r>
+        <w:t xml:space="preserve"> </w:t>
+      </w:r>
+      <w:r>
+        <w:t xml:space="preserve">autopsy. Months of computer surveillance of Alvin and Kathy Liknes. Articles with</w:t>
+      </w:r>
+      <w:r>
+        <w:t xml:space="preserve"> </w:t>
+      </w:r>
+      <w:r>
+        <w:t xml:space="preserve">titles like</w:t>
       </w:r>
       <w:r>
         <w:t xml:space="preserve"> </w:t>
@@ -6587,46 +6628,19 @@
         <w:t xml:space="preserve"> </w:t>
       </w:r>
       <w:r>
-        <w:t xml:space="preserve">An autopsy manual. Files of mutilated</w:t>
-      </w:r>
-      <w:r>
-        <w:t xml:space="preserve"> </w:t>
-      </w:r>
-      <w:r>
-        <w:t xml:space="preserve">corpses. Videos feeding a fetish for adult women wearing only diapers. And,</w:t>
-      </w:r>
-      <w:r>
-        <w:t xml:space="preserve"> </w:t>
-      </w:r>
-      <w:r>
-        <w:t xml:space="preserve">the detail that turns the stomach twice, files offering information on</w:t>
-      </w:r>
-      <w:r>
-        <w:t xml:space="preserve"> </w:t>
-      </w:r>
-      <w:r>
-        <w:rPr>
-          <w:bCs/>
-          <w:b/>
-        </w:rPr>
-        <w:t xml:space="preserve">how</w:t>
-      </w:r>
-      <w:r>
-        <w:rPr>
-          <w:bCs/>
-          <w:b/>
-        </w:rPr>
-        <w:t xml:space="preserve"> </w:t>
-      </w:r>
-      <w:r>
-        <w:rPr>
-          <w:bCs/>
-          <w:b/>
-        </w:rPr>
-        <w:t xml:space="preserve">to destroy DNA evidence</w:t>
-      </w:r>
-      <w:r>
-        <w:t xml:space="preserve">.</w:t>
+        <w:t xml:space="preserve">An autopsy manual. Files of mutilated corpses.</w:t>
+      </w:r>
+      <w:r>
+        <w:t xml:space="preserve"> </w:t>
+      </w:r>
+      <w:r>
+        <w:t xml:space="preserve">And, sitting in that same collection, files explaining how to destroy DNA</w:t>
+      </w:r>
+      <w:r>
+        <w:t xml:space="preserve"> </w:t>
+      </w:r>
+      <w:r>
+        <w:t xml:space="preserve">evidence.</w:t>
       </w:r>
     </w:p>
     <w:p>
@@ -6634,13 +6648,49 @@
         <w:pStyle w:val="BodyText"/>
       </w:pPr>
       <w:r>
-        <w:t xml:space="preserve">He had studied how to erase the physical traces. He never thought to burn the</w:t>
-      </w:r>
-      <w:r>
-        <w:t xml:space="preserve"> </w:t>
-      </w:r>
-      <w:r>
-        <w:t xml:space="preserve">drive that held the studying.</w:t>
+        <w:t xml:space="preserve">Consider the shape of that for a moment, because it is the closest this grim</w:t>
+      </w:r>
+      <w:r>
+        <w:t xml:space="preserve"> </w:t>
+      </w:r>
+      <w:r>
+        <w:t xml:space="preserve">chapter comes to a lesson. Douglas Garland had studied, carefully, how to erase</w:t>
+      </w:r>
+      <w:r>
+        <w:t xml:space="preserve"> </w:t>
+      </w:r>
+      <w:r>
+        <w:t xml:space="preserve">the biological traces a killer leaves behind. He understood the science well</w:t>
+      </w:r>
+      <w:r>
+        <w:t xml:space="preserve"> </w:t>
+      </w:r>
+      <w:r>
+        <w:t xml:space="preserve">enough to research countermeasures. And then he saved that research, along with</w:t>
+      </w:r>
+      <w:r>
+        <w:t xml:space="preserve"> </w:t>
+      </w:r>
+      <w:r>
+        <w:t xml:space="preserve">his surveillance logs and his how-to library of murder, onto a hard drive that he</w:t>
+      </w:r>
+      <w:r>
+        <w:t xml:space="preserve"> </w:t>
+      </w:r>
+      <w:r>
+        <w:t xml:space="preserve">tucked into the rafters of his parents’ house rather than feeding to the same fire</w:t>
+      </w:r>
+      <w:r>
+        <w:t xml:space="preserve"> </w:t>
+      </w:r>
+      <w:r>
+        <w:t xml:space="preserve">that had consumed the bodies. The man who knew how to destroy evidence could not</w:t>
+      </w:r>
+      <w:r>
+        <w:t xml:space="preserve"> </w:t>
+      </w:r>
+      <w:r>
+        <w:t xml:space="preserve">bring himself to destroy the evidence of knowing.</w:t>
       </w:r>
     </w:p>
     <w:p>
@@ -6648,43 +6698,43 @@
         <w:pStyle w:val="BodyText"/>
       </w:pPr>
       <w:r>
-        <w:t xml:space="preserve">Two further pieces completed the case. The day after the kidnapping, a car</w:t>
-      </w:r>
-      <w:r>
-        <w:t xml:space="preserve"> </w:t>
-      </w:r>
-      <w:r>
-        <w:t xml:space="preserve">wash employee in nearby Airdrie noticed Garland power-washing his truck;</w:t>
-      </w:r>
-      <w:r>
-        <w:t xml:space="preserve"> </w:t>
-      </w:r>
-      <w:r>
-        <w:t xml:space="preserve">forensic examination still found Kathy Liknes’s blood on the back of the</w:t>
-      </w:r>
-      <w:r>
-        <w:t xml:space="preserve"> </w:t>
-      </w:r>
-      <w:r>
-        <w:t xml:space="preserve">licence plate. And by grim coincidence, an aerial survey had photographed the</w:t>
-      </w:r>
-      <w:r>
-        <w:t xml:space="preserve"> </w:t>
-      </w:r>
-      <w:r>
-        <w:t xml:space="preserve">area two days after the abduction, before police ever looked at Garland. In</w:t>
-      </w:r>
-      <w:r>
-        <w:t xml:space="preserve"> </w:t>
-      </w:r>
-      <w:r>
-        <w:t xml:space="preserve">the photos of the Garland farm, near the burn pit, lie what appear to be three</w:t>
-      </w:r>
-      <w:r>
-        <w:t xml:space="preserve"> </w:t>
-      </w:r>
-      <w:r>
-        <w:t xml:space="preserve">bodies, two adults and a child, wearing only diapers.</w:t>
+        <w:t xml:space="preserve">Two more facts closed the circle. The day after the kidnapping, a car-wash</w:t>
+      </w:r>
+      <w:r>
+        <w:t xml:space="preserve"> </w:t>
+      </w:r>
+      <w:r>
+        <w:t xml:space="preserve">employee in nearby Airdrie noticed Garland power-washing his truck, and yet</w:t>
+      </w:r>
+      <w:r>
+        <w:t xml:space="preserve"> </w:t>
+      </w:r>
+      <w:r>
+        <w:t xml:space="preserve">forensics still recovered Kathy Liknes’s blood from the back of the licence plate,</w:t>
+      </w:r>
+      <w:r>
+        <w:t xml:space="preserve"> </w:t>
+      </w:r>
+      <w:r>
+        <w:t xml:space="preserve">the one surface a hurried man forgets. And by sheer chance, an aerial survey had</w:t>
+      </w:r>
+      <w:r>
+        <w:t xml:space="preserve"> </w:t>
+      </w:r>
+      <w:r>
+        <w:t xml:space="preserve">photographed the region two days after the abduction, before police had any reason</w:t>
+      </w:r>
+      <w:r>
+        <w:t xml:space="preserve"> </w:t>
+      </w:r>
+      <w:r>
+        <w:t xml:space="preserve">to look at Garland at all. In those photographs of the Garland farm, near the burn</w:t>
+      </w:r>
+      <w:r>
+        <w:t xml:space="preserve"> </w:t>
+      </w:r>
+      <w:r>
+        <w:t xml:space="preserve">pit, lie what appear to be three bodies, two adults and a child.</w:t>
       </w:r>
     </w:p>
     <w:p>
@@ -6692,7 +6742,7 @@
         <w:pStyle w:val="BodyText"/>
       </w:pPr>
       <w:r>
-        <w:t xml:space="preserve">The bodies themselves were never recovered. The firepit had done its work.</w:t>
+        <w:t xml:space="preserve">The remains themselves were never recovered. The firepit had finished its work.</w:t>
       </w:r>
     </w:p>
     <w:p>
@@ -6700,85 +6750,43 @@
         <w:pStyle w:val="BodyText"/>
       </w:pPr>
       <w:r>
-        <w:t xml:space="preserve">Garland did not testify and called no evidence. The jury convicted him of</w:t>
-      </w:r>
-      <w:r>
-        <w:t xml:space="preserve"> </w:t>
-      </w:r>
-      <w:r>
-        <w:t xml:space="preserve">three counts of first-degree murder, and he was sentenced to life with no</w:t>
-      </w:r>
-      <w:r>
-        <w:t xml:space="preserve"> </w:t>
-      </w:r>
-      <w:r>
-        <w:t xml:space="preserve">parole eligibility for seventy-five years. On appeal he didn’t dispute that he</w:t>
-      </w:r>
-      <w:r>
-        <w:t xml:space="preserve"> </w:t>
-      </w:r>
-      <w:r>
-        <w:t xml:space="preserve">was the killer; he argued the police had violated the Charter at nearly every</w:t>
-      </w:r>
-      <w:r>
-        <w:t xml:space="preserve"> </w:t>
-      </w:r>
-      <w:r>
-        <w:t xml:space="preserve">step: the takedown, the shoe seizure, the warrantless search, the warrant</w:t>
-      </w:r>
-      <w:r>
-        <w:t xml:space="preserve"> </w:t>
-      </w:r>
-      <w:r>
-        <w:t xml:space="preserve">built on it, even the trial judge’s gentle warnings to the jury before the</w:t>
-      </w:r>
-      <w:r>
-        <w:t xml:space="preserve"> </w:t>
-      </w:r>
-      <w:r>
-        <w:t xml:space="preserve">worst evidence (</w:t>
-      </w:r>
-      <w:r>
-        <w:t xml:space="preserve">“</w:t>
-      </w:r>
-      <w:r>
-        <w:t xml:space="preserve">I know yesterday was difficult. It was difficult for me</w:t>
-      </w:r>
-      <w:r>
-        <w:t xml:space="preserve"> </w:t>
-      </w:r>
-      <w:r>
-        <w:t xml:space="preserve">too.</w:t>
-      </w:r>
-      <w:r>
-        <w:t xml:space="preserve">”</w:t>
-      </w:r>
-      <w:r>
-        <w:t xml:space="preserve">). The Court of Appeal worked through every ground and dismissed the</w:t>
-      </w:r>
-      <w:r>
-        <w:t xml:space="preserve"> </w:t>
-      </w:r>
-      <w:r>
-        <w:t xml:space="preserve">appeal. The police had erred in small ways, a black bag opened too soon, the</w:t>
-      </w:r>
-      <w:r>
-        <w:t xml:space="preserve"> </w:t>
-      </w:r>
-      <w:r>
-        <w:t xml:space="preserve">shoes taken during investigative detention, but the searches that mattered</w:t>
-      </w:r>
-      <w:r>
-        <w:t xml:space="preserve"> </w:t>
-      </w:r>
-      <w:r>
-        <w:t xml:space="preserve">were driven by the one motive the law protects above almost everything: the</w:t>
-      </w:r>
-      <w:r>
-        <w:t xml:space="preserve"> </w:t>
-      </w:r>
-      <w:r>
-        <w:t xml:space="preserve">chance that someone was still alive to save.</w:t>
+        <w:t xml:space="preserve">Garland did not testify and called no evidence. He did not, on appeal, even</w:t>
+      </w:r>
+      <w:r>
+        <w:t xml:space="preserve"> </w:t>
+      </w:r>
+      <w:r>
+        <w:t xml:space="preserve">dispute that he was the killer; that had been proven beyond any doubt. He argued</w:t>
+      </w:r>
+      <w:r>
+        <w:t xml:space="preserve"> </w:t>
+      </w:r>
+      <w:r>
+        <w:t xml:space="preserve">instead that police had trampled his Charter rights at nearly every turn, and the</w:t>
+      </w:r>
+      <w:r>
+        <w:t xml:space="preserve"> </w:t>
+      </w:r>
+      <w:r>
+        <w:t xml:space="preserve">Court of Appeal walked through each complaint and dismissed the appeal. The</w:t>
+      </w:r>
+      <w:r>
+        <w:t xml:space="preserve"> </w:t>
+      </w:r>
+      <w:r>
+        <w:t xml:space="preserve">searches that mattered had been driven by the one motive the law places above</w:t>
+      </w:r>
+      <w:r>
+        <w:t xml:space="preserve"> </w:t>
+      </w:r>
+      <w:r>
+        <w:t xml:space="preserve">almost everything else: the chance, however faint, that someone was still alive to</w:t>
+      </w:r>
+      <w:r>
+        <w:t xml:space="preserve"> </w:t>
+      </w:r>
+      <w:r>
+        <w:t xml:space="preserve">be saved.</w:t>
       </w:r>
     </w:p>
     <w:bookmarkEnd w:id="55"/>
@@ -6796,55 +6804,61 @@
         <w:pStyle w:val="FirstParagraph"/>
       </w:pPr>
       <w:r>
-        <w:t xml:space="preserve">His own meticulousness convicted him. The grudge gave police his name within</w:t>
-      </w:r>
-      <w:r>
-        <w:t xml:space="preserve"> </w:t>
-      </w:r>
-      <w:r>
-        <w:t xml:space="preserve">days, nursed so long and so openly that his own family recognized it. The</w:t>
-      </w:r>
-      <w:r>
-        <w:t xml:space="preserve"> </w:t>
-      </w:r>
-      <w:r>
-        <w:t xml:space="preserve">unplugged router pointed to a killer who understood computers. The truck he</w:t>
-      </w:r>
-      <w:r>
-        <w:t xml:space="preserve"> </w:t>
-      </w:r>
-      <w:r>
-        <w:t xml:space="preserve">drove past the cameras was too old and too distinctive to be anyone else’s.</w:t>
-      </w:r>
-      <w:r>
-        <w:t xml:space="preserve"> </w:t>
-      </w:r>
-      <w:r>
-        <w:t xml:space="preserve">And the hard drive in the rafters preserved, in perfect forensic order, the</w:t>
-      </w:r>
-      <w:r>
-        <w:t xml:space="preserve"> </w:t>
-      </w:r>
-      <w:r>
-        <w:t xml:space="preserve">research, the surveillance, the manuals, and the plan, including his notes on</w:t>
-      </w:r>
-      <w:r>
-        <w:t xml:space="preserve"> </w:t>
-      </w:r>
-      <w:r>
-        <w:t xml:space="preserve">destroying the very kind of evidence that hanged him. Douglas Garland</w:t>
-      </w:r>
-      <w:r>
-        <w:t xml:space="preserve"> </w:t>
-      </w:r>
-      <w:r>
-        <w:t xml:space="preserve">understood machines better than almost anyone around him. He just forgot that</w:t>
-      </w:r>
-      <w:r>
-        <w:t xml:space="preserve"> </w:t>
-      </w:r>
-      <w:r>
-        <w:t xml:space="preserve">they never forget.</w:t>
+        <w:t xml:space="preserve">He was undone by his own thoroughness, the very trait he was most proud of. The</w:t>
+      </w:r>
+      <w:r>
+        <w:t xml:space="preserve"> </w:t>
+      </w:r>
+      <w:r>
+        <w:t xml:space="preserve">grudge handed police his name within days, nursed so long and so loudly that his</w:t>
+      </w:r>
+      <w:r>
+        <w:t xml:space="preserve"> </w:t>
+      </w:r>
+      <w:r>
+        <w:t xml:space="preserve">own family recognized it on sight. The unplugged router announced a killer who</w:t>
+      </w:r>
+      <w:r>
+        <w:t xml:space="preserve"> </w:t>
+      </w:r>
+      <w:r>
+        <w:t xml:space="preserve">understood machines. The truck was too old and too distinctive to belong to anyone</w:t>
+      </w:r>
+      <w:r>
+        <w:t xml:space="preserve"> </w:t>
+      </w:r>
+      <w:r>
+        <w:t xml:space="preserve">else. And the hard drive in the rafters preserved, in flawless order, the</w:t>
+      </w:r>
+      <w:r>
+        <w:t xml:space="preserve"> </w:t>
+      </w:r>
+      <w:r>
+        <w:t xml:space="preserve">surveillance, the manuals, the appetite, and the plan, including his own careful</w:t>
+      </w:r>
+      <w:r>
+        <w:t xml:space="preserve"> </w:t>
+      </w:r>
+      <w:r>
+        <w:t xml:space="preserve">notes on how to erase the kind of evidence that ultimately buried him. Douglas</w:t>
+      </w:r>
+      <w:r>
+        <w:t xml:space="preserve"> </w:t>
+      </w:r>
+      <w:r>
+        <w:t xml:space="preserve">Garland understood technology better than almost anyone around him. What he never</w:t>
+      </w:r>
+      <w:r>
+        <w:t xml:space="preserve"> </w:t>
+      </w:r>
+      <w:r>
+        <w:t xml:space="preserve">understood was that a machine remembers everything you teach it, especially the</w:t>
+      </w:r>
+      <w:r>
+        <w:t xml:space="preserve"> </w:t>
+      </w:r>
+      <w:r>
+        <w:t xml:space="preserve">things you would most like it to forget.</w:t>
       </w:r>
     </w:p>
     <w:p>
@@ -6937,7 +6951,7 @@
           <w:bCs/>
           <w:b/>
         </w:rPr>
-        <w:t xml:space="preserve">She was fifteen. She never touched the victim. She talked a boy into the</w:t>
+        <w:t xml:space="preserve">She was fifteen. She never met the victim, never went to the scene, never</w:t>
       </w:r>
       <w:r>
         <w:rPr>
@@ -6951,7 +6965,21 @@
           <w:bCs/>
           <w:b/>
         </w:rPr>
-        <w:t xml:space="preserve">stabbing from behind a keyboard, and the law called it first-degree murder.</w:t>
+        <w:t xml:space="preserve">touched the weapon. She committed the murder entirely through a screen, and the</w:t>
+      </w:r>
+      <w:r>
+        <w:rPr>
+          <w:bCs/>
+          <w:b/>
+        </w:rPr>
+        <w:t xml:space="preserve"> </w:t>
+      </w:r>
+      <w:r>
+        <w:rPr>
+          <w:bCs/>
+          <w:b/>
+        </w:rPr>
+        <w:t xml:space="preserve">law agreed that made it hers.</w:t>
       </w:r>
     </w:p>
     <w:p>
@@ -6959,19 +6987,25 @@
         <w:pStyle w:val="BodyText"/>
       </w:pPr>
       <w:r>
-        <w:t xml:space="preserve">On New Year’s Day 2008, seventeen-year-old David Bagshaw stabbed fourteen-year-old</w:t>
-      </w:r>
-      <w:r>
-        <w:t xml:space="preserve"> </w:t>
-      </w:r>
-      <w:r>
-        <w:t xml:space="preserve">Stefanie Rengel to death outside her Toronto home. He was tried separately and</w:t>
-      </w:r>
-      <w:r>
-        <w:t xml:space="preserve"> </w:t>
-      </w:r>
-      <w:r>
-        <w:t xml:space="preserve">convicted of first-degree murder. He was the one who held the knife.</w:t>
+        <w:t xml:space="preserve">On New Year’s Day 2008, a seventeen-year-old named David Bagshaw stabbed</w:t>
+      </w:r>
+      <w:r>
+        <w:t xml:space="preserve"> </w:t>
+      </w:r>
+      <w:r>
+        <w:t xml:space="preserve">fourteen-year-old Stefanie Rengel to death in the snow outside her Toronto home.</w:t>
+      </w:r>
+      <w:r>
+        <w:t xml:space="preserve"> </w:t>
+      </w:r>
+      <w:r>
+        <w:t xml:space="preserve">He held the knife. He was tried separately, and he was convicted of first-degree</w:t>
+      </w:r>
+      <w:r>
+        <w:t xml:space="preserve"> </w:t>
+      </w:r>
+      <w:r>
+        <w:t xml:space="preserve">murder.</w:t>
       </w:r>
     </w:p>
     <w:p>
@@ -6979,37 +7013,43 @@
         <w:pStyle w:val="BodyText"/>
       </w:pPr>
       <w:r>
-        <w:t xml:space="preserve">But the person the Crown put at the center of this killing never met Stefanie</w:t>
-      </w:r>
-      <w:r>
-        <w:t xml:space="preserve"> </w:t>
-      </w:r>
-      <w:r>
-        <w:t xml:space="preserve">Rengel, never went to her house on the day she died, and was not present when</w:t>
-      </w:r>
-      <w:r>
-        <w:t xml:space="preserve"> </w:t>
-      </w:r>
-      <w:r>
-        <w:t xml:space="preserve">she was stabbed. Her name was Melissa Todorovic. She was fifteen years old, she</w:t>
-      </w:r>
-      <w:r>
-        <w:t xml:space="preserve"> </w:t>
-      </w:r>
-      <w:r>
-        <w:t xml:space="preserve">was Bagshaw’s girlfriend, and the theory of the case was that she had</w:t>
-      </w:r>
-      <w:r>
-        <w:t xml:space="preserve"> </w:t>
-      </w:r>
-      <w:r>
-        <w:t xml:space="preserve">counselled and encouraged him to commit the murder; that the crime was, in</w:t>
-      </w:r>
-      <w:r>
-        <w:t xml:space="preserve"> </w:t>
-      </w:r>
-      <w:r>
-        <w:t xml:space="preserve">substance, hers.</w:t>
+        <w:t xml:space="preserve">But the person the Crown placed at the true center of this killing was not at the</w:t>
+      </w:r>
+      <w:r>
+        <w:t xml:space="preserve"> </w:t>
+      </w:r>
+      <w:r>
+        <w:t xml:space="preserve">scene when it happened. She had never met Stefanie Rengel. She was fifteen years</w:t>
+      </w:r>
+      <w:r>
+        <w:t xml:space="preserve"> </w:t>
+      </w:r>
+      <w:r>
+        <w:t xml:space="preserve">old, she was David Bagshaw’s girlfriend, and her name was Melissa Todorovic. The</w:t>
+      </w:r>
+      <w:r>
+        <w:t xml:space="preserve"> </w:t>
+      </w:r>
+      <w:r>
+        <w:t xml:space="preserve">theory of the case, which a jury would accept, was that she had counselled and</w:t>
+      </w:r>
+      <w:r>
+        <w:t xml:space="preserve"> </w:t>
+      </w:r>
+      <w:r>
+        <w:t xml:space="preserve">encouraged Bagshaw to commit the murder, that the crime had been conceived and</w:t>
+      </w:r>
+      <w:r>
+        <w:t xml:space="preserve"> </w:t>
+      </w:r>
+      <w:r>
+        <w:t xml:space="preserve">driven by her, and that the boy in the snow with the knife had been, in a sense,</w:t>
+      </w:r>
+      <w:r>
+        <w:t xml:space="preserve"> </w:t>
+      </w:r>
+      <w:r>
+        <w:t xml:space="preserve">her instrument.</w:t>
       </w:r>
     </w:p>
     <w:p>
@@ -7017,22 +7057,16 @@
         <w:pStyle w:val="BodyText"/>
       </w:pPr>
       <w:r>
-        <w:t xml:space="preserve">The evidence that made that theory stick was almost entirely a record of things</w:t>
-      </w:r>
-      <w:r>
-        <w:t xml:space="preserve"> </w:t>
-      </w:r>
-      <w:r>
-        <w:t xml:space="preserve">Melissa Todorovic typed.</w:t>
-      </w:r>
-    </w:p>
-    <w:bookmarkStart w:id="59" w:name="a-murder-ordered-by-message"/>
+        <w:t xml:space="preserve">The proof of it was a record of things Melissa Todorovic typed.</w:t>
+      </w:r>
+    </w:p>
+    <w:bookmarkStart w:id="59" w:name="a-murder-authored-by-message"/>
     <w:p>
       <w:pPr>
         <w:pStyle w:val="Heading2"/>
       </w:pPr>
       <w:r>
-        <w:t xml:space="preserve">A murder ordered by message</w:t>
+        <w:t xml:space="preserve">A murder authored by message</w:t>
       </w:r>
     </w:p>
     <w:p>
@@ -7040,7 +7074,7 @@
         <w:pStyle w:val="FirstParagraph"/>
       </w:pPr>
       <w:r>
-        <w:t xml:space="preserve">The Court of Appeal for Ontario’s judgment describes a Crown case</w:t>
+        <w:t xml:space="preserve">The Court of Appeal for Ontario describes a Crown case</w:t>
       </w:r>
       <w:r>
         <w:t xml:space="preserve"> </w:t>
@@ -7049,19 +7083,19 @@
         <w:t xml:space="preserve">“</w:t>
       </w:r>
       <w:r>
-        <w:t xml:space="preserve">based on a</w:t>
-      </w:r>
-      <w:r>
-        <w:t xml:space="preserve"> </w:t>
-      </w:r>
-      <w:r>
-        <w:t xml:space="preserve">large body of circumstantial evidence including computer chats by the appellant</w:t>
-      </w:r>
-      <w:r>
-        <w:t xml:space="preserve"> </w:t>
-      </w:r>
-      <w:r>
-        <w:t xml:space="preserve">with Bagshaw and others.</w:t>
+        <w:t xml:space="preserve">based on a large body of</w:t>
+      </w:r>
+      <w:r>
+        <w:t xml:space="preserve"> </w:t>
+      </w:r>
+      <w:r>
+        <w:t xml:space="preserve">circumstantial evidence including computer chats by the appellant with Bagshaw</w:t>
+      </w:r>
+      <w:r>
+        <w:t xml:space="preserve"> </w:t>
+      </w:r>
+      <w:r>
+        <w:t xml:space="preserve">and others.</w:t>
       </w:r>
       <w:r>
         <w:t xml:space="preserve">”</w:t>
@@ -7070,31 +7104,25 @@
         <w:t xml:space="preserve"> </w:t>
       </w:r>
       <w:r>
-        <w:t xml:space="preserve">Those communications, the Crown argued, showed</w:t>
-      </w:r>
-      <w:r>
-        <w:t xml:space="preserve"> </w:t>
-      </w:r>
-      <w:r>
-        <w:t xml:space="preserve">Todorovic was obsessively jealous of Rengel, a girl who had briefly dated</w:t>
-      </w:r>
-      <w:r>
-        <w:t xml:space="preserve"> </w:t>
-      </w:r>
-      <w:r>
-        <w:t xml:space="preserve">Bagshaw years earlier. The jealousy was not a passing mood; it was a campaign,</w:t>
-      </w:r>
-      <w:r>
-        <w:t xml:space="preserve"> </w:t>
-      </w:r>
-      <w:r>
-        <w:t xml:space="preserve">conducted in text and instant message, to get Bagshaw to eliminate the girl she</w:t>
-      </w:r>
-      <w:r>
-        <w:t xml:space="preserve"> </w:t>
-      </w:r>
-      <w:r>
-        <w:t xml:space="preserve">saw as a rival.</w:t>
+        <w:t xml:space="preserve">Those messages, the Crown argued, revealed a girl consumed by</w:t>
+      </w:r>
+      <w:r>
+        <w:t xml:space="preserve"> </w:t>
+      </w:r>
+      <w:r>
+        <w:t xml:space="preserve">jealousy of Stefanie Rengel, who had briefly dated Bagshaw years before. The</w:t>
+      </w:r>
+      <w:r>
+        <w:t xml:space="preserve"> </w:t>
+      </w:r>
+      <w:r>
+        <w:t xml:space="preserve">jealousy was not a passing sulk. It was a campaign, conducted keystroke by</w:t>
+      </w:r>
+      <w:r>
+        <w:t xml:space="preserve"> </w:t>
+      </w:r>
+      <w:r>
+        <w:t xml:space="preserve">keystroke, to press Bagshaw into removing the girl she had cast as her rival.</w:t>
       </w:r>
     </w:p>
     <w:p>
@@ -7102,55 +7130,61 @@
         <w:pStyle w:val="BodyText"/>
       </w:pPr>
       <w:r>
-        <w:t xml:space="preserve">How relentless that campaign was becomes clear from an incident the judgment</w:t>
-      </w:r>
-      <w:r>
-        <w:t xml:space="preserve"> </w:t>
-      </w:r>
-      <w:r>
-        <w:t xml:space="preserve">records as happening about three months before the killing. Bagshaw went to</w:t>
-      </w:r>
-      <w:r>
-        <w:t xml:space="preserve"> </w:t>
-      </w:r>
-      <w:r>
-        <w:t xml:space="preserve">Stefanie Rengel’s home and told her, to her face, that his girlfriend wanted him</w:t>
-      </w:r>
-      <w:r>
-        <w:t xml:space="preserve"> </w:t>
-      </w:r>
-      <w:r>
-        <w:t xml:space="preserve">to stab her. He explained his plan: he would leave his cell phone behind to make</w:t>
-      </w:r>
-      <w:r>
-        <w:t xml:space="preserve"> </w:t>
-      </w:r>
-      <w:r>
-        <w:t xml:space="preserve">it look as though he had been interrupted mid-attempt, and he wanted Stefanie to</w:t>
-      </w:r>
-      <w:r>
-        <w:t xml:space="preserve"> </w:t>
-      </w:r>
-      <w:r>
-        <w:t xml:space="preserve">confirm to his girlfriend that he had tried, so that his girlfriend would leave</w:t>
-      </w:r>
-      <w:r>
-        <w:t xml:space="preserve"> </w:t>
-      </w:r>
-      <w:r>
-        <w:t xml:space="preserve">him alone about it. This was not yet the murder. This was a fourteen-year-old</w:t>
-      </w:r>
-      <w:r>
-        <w:t xml:space="preserve"> </w:t>
-      </w:r>
-      <w:r>
-        <w:t xml:space="preserve">being told, in person, that a girl she had never wronged was demanding her death,</w:t>
-      </w:r>
-      <w:r>
-        <w:t xml:space="preserve"> </w:t>
-      </w:r>
-      <w:r>
-        <w:t xml:space="preserve">and being asked to help fake the attempt to satisfy that demand.</w:t>
+        <w:t xml:space="preserve">How relentless that pressure became is captured in a single earlier incident the</w:t>
+      </w:r>
+      <w:r>
+        <w:t xml:space="preserve"> </w:t>
+      </w:r>
+      <w:r>
+        <w:t xml:space="preserve">judgment records, one that happened roughly three months before the killing.</w:t>
+      </w:r>
+      <w:r>
+        <w:t xml:space="preserve"> </w:t>
+      </w:r>
+      <w:r>
+        <w:t xml:space="preserve">Bagshaw went to Stefanie Rengel’s home and told her, to her face, that his</w:t>
+      </w:r>
+      <w:r>
+        <w:t xml:space="preserve"> </w:t>
+      </w:r>
+      <w:r>
+        <w:t xml:space="preserve">girlfriend wanted him to stab her. He laid out the plan: he would leave his cell</w:t>
+      </w:r>
+      <w:r>
+        <w:t xml:space="preserve"> </w:t>
+      </w:r>
+      <w:r>
+        <w:t xml:space="preserve">phone behind to make it look as though he’d been interrupted mid-attempt, and he</w:t>
+      </w:r>
+      <w:r>
+        <w:t xml:space="preserve"> </w:t>
+      </w:r>
+      <w:r>
+        <w:t xml:space="preserve">wanted Stefanie herself to confirm to his girlfriend that he had tried, so that</w:t>
+      </w:r>
+      <w:r>
+        <w:t xml:space="preserve"> </w:t>
+      </w:r>
+      <w:r>
+        <w:t xml:space="preserve">the girlfriend would finally let the matter drop. Sit with the arithmetic of</w:t>
+      </w:r>
+      <w:r>
+        <w:t xml:space="preserve"> </w:t>
+      </w:r>
+      <w:r>
+        <w:t xml:space="preserve">that. A fourteen-year-old girl was being informed, in person, that another girl</w:t>
+      </w:r>
+      <w:r>
+        <w:t xml:space="preserve"> </w:t>
+      </w:r>
+      <w:r>
+        <w:t xml:space="preserve">she had never harmed was demanding her death, and was being asked to help fake the</w:t>
+      </w:r>
+      <w:r>
+        <w:t xml:space="preserve"> </w:t>
+      </w:r>
+      <w:r>
+        <w:t xml:space="preserve">attempt in order to satisfy that demand.</w:t>
       </w:r>
     </w:p>
     <w:p>
@@ -7158,19 +7192,19 @@
         <w:pStyle w:val="BodyText"/>
       </w:pPr>
       <w:r>
-        <w:t xml:space="preserve">Stefanie told her mother. Her mother and stepfather, who happen both to be</w:t>
-      </w:r>
-      <w:r>
-        <w:t xml:space="preserve"> </w:t>
-      </w:r>
-      <w:r>
-        <w:t xml:space="preserve">Toronto police officers, confronted Bagshaw and told him and his girlfriend to</w:t>
-      </w:r>
-      <w:r>
-        <w:t xml:space="preserve"> </w:t>
-      </w:r>
-      <w:r>
-        <w:t xml:space="preserve">stay away from their daughter.</w:t>
+        <w:t xml:space="preserve">Stefanie told her mother. Her mother and stepfather, both, as it happens, Toronto</w:t>
+      </w:r>
+      <w:r>
+        <w:t xml:space="preserve"> </w:t>
+      </w:r>
+      <w:r>
+        <w:t xml:space="preserve">police officers, confronted Bagshaw and warned him and his girlfriend to stay</w:t>
+      </w:r>
+      <w:r>
+        <w:t xml:space="preserve"> </w:t>
+      </w:r>
+      <w:r>
+        <w:t xml:space="preserve">away from their daughter.</w:t>
       </w:r>
     </w:p>
     <w:p>
@@ -7178,23 +7212,23 @@
         <w:pStyle w:val="BodyText"/>
       </w:pPr>
       <w:r>
-        <w:t xml:space="preserve">They did not stay away. Three months later, Bagshaw finished what the messages</w:t>
-      </w:r>
-      <w:r>
-        <w:t xml:space="preserve"> </w:t>
-      </w:r>
-      <w:r>
-        <w:t xml:space="preserve">had been pushing him toward.</w:t>
+        <w:t xml:space="preserve">They did not stay away. Three months later, on the first day of the new year,</w:t>
+      </w:r>
+      <w:r>
+        <w:t xml:space="preserve"> </w:t>
+      </w:r>
+      <w:r>
+        <w:t xml:space="preserve">Bagshaw carried out what the messages had been driving toward all along.</w:t>
       </w:r>
     </w:p>
     <w:bookmarkEnd w:id="59"/>
-    <w:bookmarkStart w:id="60" w:name="the-keyboard-and-the-confession"/>
+    <w:bookmarkStart w:id="60" w:name="the-screen-and-the-confession"/>
     <w:p>
       <w:pPr>
         <w:pStyle w:val="Heading2"/>
       </w:pPr>
       <w:r>
-        <w:t xml:space="preserve">The keyboard and the confession</w:t>
+        <w:t xml:space="preserve">The screen and the confession</w:t>
       </w:r>
     </w:p>
     <w:p>
@@ -7202,13 +7236,13 @@
         <w:pStyle w:val="FirstParagraph"/>
       </w:pPr>
       <w:r>
-        <w:t xml:space="preserve">After the killing, Melissa Todorovic did two things that helped convict her, and</w:t>
-      </w:r>
-      <w:r>
-        <w:t xml:space="preserve"> </w:t>
-      </w:r>
-      <w:r>
-        <w:t xml:space="preserve">both were acts of communication.</w:t>
+        <w:t xml:space="preserve">After the killing, Melissa Todorovic did two things that helped seal her own case,</w:t>
+      </w:r>
+      <w:r>
+        <w:t xml:space="preserve"> </w:t>
+      </w:r>
+      <w:r>
+        <w:t xml:space="preserve">and both, fittingly, were acts of communication.</w:t>
       </w:r>
     </w:p>
     <w:p>
@@ -7216,13 +7250,13 @@
         <w:pStyle w:val="BodyText"/>
       </w:pPr>
       <w:r>
-        <w:t xml:space="preserve">First, she called Bagshaw. A friend of his who overheard part of the</w:t>
-      </w:r>
-      <w:r>
-        <w:t xml:space="preserve"> </w:t>
-      </w:r>
-      <w:r>
-        <w:t xml:space="preserve">conversation testified that Todorovic asked him a single question:</w:t>
+        <w:t xml:space="preserve">First, she called Bagshaw. A friend of his who overheard part of that call</w:t>
+      </w:r>
+      <w:r>
+        <w:t xml:space="preserve"> </w:t>
+      </w:r>
+      <w:r>
+        <w:t xml:space="preserve">testified that Todorovic asked him a single, chilling question:</w:t>
       </w:r>
       <w:r>
         <w:t xml:space="preserve"> </w:t>
@@ -7231,13 +7265,7 @@
         <w:t xml:space="preserve">“</w:t>
       </w:r>
       <w:r>
-        <w:t xml:space="preserve">Did you do</w:t>
-      </w:r>
-      <w:r>
-        <w:t xml:space="preserve"> </w:t>
-      </w:r>
-      <w:r>
-        <w:t xml:space="preserve">it?</w:t>
+        <w:t xml:space="preserve">Did you do it?</w:t>
       </w:r>
       <w:r>
         <w:t xml:space="preserve">”</w:t>
@@ -7246,13 +7274,13 @@
         <w:t xml:space="preserve"> </w:t>
       </w:r>
       <w:r>
-        <w:t xml:space="preserve">It is the question of a person waiting for confirmation that an order has</w:t>
-      </w:r>
-      <w:r>
-        <w:t xml:space="preserve"> </w:t>
-      </w:r>
-      <w:r>
-        <w:t xml:space="preserve">been carried out.</w:t>
+        <w:t xml:space="preserve">It is the question of someone waiting to hear that an instruction has been carried</w:t>
+      </w:r>
+      <w:r>
+        <w:t xml:space="preserve"> </w:t>
+      </w:r>
+      <w:r>
+        <w:t xml:space="preserve">out.</w:t>
       </w:r>
     </w:p>
     <w:p>
@@ -7260,7 +7288,7 @@
         <w:pStyle w:val="BodyText"/>
       </w:pPr>
       <w:r>
-        <w:t xml:space="preserve">Second, when police interviewed her, she eventually made an incriminating</w:t>
+        <w:t xml:space="preserve">Second, when the police interviewed her, she eventually made an incriminating</w:t>
       </w:r>
       <w:r>
         <w:t xml:space="preserve"> </w:t>
@@ -7272,31 +7300,37 @@
         <w:t xml:space="preserve"> </w:t>
       </w:r>
       <w:r>
-        <w:t xml:space="preserve">of the appeal turns on the admissibility of that statement and a second one; on</w:t>
-      </w:r>
-      <w:r>
-        <w:t xml:space="preserve"> </w:t>
-      </w:r>
-      <w:r>
-        <w:t xml:space="preserve">whether a fifteen-year-old had been properly given her rights under the Youth</w:t>
-      </w:r>
-      <w:r>
-        <w:t xml:space="preserve"> </w:t>
-      </w:r>
-      <w:r>
-        <w:t xml:space="preserve">Criminal Justice Act and whether she had been detained when she confessed. The</w:t>
-      </w:r>
-      <w:r>
-        <w:t xml:space="preserve"> </w:t>
-      </w:r>
-      <w:r>
-        <w:t xml:space="preserve">Court of Appeal worked carefully through those protections, which exist because</w:t>
-      </w:r>
-      <w:r>
-        <w:t xml:space="preserve"> </w:t>
-      </w:r>
-      <w:r>
-        <w:t xml:space="preserve">the person being questioned was a child, and upheld the trial judge’s rulings.</w:t>
+        <w:t xml:space="preserve">of the appeal, in fact, turns on the admissibility of that statement and a second</w:t>
+      </w:r>
+      <w:r>
+        <w:t xml:space="preserve"> </w:t>
+      </w:r>
+      <w:r>
+        <w:t xml:space="preserve">one, on whether a fifteen-year-old had been properly given her rights under the</w:t>
+      </w:r>
+      <w:r>
+        <w:t xml:space="preserve"> </w:t>
+      </w:r>
+      <w:r>
+        <w:t xml:space="preserve">Youth Criminal Justice Act and whether she had been detained at the moment she</w:t>
+      </w:r>
+      <w:r>
+        <w:t xml:space="preserve"> </w:t>
+      </w:r>
+      <w:r>
+        <w:t xml:space="preserve">confessed. The Court of Appeal worked carefully through those protections, which</w:t>
+      </w:r>
+      <w:r>
+        <w:t xml:space="preserve"> </w:t>
+      </w:r>
+      <w:r>
+        <w:t xml:space="preserve">exist precisely because the person under questioning was a child, and upheld the</w:t>
+      </w:r>
+      <w:r>
+        <w:t xml:space="preserve"> </w:t>
+      </w:r>
+      <w:r>
+        <w:t xml:space="preserve">trial judge’s rulings.</w:t>
       </w:r>
     </w:p>
     <w:p>
@@ -7304,37 +7338,37 @@
         <w:pStyle w:val="BodyText"/>
       </w:pPr>
       <w:r>
-        <w:t xml:space="preserve">A jury convicted Melissa Todorovic of first-degree murder. The trial judge</w:t>
-      </w:r>
-      <w:r>
-        <w:t xml:space="preserve"> </w:t>
-      </w:r>
-      <w:r>
-        <w:t xml:space="preserve">ordered that she, fifteen at the time of the offence, be sentenced as an adult:</w:t>
-      </w:r>
-      <w:r>
-        <w:t xml:space="preserve"> </w:t>
-      </w:r>
-      <w:r>
-        <w:t xml:space="preserve">life imprisonment with no parole eligibility for seven years. On appeal she</w:t>
-      </w:r>
-      <w:r>
-        <w:t xml:space="preserve"> </w:t>
-      </w:r>
-      <w:r>
-        <w:t xml:space="preserve">challenged both the conviction and the adult sentence. In February 2014, the</w:t>
-      </w:r>
-      <w:r>
-        <w:t xml:space="preserve"> </w:t>
-      </w:r>
-      <w:r>
-        <w:t xml:space="preserve">Court of Appeal dismissed both. The sentencing judge, it held, had been entitled</w:t>
-      </w:r>
-      <w:r>
-        <w:t xml:space="preserve"> </w:t>
-      </w:r>
-      <w:r>
-        <w:t xml:space="preserve">to conclude she remained dangerous; the murder had been</w:t>
+        <w:t xml:space="preserve">A jury convicted Melissa Todorovic of first-degree murder. The trial judge ordered</w:t>
+      </w:r>
+      <w:r>
+        <w:t xml:space="preserve"> </w:t>
+      </w:r>
+      <w:r>
+        <w:t xml:space="preserve">that she, fifteen at the time of the crime, be sentenced as an adult: life</w:t>
+      </w:r>
+      <w:r>
+        <w:t xml:space="preserve"> </w:t>
+      </w:r>
+      <w:r>
+        <w:t xml:space="preserve">imprisonment with no parole eligibility for seven years. She appealed both the</w:t>
+      </w:r>
+      <w:r>
+        <w:t xml:space="preserve"> </w:t>
+      </w:r>
+      <w:r>
+        <w:t xml:space="preserve">conviction and the sentence, and in February 2014 the Court of Appeal dismissed</w:t>
+      </w:r>
+      <w:r>
+        <w:t xml:space="preserve"> </w:t>
+      </w:r>
+      <w:r>
+        <w:t xml:space="preserve">both. The sentencing judge had been entitled to find she remained dangerous, the</w:t>
+      </w:r>
+      <w:r>
+        <w:t xml:space="preserve"> </w:t>
+      </w:r>
+      <w:r>
+        <w:t xml:space="preserve">court held. The murder had grown out of what it called</w:t>
       </w:r>
       <w:r>
         <w:t xml:space="preserve"> </w:t>
@@ -7343,13 +7377,13 @@
         <w:t xml:space="preserve">“</w:t>
       </w:r>
       <w:r>
-        <w:t xml:space="preserve">conceived out of the</w:t>
-      </w:r>
-      <w:r>
-        <w:t xml:space="preserve"> </w:t>
-      </w:r>
-      <w:r>
-        <w:t xml:space="preserve">appellant’s distorted view of her relationship with Bagshaw,</w:t>
+        <w:t xml:space="preserve">the appellant’s distorted</w:t>
+      </w:r>
+      <w:r>
+        <w:t xml:space="preserve"> </w:t>
+      </w:r>
+      <w:r>
+        <w:t xml:space="preserve">view of her relationship with Bagshaw.</w:t>
       </w:r>
       <w:r>
         <w:t xml:space="preserve">”</w:t>
@@ -7358,31 +7392,19 @@
         <w:t xml:space="preserve"> </w:t>
       </w:r>
       <w:r>
-        <w:t xml:space="preserve">she showed no</w:t>
-      </w:r>
-      <w:r>
-        <w:t xml:space="preserve"> </w:t>
-      </w:r>
-      <w:r>
-        <w:t xml:space="preserve">empathy for the victim, and she</w:t>
-      </w:r>
-      <w:r>
-        <w:t xml:space="preserve"> </w:t>
-      </w:r>
-      <w:r>
-        <w:t xml:space="preserve">“</w:t>
-      </w:r>
-      <w:r>
-        <w:t xml:space="preserve">harboured ongoing thoughts of hurting other</w:t>
-      </w:r>
-      <w:r>
-        <w:t xml:space="preserve"> </w:t>
-      </w:r>
-      <w:r>
-        <w:t xml:space="preserve">persons.</w:t>
-      </w:r>
-      <w:r>
-        <w:t xml:space="preserve">”</w:t>
+        <w:t xml:space="preserve">She had shown no empathy for the girl she</w:t>
+      </w:r>
+      <w:r>
+        <w:t xml:space="preserve"> </w:t>
+      </w:r>
+      <w:r>
+        <w:t xml:space="preserve">had helped kill, and she still, the record indicated, harboured thoughts of</w:t>
+      </w:r>
+      <w:r>
+        <w:t xml:space="preserve"> </w:t>
+      </w:r>
+      <w:r>
+        <w:t xml:space="preserve">hurting others.</w:t>
       </w:r>
     </w:p>
     <w:p>
@@ -7394,7 +7416,7 @@
           <w:iCs/>
           <w:i/>
         </w:rPr>
-        <w:t xml:space="preserve">(A note on sourcing: this appeal decision is concerned mainly with the</w:t>
+        <w:t xml:space="preserve">(A note on sourcing: this appeal decision is concerned chiefly with the</w:t>
       </w:r>
       <w:r>
         <w:rPr>
@@ -7422,35 +7444,35 @@
           <w:iCs/>
           <w:i/>
         </w:rPr>
-        <w:t xml:space="preserve">summarizes the messaging evidence rather than quoting it at length. The detailed</w:t>
-      </w:r>
-      <w:r>
-        <w:rPr>
-          <w:iCs/>
-          <w:i/>
-        </w:rPr>
-        <w:t xml:space="preserve"> </w:t>
-      </w:r>
-      <w:r>
-        <w:rPr>
-          <w:iCs/>
-          <w:i/>
-        </w:rPr>
-        <w:t xml:space="preserve">content of the chats, widely reported at trial, lives in the trial record; this</w:t>
-      </w:r>
-      <w:r>
-        <w:rPr>
-          <w:iCs/>
-          <w:i/>
-        </w:rPr>
-        <w:t xml:space="preserve"> </w:t>
-      </w:r>
-      <w:r>
-        <w:rPr>
-          <w:iCs/>
-          <w:i/>
-        </w:rPr>
-        <w:t xml:space="preserve">chapter stays with what the appellate judgment sets out.)</w:t>
+        <w:t xml:space="preserve">summarizes the messaging evidence rather than quoting it at length. The granular</w:t>
+      </w:r>
+      <w:r>
+        <w:rPr>
+          <w:iCs/>
+          <w:i/>
+        </w:rPr>
+        <w:t xml:space="preserve"> </w:t>
+      </w:r>
+      <w:r>
+        <w:rPr>
+          <w:iCs/>
+          <w:i/>
+        </w:rPr>
+        <w:t xml:space="preserve">content of the chats, aired at length during the trial, lives in the trial record.</w:t>
+      </w:r>
+      <w:r>
+        <w:rPr>
+          <w:iCs/>
+          <w:i/>
+        </w:rPr>
+        <w:t xml:space="preserve"> </w:t>
+      </w:r>
+      <w:r>
+        <w:rPr>
+          <w:iCs/>
+          <w:i/>
+        </w:rPr>
+        <w:t xml:space="preserve">This chapter stays within what the appellate judgment establishes.)</w:t>
       </w:r>
     </w:p>
     <w:bookmarkEnd w:id="60"/>
@@ -7468,55 +7490,67 @@
         <w:pStyle w:val="FirstParagraph"/>
       </w:pPr>
       <w:r>
-        <w:t xml:space="preserve">She was caught because counselling a murder, in the age of the instant message,</w:t>
-      </w:r>
-      <w:r>
-        <w:t xml:space="preserve"> </w:t>
-      </w:r>
-      <w:r>
-        <w:t xml:space="preserve">leaves the same kind of evidence trail as committing one. Melissa Todorovic</w:t>
-      </w:r>
-      <w:r>
-        <w:t xml:space="preserve"> </w:t>
-      </w:r>
-      <w:r>
-        <w:t xml:space="preserve">never had to be at the scene, never had to hold the weapon, never had to get</w:t>
-      </w:r>
-      <w:r>
-        <w:t xml:space="preserve"> </w:t>
-      </w:r>
-      <w:r>
-        <w:t xml:space="preserve">blood on her hands. She directed a killing through a boyfriend she could work on</w:t>
-      </w:r>
-      <w:r>
-        <w:t xml:space="preserve"> </w:t>
-      </w:r>
-      <w:r>
-        <w:t xml:space="preserve">day and night through a screen. But every push, every demand, every expression</w:t>
-      </w:r>
-      <w:r>
-        <w:t xml:space="preserve"> </w:t>
-      </w:r>
-      <w:r>
-        <w:t xml:space="preserve">of the jealousy that drove it existed as data on a device, and the law of</w:t>
-      </w:r>
-      <w:r>
-        <w:t xml:space="preserve"> </w:t>
-      </w:r>
-      <w:r>
-        <w:t xml:space="preserve">counselling murder does not require your hand on the knife; it requires proof</w:t>
-      </w:r>
-      <w:r>
-        <w:t xml:space="preserve"> </w:t>
-      </w:r>
-      <w:r>
-        <w:t xml:space="preserve">that you put it in someone else’s. The chats were that proof. In this case, the</w:t>
-      </w:r>
-      <w:r>
-        <w:t xml:space="preserve"> </w:t>
-      </w:r>
-      <w:r>
-        <w:t xml:space="preserve">messages were not evidence of the crime. They were the crime.</w:t>
+        <w:t xml:space="preserve">She was caught because, in the age of the instant message, talking someone into a</w:t>
+      </w:r>
+      <w:r>
+        <w:t xml:space="preserve"> </w:t>
+      </w:r>
+      <w:r>
+        <w:t xml:space="preserve">murder leaves the same kind of trail as committing one yourself. Melissa Todorovic</w:t>
+      </w:r>
+      <w:r>
+        <w:t xml:space="preserve"> </w:t>
+      </w:r>
+      <w:r>
+        <w:t xml:space="preserve">never had to stand in the snow. She never had to hold the knife or get a drop of</w:t>
+      </w:r>
+      <w:r>
+        <w:t xml:space="preserve"> </w:t>
+      </w:r>
+      <w:r>
+        <w:t xml:space="preserve">blood on her hands. She ran a killing at arm’s length, working on a susceptible</w:t>
+      </w:r>
+      <w:r>
+        <w:t xml:space="preserve"> </w:t>
+      </w:r>
+      <w:r>
+        <w:t xml:space="preserve">boyfriend through a keyboard, day after day, until he did the thing she wanted</w:t>
+      </w:r>
+      <w:r>
+        <w:t xml:space="preserve"> </w:t>
+      </w:r>
+      <w:r>
+        <w:t xml:space="preserve">done. But the law of counselling murder has never required your hand on the</w:t>
+      </w:r>
+      <w:r>
+        <w:t xml:space="preserve"> </w:t>
+      </w:r>
+      <w:r>
+        <w:t xml:space="preserve">weapon. It requires proof that you put the weapon in someone else’s, and Melissa</w:t>
+      </w:r>
+      <w:r>
+        <w:t xml:space="preserve"> </w:t>
+      </w:r>
+      <w:r>
+        <w:t xml:space="preserve">Todorovic had generated that proof herself, in writing, message after message,</w:t>
+      </w:r>
+      <w:r>
+        <w:t xml:space="preserve"> </w:t>
+      </w:r>
+      <w:r>
+        <w:t xml:space="preserve">plus a phone call to confirm delivery. In most of the stories in this book, the</w:t>
+      </w:r>
+      <w:r>
+        <w:t xml:space="preserve"> </w:t>
+      </w:r>
+      <w:r>
+        <w:t xml:space="preserve">digital record is the evidence of the crime. Here, the digital record very nearly</w:t>
+      </w:r>
+      <w:r>
+        <w:t xml:space="preserve"> </w:t>
+      </w:r>
+      <w:r>
+        <w:t xml:space="preserve">was the crime.</w:t>
       </w:r>
     </w:p>
     <w:p>
@@ -12130,7 +12164,7 @@
           <w:bCs/>
           <w:b/>
         </w:rPr>
-        <w:t xml:space="preserve">The RCMP built a fake criminal empire with one purpose: to make an</w:t>
+        <w:t xml:space="preserve">The police built a fake criminal empire, flew a lonely man across the country,</w:t>
       </w:r>
       <w:r>
         <w:rPr>
@@ -12144,443 +12178,288 @@
           <w:bCs/>
           <w:b/>
         </w:rPr>
-        <w:t xml:space="preserve">unemployed man from Gander confess to drowning his little girls.</w:t>
-      </w:r>
-    </w:p>
-    <w:p>
-      <w:pPr>
-        <w:pStyle w:val="BodyText"/>
-      </w:pPr>
-      <w:r>
-        <w:t xml:space="preserve">On the morning of August 4, 2002, Nelson Hart drove his three-year-old twin</w:t>
-      </w:r>
-      <w:r>
-        <w:t xml:space="preserve"> </w:t>
-      </w:r>
-      <w:r>
-        <w:t xml:space="preserve">daughters, Karen and Krista, to a park near their home in Gander,</w:t>
-      </w:r>
-      <w:r>
-        <w:t xml:space="preserve"> </w:t>
-      </w:r>
-      <w:r>
-        <w:t xml:space="preserve">Newfoundland, to play on the swings. A lake sat beside the park. Half an hour</w:t>
-      </w:r>
-      <w:r>
-        <w:t xml:space="preserve"> </w:t>
-      </w:r>
-      <w:r>
-        <w:t xml:space="preserve">to forty-five minutes later, he burst back into his house in a panic and told</w:t>
-      </w:r>
-      <w:r>
-        <w:t xml:space="preserve"> </w:t>
-      </w:r>
-      <w:r>
-        <w:t xml:space="preserve">his wife that Krista had fallen into the water.</w:t>
-      </w:r>
-    </w:p>
-    <w:p>
-      <w:pPr>
-        <w:pStyle w:val="BodyText"/>
-      </w:pPr>
-      <w:r>
-        <w:t xml:space="preserve">His wife asked the obvious, terrible question:</w:t>
-      </w:r>
-      <w:r>
-        <w:t xml:space="preserve"> </w:t>
-      </w:r>
-      <w:r>
-        <w:rPr>
-          <w:iCs/>
-          <w:i/>
-        </w:rPr>
-        <w:t xml:space="preserve">where is Karen?</w:t>
-      </w:r>
-    </w:p>
-    <w:p>
-      <w:pPr>
-        <w:pStyle w:val="BodyText"/>
-      </w:pPr>
-      <w:r>
-        <w:t xml:space="preserve">Nelson had forgotten her at the park.</w:t>
-      </w:r>
-    </w:p>
-    <w:p>
-      <w:pPr>
-        <w:pStyle w:val="BodyText"/>
-      </w:pPr>
-      <w:r>
-        <w:t xml:space="preserve">By the time first responders arrived, both girls were floating in the lake,</w:t>
-      </w:r>
-      <w:r>
-        <w:t xml:space="preserve"> </w:t>
-      </w:r>
-      <w:r>
-        <w:t xml:space="preserve">several hundred metres apart. It was too late.</w:t>
-      </w:r>
-    </w:p>
-    <w:p>
-      <w:pPr>
-        <w:pStyle w:val="BodyText"/>
-      </w:pPr>
-      <w:r>
-        <w:t xml:space="preserve">Hart’s story never sat right. He told police he couldn’t swim, so instead of</w:t>
-      </w:r>
-      <w:r>
-        <w:t xml:space="preserve"> </w:t>
-      </w:r>
-      <w:r>
-        <w:t xml:space="preserve">helping he had run to his car and driven home to get his wife, leaving one</w:t>
-      </w:r>
-      <w:r>
-        <w:t xml:space="preserve"> </w:t>
-      </w:r>
-      <w:r>
-        <w:t xml:space="preserve">daughter on the dock beside the water that was swallowing the other. There</w:t>
-      </w:r>
-      <w:r>
-        <w:t xml:space="preserve"> </w:t>
-      </w:r>
-      <w:r>
-        <w:t xml:space="preserve">were two cell phones in his car; he called no one. He drove past a restaurant</w:t>
-      </w:r>
-      <w:r>
-        <w:t xml:space="preserve"> </w:t>
-      </w:r>
-      <w:r>
-        <w:t xml:space="preserve">and a hospital; he stopped at neither. Two weeks after an eight-hour</w:t>
-      </w:r>
-      <w:r>
-        <w:t xml:space="preserve"> </w:t>
-      </w:r>
-      <w:r>
-        <w:t xml:space="preserve">interrogation went nowhere, he called police and changed his story: he’d</w:t>
-      </w:r>
-      <w:r>
-        <w:t xml:space="preserve"> </w:t>
-      </w:r>
-      <w:r>
-        <w:t xml:space="preserve">suffered an epileptic seizure at the park, come to</w:t>
-      </w:r>
-      <w:r>
-        <w:t xml:space="preserve"> </w:t>
-      </w:r>
-      <w:r>
-        <w:t xml:space="preserve">“</w:t>
-      </w:r>
-      <w:r>
-        <w:t xml:space="preserve">dopey,</w:t>
-      </w:r>
-      <w:r>
-        <w:t xml:space="preserve">”</w:t>
-      </w:r>
-      <w:r>
-        <w:t xml:space="preserve"> </w:t>
-      </w:r>
-      <w:r>
-        <w:t xml:space="preserve">seen one of his</w:t>
-      </w:r>
-      <w:r>
-        <w:t xml:space="preserve"> </w:t>
-      </w:r>
-      <w:r>
-        <w:t xml:space="preserve">girls in the water, and could think only of driving home. He said he’d lied at</w:t>
-      </w:r>
-      <w:r>
-        <w:t xml:space="preserve"> </w:t>
-      </w:r>
-      <w:r>
-        <w:t xml:space="preserve">first because he was afraid of losing his driver’s licence again.</w:t>
-      </w:r>
-    </w:p>
-    <w:p>
-      <w:pPr>
-        <w:pStyle w:val="BodyText"/>
-      </w:pPr>
-      <w:r>
-        <w:t xml:space="preserve">Police were convinced he had drowned his daughters. But conviction is not</w:t>
-      </w:r>
-      <w:r>
-        <w:t xml:space="preserve"> </w:t>
-      </w:r>
-      <w:r>
-        <w:t xml:space="preserve">evidence, and they had none. The investigation went cold.</w:t>
-      </w:r>
-    </w:p>
-    <w:p>
-      <w:pPr>
-        <w:pStyle w:val="BodyText"/>
-      </w:pPr>
-      <w:r>
-        <w:t xml:space="preserve">What they did next made Canadian legal history, twice. Once when it worked,</w:t>
-      </w:r>
-      <w:r>
-        <w:t xml:space="preserve"> </w:t>
-      </w:r>
-      <w:r>
-        <w:t xml:space="preserve">and once when the Supreme Court of Canada saw what</w:t>
-      </w:r>
-      <w:r>
-        <w:t xml:space="preserve"> </w:t>
-      </w:r>
-      <w:r>
-        <w:t xml:space="preserve">“</w:t>
-      </w:r>
-      <w:r>
-        <w:t xml:space="preserve">working</w:t>
-      </w:r>
-      <w:r>
-        <w:t xml:space="preserve">”</w:t>
-      </w:r>
-      <w:r>
-        <w:t xml:space="preserve"> </w:t>
-      </w:r>
-      <w:r>
-        <w:t xml:space="preserve">had required.</w:t>
-      </w:r>
-    </w:p>
-    <w:bookmarkStart w:id="97" w:name="building-a-world-around-a-lonely-man"/>
-    <w:p>
-      <w:pPr>
-        <w:pStyle w:val="Heading2"/>
-      </w:pPr>
-      <w:r>
-        <w:t xml:space="preserve">Building a world around a lonely man</w:t>
-      </w:r>
-    </w:p>
-    <w:p>
-      <w:pPr>
-        <w:pStyle w:val="FirstParagraph"/>
-      </w:pPr>
-      <w:r>
-        <w:t xml:space="preserve">The technique is called a</w:t>
-      </w:r>
-      <w:r>
-        <w:t xml:space="preserve"> </w:t>
-      </w:r>
-      <w:r>
-        <w:t xml:space="preserve">“</w:t>
-      </w:r>
-      <w:r>
-        <w:t xml:space="preserve">Mr. Big</w:t>
-      </w:r>
-      <w:r>
-        <w:t xml:space="preserve">”</w:t>
-      </w:r>
-      <w:r>
-        <w:t xml:space="preserve"> </w:t>
-      </w:r>
-      <w:r>
-        <w:t xml:space="preserve">operation, and it is a Canadian invention:</w:t>
-      </w:r>
-      <w:r>
-        <w:t xml:space="preserve"> </w:t>
-      </w:r>
-      <w:r>
-        <w:t xml:space="preserve">undercover officers construct a fictitious criminal organization around a</w:t>
-      </w:r>
-      <w:r>
-        <w:t xml:space="preserve"> </w:t>
-      </w:r>
-      <w:r>
-        <w:t xml:space="preserve">suspect, befriend him, employ him, enrich him, and then arrange a job</w:t>
-      </w:r>
-      <w:r>
-        <w:t xml:space="preserve"> </w:t>
-      </w:r>
-      <w:r>
-        <w:t xml:space="preserve">interview with the boss,</w:t>
-      </w:r>
-      <w:r>
-        <w:t xml:space="preserve"> </w:t>
-      </w:r>
-      <w:r>
-        <w:t xml:space="preserve">“</w:t>
-      </w:r>
-      <w:r>
-        <w:t xml:space="preserve">Mr. Big,</w:t>
-      </w:r>
-      <w:r>
-        <w:t xml:space="preserve">”</w:t>
-      </w:r>
-      <w:r>
-        <w:t xml:space="preserve"> </w:t>
-      </w:r>
-      <w:r>
-        <w:t xml:space="preserve">where the price of admission is the truth</w:t>
-      </w:r>
-      <w:r>
-        <w:t xml:space="preserve"> </w:t>
-      </w:r>
-      <w:r>
-        <w:t xml:space="preserve">about his past.</w:t>
-      </w:r>
-    </w:p>
-    <w:p>
-      <w:pPr>
-        <w:pStyle w:val="BodyText"/>
-      </w:pPr>
-      <w:r>
-        <w:t xml:space="preserve">Nelson Hart was the ideal target, which is precisely what makes his case so</w:t>
-      </w:r>
-      <w:r>
-        <w:t xml:space="preserve"> </w:t>
-      </w:r>
-      <w:r>
-        <w:t xml:space="preserve">uncomfortable. Surveillance in late 2004 found a man on social assistance and</w:t>
-      </w:r>
-      <w:r>
-        <w:t xml:space="preserve"> </w:t>
-      </w:r>
-      <w:r>
-        <w:t xml:space="preserve">profoundly isolated; he rarely left home, and when he did, his wife came</w:t>
-      </w:r>
-      <w:r>
-        <w:t xml:space="preserve"> </w:t>
-      </w:r>
-      <w:r>
-        <w:t xml:space="preserve">with him.</w:t>
-      </w:r>
-    </w:p>
-    <w:p>
-      <w:pPr>
-        <w:pStyle w:val="BodyText"/>
-      </w:pPr>
-      <w:r>
-        <w:t xml:space="preserve">In February 2005, a stranger, an undercover officer the judgment calls</w:t>
-      </w:r>
-      <w:r>
-        <w:t xml:space="preserve"> </w:t>
-      </w:r>
-      <w:r>
-        <w:t xml:space="preserve">“</w:t>
-      </w:r>
-      <w:r>
-        <w:t xml:space="preserve">Jim,</w:t>
-      </w:r>
-      <w:r>
-        <w:t xml:space="preserve">”</w:t>
-      </w:r>
-      <w:r>
-        <w:t xml:space="preserve"> </w:t>
-      </w:r>
-      <w:r>
-        <w:t xml:space="preserve">approached Hart outside a convenience store and asked for help finding his</w:t>
-      </w:r>
-      <w:r>
-        <w:t xml:space="preserve"> </w:t>
-      </w:r>
-      <w:r>
-        <w:t xml:space="preserve">missing sister. Hart obliged and was paid fifty dollars. Within days he had a</w:t>
-      </w:r>
-      <w:r>
-        <w:t xml:space="preserve"> </w:t>
-      </w:r>
-      <w:r>
-        <w:t xml:space="preserve">job as a driver for Jim’s trucking company. Within months, the fictitious</w:t>
-      </w:r>
-      <w:r>
-        <w:t xml:space="preserve"> </w:t>
-      </w:r>
-      <w:r>
-        <w:t xml:space="preserve">organization had become his entire world. Over four months, Hart took part in</w:t>
-      </w:r>
-      <w:r>
-        <w:t xml:space="preserve"> </w:t>
+        <w:t xml:space="preserve">and spent four hundred thousand dollars, all to get him to confess to drowning</w:t>
       </w:r>
       <w:r>
         <w:rPr>
           <w:bCs/>
           <w:b/>
         </w:rPr>
-        <w:t xml:space="preserve">63 staged</w:t>
+        <w:t xml:space="preserve"> </w:t>
       </w:r>
       <w:r>
         <w:rPr>
           <w:bCs/>
           <w:b/>
         </w:rPr>
-        <w:t xml:space="preserve"> </w:t>
+        <w:t xml:space="preserve">his two little girls. Then the Supreme Court asked whether any of it could be</w:t>
       </w:r>
       <w:r>
         <w:rPr>
           <w:bCs/>
           <w:b/>
         </w:rPr>
-        <w:t xml:space="preserve">“</w:t>
+        <w:t xml:space="preserve"> </w:t>
       </w:r>
       <w:r>
         <w:rPr>
           <w:bCs/>
           <w:b/>
         </w:rPr>
-        <w:t xml:space="preserve">scenarios</w:t>
-      </w:r>
-      <w:r>
-        <w:rPr>
-          <w:bCs/>
-          <w:b/>
-        </w:rPr>
+        <w:t xml:space="preserve">believed.</w:t>
+      </w:r>
+    </w:p>
+    <w:p>
+      <w:pPr>
+        <w:pStyle w:val="BodyText"/>
+      </w:pPr>
+      <w:r>
+        <w:t xml:space="preserve">Some chapters in this book end with a wink at a criminal who outsmarted himself.</w:t>
+      </w:r>
+      <w:r>
+        <w:t xml:space="preserve"> </w:t>
+      </w:r>
+      <w:r>
+        <w:t xml:space="preserve">This one does not. This one ends with a question that has no comfortable answer,</w:t>
+      </w:r>
+      <w:r>
+        <w:t xml:space="preserve"> </w:t>
+      </w:r>
+      <w:r>
+        <w:t xml:space="preserve">and that is exactly why it belongs here.</w:t>
+      </w:r>
+    </w:p>
+    <w:p>
+      <w:pPr>
+        <w:pStyle w:val="BodyText"/>
+      </w:pPr>
+      <w:r>
+        <w:t xml:space="preserve">On the morning of August 4, 2002, Nelson Hart drove his three-year-old twin</w:t>
+      </w:r>
+      <w:r>
+        <w:t xml:space="preserve"> </w:t>
+      </w:r>
+      <w:r>
+        <w:t xml:space="preserve">daughters, Karen and Krista, to a park near their home in Gander, Newfoundland,</w:t>
+      </w:r>
+      <w:r>
+        <w:t xml:space="preserve"> </w:t>
+      </w:r>
+      <w:r>
+        <w:t xml:space="preserve">to play on the swings. A lake lay beside the park. Somewhere between thirty and</w:t>
+      </w:r>
+      <w:r>
+        <w:t xml:space="preserve"> </w:t>
+      </w:r>
+      <w:r>
+        <w:t xml:space="preserve">forty-five minutes later, Hart came bursting back into his house alone, in a</w:t>
+      </w:r>
+      <w:r>
+        <w:t xml:space="preserve"> </w:t>
+      </w:r>
+      <w:r>
+        <w:t xml:space="preserve">panic, and told his wife that Krista had fallen into the water. His wife asked the</w:t>
+      </w:r>
+      <w:r>
+        <w:t xml:space="preserve"> </w:t>
+      </w:r>
+      <w:r>
+        <w:t xml:space="preserve">only question that mattered, the one that still hangs over the whole case: where</w:t>
+      </w:r>
+      <w:r>
+        <w:t xml:space="preserve"> </w:t>
+      </w:r>
+      <w:r>
+        <w:t xml:space="preserve">is Karen?</w:t>
+      </w:r>
+    </w:p>
+    <w:p>
+      <w:pPr>
+        <w:pStyle w:val="BodyText"/>
+      </w:pPr>
+      <w:r>
+        <w:t xml:space="preserve">He had left her at the park.</w:t>
+      </w:r>
+    </w:p>
+    <w:p>
+      <w:pPr>
+        <w:pStyle w:val="BodyText"/>
+      </w:pPr>
+      <w:r>
+        <w:t xml:space="preserve">By the time the first responders reached the lake, both little girls were in the</w:t>
+      </w:r>
+      <w:r>
+        <w:t xml:space="preserve"> </w:t>
+      </w:r>
+      <w:r>
+        <w:t xml:space="preserve">water, floating several hundred metres apart. There was nothing anyone could do.</w:t>
+      </w:r>
+    </w:p>
+    <w:p>
+      <w:pPr>
+        <w:pStyle w:val="BodyText"/>
+      </w:pPr>
+      <w:r>
+        <w:t xml:space="preserve">Hart’s account of that morning never held together. He told police he couldn’t</w:t>
+      </w:r>
+      <w:r>
+        <w:t xml:space="preserve"> </w:t>
+      </w:r>
+      <w:r>
+        <w:t xml:space="preserve">swim, so rather than trying to reach his drowning daughter he ran to his car and</w:t>
+      </w:r>
+      <w:r>
+        <w:t xml:space="preserve"> </w:t>
+      </w:r>
+      <w:r>
+        <w:t xml:space="preserve">drove home to fetch his wife, leaving the other child alone on the dock beside the</w:t>
+      </w:r>
+      <w:r>
+        <w:t xml:space="preserve"> </w:t>
+      </w:r>
+      <w:r>
+        <w:t xml:space="preserve">water. There were two cell phones in his car; he called no one. He passed a</w:t>
+      </w:r>
+      <w:r>
+        <w:t xml:space="preserve"> </w:t>
+      </w:r>
+      <w:r>
+        <w:t xml:space="preserve">restaurant and a hospital; he stopped at neither. Two weeks later, after an</w:t>
+      </w:r>
+      <w:r>
+        <w:t xml:space="preserve"> </w:t>
+      </w:r>
+      <w:r>
+        <w:t xml:space="preserve">eight-hour interrogation led nowhere, he changed his story, now recalling an</w:t>
+      </w:r>
+      <w:r>
+        <w:t xml:space="preserve"> </w:t>
+      </w:r>
+      <w:r>
+        <w:t xml:space="preserve">epileptic seizure at the park, a foggy return to his senses, one daughter visible</w:t>
+      </w:r>
+      <w:r>
+        <w:t xml:space="preserve"> </w:t>
+      </w:r>
+      <w:r>
+        <w:t xml:space="preserve">in the water, and a single blind instinct to drive home. He had lied at first, he</w:t>
+      </w:r>
+      <w:r>
+        <w:t xml:space="preserve"> </w:t>
+      </w:r>
+      <w:r>
+        <w:t xml:space="preserve">said, because he was afraid of losing his driver’s licence.</w:t>
+      </w:r>
+    </w:p>
+    <w:p>
+      <w:pPr>
+        <w:pStyle w:val="BodyText"/>
+      </w:pPr>
+      <w:r>
+        <w:t xml:space="preserve">The police were certain he had drowned his daughters. Certainty, though, is not</w:t>
+      </w:r>
+      <w:r>
+        <w:t xml:space="preserve"> </w:t>
+      </w:r>
+      <w:r>
+        <w:t xml:space="preserve">evidence, and evidence was the one thing they did not have. The investigation went</w:t>
+      </w:r>
+      <w:r>
+        <w:t xml:space="preserve"> </w:t>
+      </w:r>
+      <w:r>
+        <w:t xml:space="preserve">cold.</w:t>
+      </w:r>
+    </w:p>
+    <w:p>
+      <w:pPr>
+        <w:pStyle w:val="BodyText"/>
+      </w:pPr>
+      <w:r>
+        <w:t xml:space="preserve">What they did to revive it made Canadian legal history twice over. Once when it</w:t>
+      </w:r>
+      <w:r>
+        <w:t xml:space="preserve"> </w:t>
+      </w:r>
+      <w:r>
+        <w:t xml:space="preserve">appeared to work, and once when the Supreme Court of Canada looked hard at what</w:t>
+      </w:r>
+      <w:r>
+        <w:t xml:space="preserve"> </w:t>
+      </w:r>
+      <w:r>
+        <w:t xml:space="preserve">“</w:t>
+      </w:r>
+      <w:r>
+        <w:t xml:space="preserve">working</w:t>
+      </w:r>
+      <w:r>
         <w:t xml:space="preserve">”</w:t>
       </w:r>
       <w:r>
-        <w:t xml:space="preserve">, drove mysterious packages across Newfoundland,</w:t>
-      </w:r>
-      <w:r>
-        <w:t xml:space="preserve"> </w:t>
-      </w:r>
-      <w:r>
-        <w:t xml:space="preserve">travelled to Halifax, Montreal, Ottawa, Toronto, and Vancouver, stayed in</w:t>
-      </w:r>
-      <w:r>
-        <w:t xml:space="preserve"> </w:t>
-      </w:r>
-      <w:r>
-        <w:t xml:space="preserve">hotels, and ate in some of the country’s finest restaurants; one officer had</w:t>
-      </w:r>
-      <w:r>
-        <w:t xml:space="preserve"> </w:t>
-      </w:r>
-      <w:r>
-        <w:t xml:space="preserve">to teach him how to behave at dinner, because all of it was new to him. He</w:t>
-      </w:r>
-      <w:r>
-        <w:t xml:space="preserve"> </w:t>
-      </w:r>
-      <w:r>
-        <w:t xml:space="preserve">was paid $15,720. He came to call the undercover officers his best friends,</w:t>
-      </w:r>
-      <w:r>
-        <w:t xml:space="preserve"> </w:t>
-      </w:r>
-      <w:r>
-        <w:t xml:space="preserve">his</w:t>
-      </w:r>
-      <w:r>
-        <w:t xml:space="preserve"> </w:t>
-      </w:r>
-      <w:r>
-        <w:rPr>
-          <w:iCs/>
-          <w:i/>
-        </w:rPr>
-        <w:t xml:space="preserve">brothers</w:t>
-      </w:r>
-      <w:r>
-        <w:t xml:space="preserve">. The operation’s total cost to the public:</w:t>
-      </w:r>
-      <w:r>
-        <w:t xml:space="preserve"> </w:t>
-      </w:r>
-      <w:r>
-        <w:rPr>
-          <w:bCs/>
-          <w:b/>
-        </w:rPr>
-        <w:t xml:space="preserve">$413,268</w:t>
-      </w:r>
-      <w:r>
-        <w:t xml:space="preserve">.</w:t>
+        <w:t xml:space="preserve"> </w:t>
+      </w:r>
+      <w:r>
+        <w:t xml:space="preserve">had actually cost.</w:t>
+      </w:r>
+    </w:p>
+    <w:bookmarkStart w:id="97" w:name="building-a-world-around-a-lonely-man"/>
+    <w:p>
+      <w:pPr>
+        <w:pStyle w:val="Heading2"/>
+      </w:pPr>
+      <w:r>
+        <w:t xml:space="preserve">Building a world around a lonely man</w:t>
+      </w:r>
+    </w:p>
+    <w:p>
+      <w:pPr>
+        <w:pStyle w:val="FirstParagraph"/>
+      </w:pPr>
+      <w:r>
+        <w:t xml:space="preserve">The technique is called a</w:t>
+      </w:r>
+      <w:r>
+        <w:t xml:space="preserve"> </w:t>
+      </w:r>
+      <w:r>
+        <w:t xml:space="preserve">“</w:t>
+      </w:r>
+      <w:r>
+        <w:t xml:space="preserve">Mr. Big</w:t>
+      </w:r>
+      <w:r>
+        <w:t xml:space="preserve">”</w:t>
+      </w:r>
+      <w:r>
+        <w:t xml:space="preserve"> </w:t>
+      </w:r>
+      <w:r>
+        <w:t xml:space="preserve">operation, a Canadian invention in which</w:t>
+      </w:r>
+      <w:r>
+        <w:t xml:space="preserve"> </w:t>
+      </w:r>
+      <w:r>
+        <w:t xml:space="preserve">undercover officers construct an entire fictitious criminal organization around a</w:t>
+      </w:r>
+      <w:r>
+        <w:t xml:space="preserve"> </w:t>
+      </w:r>
+      <w:r>
+        <w:t xml:space="preserve">suspect, draw him in, befriend him, pay him, and finally sit him down with the</w:t>
+      </w:r>
+      <w:r>
+        <w:t xml:space="preserve"> </w:t>
+      </w:r>
+      <w:r>
+        <w:t xml:space="preserve">crime boss, where the price of admission to the family is a full and honest</w:t>
+      </w:r>
+      <w:r>
+        <w:t xml:space="preserve"> </w:t>
+      </w:r>
+      <w:r>
+        <w:t xml:space="preserve">account of his past.</w:t>
       </w:r>
     </w:p>
     <w:p>
@@ -12588,19 +12467,39 @@
         <w:pStyle w:val="BodyText"/>
       </w:pPr>
       <w:r>
-        <w:t xml:space="preserve">The organization preached trust, honesty, loyalty, and salted the sermons</w:t>
-      </w:r>
-      <w:r>
-        <w:t xml:space="preserve"> </w:t>
-      </w:r>
-      <w:r>
-        <w:t xml:space="preserve">with theatre. Officers flashed violence for his benefit; Hart watched Jim slap</w:t>
-      </w:r>
-      <w:r>
-        <w:t xml:space="preserve"> </w:t>
-      </w:r>
-      <w:r>
-        <w:t xml:space="preserve">another</w:t>
+        <w:t xml:space="preserve">Nelson Hart was, from the police perspective, an ideal candidate, and it is</w:t>
+      </w:r>
+      <w:r>
+        <w:t xml:space="preserve"> </w:t>
+      </w:r>
+      <w:r>
+        <w:t xml:space="preserve">precisely that suitability that makes the case so uneasy. Surveillance in late</w:t>
+      </w:r>
+      <w:r>
+        <w:t xml:space="preserve"> </w:t>
+      </w:r>
+      <w:r>
+        <w:t xml:space="preserve">2004 found a man living on social assistance and almost entirely alone. He rarely</w:t>
+      </w:r>
+      <w:r>
+        <w:t xml:space="preserve"> </w:t>
+      </w:r>
+      <w:r>
+        <w:t xml:space="preserve">left his home, and when he did, his wife came with him. He had, in other words,</w:t>
+      </w:r>
+      <w:r>
+        <w:t xml:space="preserve"> </w:t>
+      </w:r>
+      <w:r>
+        <w:t xml:space="preserve">nothing, which is to say he had everything to be offered.</w:t>
+      </w:r>
+    </w:p>
+    <w:p>
+      <w:pPr>
+        <w:pStyle w:val="BodyText"/>
+      </w:pPr>
+      <w:r>
+        <w:t xml:space="preserve">In February 2005 an undercover officer the judgment calls</w:t>
       </w:r>
       <w:r>
         <w:t xml:space="preserve"> </w:t>
@@ -12609,6 +12508,122 @@
         <w:t xml:space="preserve">“</w:t>
       </w:r>
       <w:r>
+        <w:t xml:space="preserve">Jim</w:t>
+      </w:r>
+      <w:r>
+        <w:t xml:space="preserve">”</w:t>
+      </w:r>
+      <w:r>
+        <w:t xml:space="preserve"> </w:t>
+      </w:r>
+      <w:r>
+        <w:t xml:space="preserve">approached Hart</w:t>
+      </w:r>
+      <w:r>
+        <w:t xml:space="preserve"> </w:t>
+      </w:r>
+      <w:r>
+        <w:t xml:space="preserve">outside a convenience store and asked for help finding his missing sister. Hart</w:t>
+      </w:r>
+      <w:r>
+        <w:t xml:space="preserve"> </w:t>
+      </w:r>
+      <w:r>
+        <w:t xml:space="preserve">obliged and was handed fifty dollars. Within days he had a job driving for Jim’s</w:t>
+      </w:r>
+      <w:r>
+        <w:t xml:space="preserve"> </w:t>
+      </w:r>
+      <w:r>
+        <w:t xml:space="preserve">supposed trucking company. Within months the fictitious organization had become</w:t>
+      </w:r>
+      <w:r>
+        <w:t xml:space="preserve"> </w:t>
+      </w:r>
+      <w:r>
+        <w:t xml:space="preserve">the whole of his life. Over four months Hart took part in sixty-three staged</w:t>
+      </w:r>
+      <w:r>
+        <w:t xml:space="preserve"> </w:t>
+      </w:r>
+      <w:r>
+        <w:t xml:space="preserve">“</w:t>
+      </w:r>
+      <w:r>
+        <w:t xml:space="preserve">scenarios,</w:t>
+      </w:r>
+      <w:r>
+        <w:t xml:space="preserve">”</w:t>
+      </w:r>
+      <w:r>
+        <w:t xml:space="preserve"> </w:t>
+      </w:r>
+      <w:r>
+        <w:t xml:space="preserve">ferried mysterious packages across Newfoundland, and travelled to</w:t>
+      </w:r>
+      <w:r>
+        <w:t xml:space="preserve"> </w:t>
+      </w:r>
+      <w:r>
+        <w:t xml:space="preserve">Halifax, Montreal, Ottawa, Toronto, and Vancouver, staying in hotels and dining</w:t>
+      </w:r>
+      <w:r>
+        <w:t xml:space="preserve"> </w:t>
+      </w:r>
+      <w:r>
+        <w:t xml:space="preserve">in some of the finest restaurants in the country, so far outside his old world</w:t>
+      </w:r>
+      <w:r>
+        <w:t xml:space="preserve"> </w:t>
+      </w:r>
+      <w:r>
+        <w:t xml:space="preserve">that an officer had to quietly teach him how to conduct himself at the table. He</w:t>
+      </w:r>
+      <w:r>
+        <w:t xml:space="preserve"> </w:t>
+      </w:r>
+      <w:r>
+        <w:t xml:space="preserve">was paid $15,720. He came to regard the undercover officers as his closest</w:t>
+      </w:r>
+      <w:r>
+        <w:t xml:space="preserve"> </w:t>
+      </w:r>
+      <w:r>
+        <w:t xml:space="preserve">friends, his brothers. The final tab for the operation, borne by the public, came</w:t>
+      </w:r>
+      <w:r>
+        <w:t xml:space="preserve"> </w:t>
+      </w:r>
+      <w:r>
+        <w:t xml:space="preserve">to $413,268, a figure worth holding in mind when the question of reliability</w:t>
+      </w:r>
+      <w:r>
+        <w:t xml:space="preserve"> </w:t>
+      </w:r>
+      <w:r>
+        <w:t xml:space="preserve">arrives, because it is a great deal of money to spend building a stage.</w:t>
+      </w:r>
+    </w:p>
+    <w:p>
+      <w:pPr>
+        <w:pStyle w:val="BodyText"/>
+      </w:pPr>
+      <w:r>
+        <w:t xml:space="preserve">The organization preached loyalty and honesty and stitched a thread of menace</w:t>
+      </w:r>
+      <w:r>
+        <w:t xml:space="preserve"> </w:t>
+      </w:r>
+      <w:r>
+        <w:t xml:space="preserve">through it all; at one point Hart watched Jim strike another</w:t>
+      </w:r>
+      <w:r>
+        <w:t xml:space="preserve"> </w:t>
+      </w:r>
+      <w:r>
+        <w:t xml:space="preserve">“</w:t>
+      </w:r>
+      <w:r>
         <w:t xml:space="preserve">member</w:t>
       </w:r>
       <w:r>
@@ -12618,49 +12633,37 @@
         <w:t xml:space="preserve"> </w:t>
       </w:r>
       <w:r>
-        <w:t xml:space="preserve">for talking out of turn. Then came the hook: a</w:t>
-      </w:r>
-      <w:r>
-        <w:t xml:space="preserve"> </w:t>
-      </w:r>
-      <w:r>
-        <w:t xml:space="preserve">“</w:t>
-      </w:r>
-      <w:r>
-        <w:t xml:space="preserve">big deal</w:t>
-      </w:r>
-      <w:r>
-        <w:t xml:space="preserve">”</w:t>
-      </w:r>
-      <w:r>
-        <w:t xml:space="preserve"> </w:t>
-      </w:r>
-      <w:r>
-        <w:t xml:space="preserve">was</w:t>
-      </w:r>
-      <w:r>
-        <w:t xml:space="preserve"> </w:t>
-      </w:r>
-      <w:r>
-        <w:t xml:space="preserve">coming, worth $20,000 to $25,000 to Hart personally. In Toronto they let him</w:t>
-      </w:r>
-      <w:r>
-        <w:t xml:space="preserve"> </w:t>
-      </w:r>
-      <w:r>
-        <w:t xml:space="preserve">count $175,000 in cash, a down payment on his future. There was just one</w:t>
-      </w:r>
-      <w:r>
-        <w:t xml:space="preserve"> </w:t>
-      </w:r>
-      <w:r>
-        <w:t xml:space="preserve">problem, Jim confided in early June: the boss had run a background check, and</w:t>
-      </w:r>
-      <w:r>
-        <w:t xml:space="preserve"> </w:t>
-      </w:r>
-      <w:r>
-        <w:t xml:space="preserve">something had come up. Hart couldn’t work until it was resolved.</w:t>
+        <w:t xml:space="preserve">for</w:t>
+      </w:r>
+      <w:r>
+        <w:t xml:space="preserve"> </w:t>
+      </w:r>
+      <w:r>
+        <w:t xml:space="preserve">loose talk. Then came the lure. A big score was coming, worth twenty to</w:t>
+      </w:r>
+      <w:r>
+        <w:t xml:space="preserve"> </w:t>
+      </w:r>
+      <w:r>
+        <w:t xml:space="preserve">twenty-five thousand dollars to Hart himself. In Toronto they let him hold and</w:t>
+      </w:r>
+      <w:r>
+        <w:t xml:space="preserve"> </w:t>
+      </w:r>
+      <w:r>
+        <w:t xml:space="preserve">count $175,000 in cash, a taste of the future on offer. But there was a snag, Jim</w:t>
+      </w:r>
+      <w:r>
+        <w:t xml:space="preserve"> </w:t>
+      </w:r>
+      <w:r>
+        <w:t xml:space="preserve">confided in early June: the boss had run a background check and turned up a</w:t>
+      </w:r>
+      <w:r>
+        <w:t xml:space="preserve"> </w:t>
+      </w:r>
+      <w:r>
+        <w:t xml:space="preserve">problem, and Hart could not advance until it was resolved.</w:t>
       </w:r>
     </w:p>
     <w:bookmarkEnd w:id="97"/>
@@ -12678,19 +12681,19 @@
         <w:pStyle w:val="FirstParagraph"/>
       </w:pPr>
       <w:r>
-        <w:t xml:space="preserve">On June 9, 2005, Nelson Hart finally met Mr. Big. He began by thanking him;</w:t>
-      </w:r>
-      <w:r>
-        <w:t xml:space="preserve"> </w:t>
-      </w:r>
-      <w:r>
-        <w:t xml:space="preserve">his life had turned around since joining the organization. Mr. Big steered the</w:t>
-      </w:r>
-      <w:r>
-        <w:t xml:space="preserve"> </w:t>
-      </w:r>
-      <w:r>
-        <w:t xml:space="preserve">conversation to the deaths of Hart’s daughters. There might be</w:t>
+        <w:t xml:space="preserve">On June 9, 2005, Nelson Hart finally met Mr. Big. He opened by thanking him,</w:t>
+      </w:r>
+      <w:r>
+        <w:t xml:space="preserve"> </w:t>
+      </w:r>
+      <w:r>
+        <w:t xml:space="preserve">telling the boss his life had turned around since he’d joined. Mr. Big turned the</w:t>
+      </w:r>
+      <w:r>
+        <w:t xml:space="preserve"> </w:t>
+      </w:r>
+      <w:r>
+        <w:t xml:space="preserve">conversation to the deaths of Hart’s daughters, warned that</w:t>
       </w:r>
       <w:r>
         <w:t xml:space="preserve"> </w:t>
@@ -12708,23 +12711,13 @@
         <w:t xml:space="preserve"> </w:t>
       </w:r>
       <w:r>
-        <w:t xml:space="preserve">coming,</w:t>
-      </w:r>
-      <w:r>
-        <w:t xml:space="preserve"> </w:t>
-      </w:r>
-      <w:r>
-        <w:t xml:space="preserve">he said.</w:t>
-      </w:r>
-      <w:r>
-        <w:t xml:space="preserve"> </w:t>
-      </w:r>
-      <w:r>
-        <w:rPr>
-          <w:iCs/>
-          <w:i/>
-        </w:rPr>
-        <w:t xml:space="preserve">Why did you kill them?</w:t>
+        <w:t xml:space="preserve">might be</w:t>
+      </w:r>
+      <w:r>
+        <w:t xml:space="preserve"> </w:t>
+      </w:r>
+      <w:r>
+        <w:t xml:space="preserve">coming, and asked him, directly, why he had killed them.</w:t>
       </w:r>
     </w:p>
     <w:p>
@@ -12732,37 +12725,37 @@
         <w:pStyle w:val="BodyText"/>
       </w:pPr>
       <w:r>
-        <w:t xml:space="preserve">Hart gave the same answer he’d given the real police three years earlier: he</w:t>
-      </w:r>
-      <w:r>
-        <w:t xml:space="preserve"> </w:t>
-      </w:r>
-      <w:r>
-        <w:t xml:space="preserve">had suffered a seizure. Mr. Big brushed it aside and told him not to lie.</w:t>
-      </w:r>
-      <w:r>
-        <w:t xml:space="preserve"> </w:t>
-      </w:r>
-      <w:r>
-        <w:t xml:space="preserve">After further prodding, Hart confessed: he had killed the girls because he</w:t>
-      </w:r>
-      <w:r>
-        <w:t xml:space="preserve"> </w:t>
-      </w:r>
-      <w:r>
-        <w:t xml:space="preserve">feared Child Welfare would take them and place them with his brother. Pressed</w:t>
-      </w:r>
-      <w:r>
-        <w:t xml:space="preserve"> </w:t>
-      </w:r>
-      <w:r>
-        <w:t xml:space="preserve">for the mechanics, he said he had struck his daughters with his shoulder and</w:t>
-      </w:r>
-      <w:r>
-        <w:t xml:space="preserve"> </w:t>
-      </w:r>
-      <w:r>
-        <w:t xml:space="preserve">they fell from the wharf into the water.</w:t>
+        <w:t xml:space="preserve">Hart gave the same answer he had given the real police three years earlier: a</w:t>
+      </w:r>
+      <w:r>
+        <w:t xml:space="preserve"> </w:t>
+      </w:r>
+      <w:r>
+        <w:t xml:space="preserve">seizure, an accident. Mr. Big waved it away and told him not to lie. And after</w:t>
+      </w:r>
+      <w:r>
+        <w:t xml:space="preserve"> </w:t>
+      </w:r>
+      <w:r>
+        <w:t xml:space="preserve">more prodding, Hart confessed. He had killed the girls, he said, because he feared</w:t>
+      </w:r>
+      <w:r>
+        <w:t xml:space="preserve"> </w:t>
+      </w:r>
+      <w:r>
+        <w:t xml:space="preserve">Child Welfare was going to take them and hand them to his brother. Asked how, he</w:t>
+      </w:r>
+      <w:r>
+        <w:t xml:space="preserve"> </w:t>
+      </w:r>
+      <w:r>
+        <w:t xml:space="preserve">said he had struck his daughters with his shoulder and knocked them from the wharf</w:t>
+      </w:r>
+      <w:r>
+        <w:t xml:space="preserve"> </w:t>
+      </w:r>
+      <w:r>
+        <w:t xml:space="preserve">into the water.</w:t>
       </w:r>
     </w:p>
     <w:p>
@@ -12770,13 +12763,13 @@
         <w:pStyle w:val="BodyText"/>
       </w:pPr>
       <w:r>
-        <w:t xml:space="preserve">Two days later, Jim drove Hart back to the park where Karen and Krista died</w:t>
-      </w:r>
-      <w:r>
-        <w:t xml:space="preserve"> </w:t>
-      </w:r>
-      <w:r>
-        <w:t xml:space="preserve">and had him walk it through. Jim knelt on the dock, and Hart demonstrated,</w:t>
+        <w:t xml:space="preserve">Two days later, Jim drove Hart back to the park where Karen and Krista had died</w:t>
+      </w:r>
+      <w:r>
+        <w:t xml:space="preserve"> </w:t>
+      </w:r>
+      <w:r>
+        <w:t xml:space="preserve">and asked him to walk through it. Jim knelt on the dock, and Hart demonstrated,</w:t>
       </w:r>
       <w:r>
         <w:t xml:space="preserve"> </w:t>
@@ -12790,19 +12783,19 @@
         <w:pStyle w:val="BodyText"/>
       </w:pPr>
       <w:r>
-        <w:t xml:space="preserve">Hart was arrested on June 13 and charged with two counts of first-degree</w:t>
-      </w:r>
-      <w:r>
-        <w:t xml:space="preserve"> </w:t>
-      </w:r>
-      <w:r>
-        <w:t xml:space="preserve">murder. Allowed one phone call from the station, he used it to call for help;</w:t>
-      </w:r>
-      <w:r>
-        <w:t xml:space="preserve"> </w:t>
-      </w:r>
-      <w:r>
-        <w:t xml:space="preserve">from Jim.</w:t>
+        <w:t xml:space="preserve">Hart was arrested on June 13 and charged with two counts of first-degree murder.</w:t>
+      </w:r>
+      <w:r>
+        <w:t xml:space="preserve"> </w:t>
+      </w:r>
+      <w:r>
+        <w:t xml:space="preserve">Given a single phone call from the station, he used it to call for help. He called</w:t>
+      </w:r>
+      <w:r>
+        <w:t xml:space="preserve"> </w:t>
+      </w:r>
+      <w:r>
+        <w:t xml:space="preserve">Jim.</w:t>
       </w:r>
     </w:p>
     <w:bookmarkEnd w:id="98"/>
@@ -12820,7 +12813,7 @@
         <w:pStyle w:val="FirstParagraph"/>
       </w:pPr>
       <w:r>
-        <w:t xml:space="preserve">A jury convicted Hart on the strength of his confessions. But in 2014 the</w:t>
+        <w:t xml:space="preserve">A jury convicted Hart on the strength of those confessions. But in 2014 the</w:t>
       </w:r>
       <w:r>
         <w:t xml:space="preserve"> </w:t>
@@ -12832,7 +12825,7 @@
         <w:t xml:space="preserve"> </w:t>
       </w:r>
       <w:r>
-        <w:t xml:space="preserve">trial, and rebuilt the law around it.</w:t>
+        <w:t xml:space="preserve">trial, and to rebuild the law around it.</w:t>
       </w:r>
     </w:p>
     <w:p>
@@ -12840,49 +12833,49 @@
         <w:pStyle w:val="BodyText"/>
       </w:pPr>
       <w:r>
-        <w:t xml:space="preserve">The Court’s concern was not squeamishness; it was reliability. Consider what</w:t>
-      </w:r>
-      <w:r>
-        <w:t xml:space="preserve"> </w:t>
-      </w:r>
-      <w:r>
-        <w:t xml:space="preserve">the confession was worth. The operation had lifted a man out of poverty,</w:t>
-      </w:r>
-      <w:r>
-        <w:t xml:space="preserve"> </w:t>
-      </w:r>
-      <w:r>
-        <w:t xml:space="preserve">handed him friendship for the first time in his life, dangled a $25,000</w:t>
-      </w:r>
-      <w:r>
-        <w:t xml:space="preserve"> </w:t>
-      </w:r>
-      <w:r>
-        <w:t xml:space="preserve">payday, and then made one thing unmistakably clear: the path to keeping all of</w:t>
-      </w:r>
-      <w:r>
-        <w:t xml:space="preserve"> </w:t>
-      </w:r>
-      <w:r>
-        <w:t xml:space="preserve">it ran through telling Mr. Big what he wanted to hear. A confession bought at</w:t>
-      </w:r>
-      <w:r>
-        <w:t xml:space="preserve"> </w:t>
-      </w:r>
-      <w:r>
-        <w:t xml:space="preserve">that price, the Court held, may be worth exactly what was paid for it; and</w:t>
-      </w:r>
-      <w:r>
-        <w:t xml:space="preserve"> </w:t>
-      </w:r>
-      <w:r>
-        <w:t xml:space="preserve">juries, hearing months of a defendant playacting as a willing criminal, may</w:t>
-      </w:r>
-      <w:r>
-        <w:t xml:space="preserve"> </w:t>
-      </w:r>
-      <w:r>
-        <w:t xml:space="preserve">convict the character instead of weighing the evidence.</w:t>
+        <w:t xml:space="preserve">The Court’s worry was not delicacy. It was reliability, and the arithmetic of the</w:t>
+      </w:r>
+      <w:r>
+        <w:t xml:space="preserve"> </w:t>
+      </w:r>
+      <w:r>
+        <w:t xml:space="preserve">operation lays the worry bare. The sting had lifted a destitute, isolated man out</w:t>
+      </w:r>
+      <w:r>
+        <w:t xml:space="preserve"> </w:t>
+      </w:r>
+      <w:r>
+        <w:t xml:space="preserve">of poverty, given him the first real friends of his life, dangled a</w:t>
+      </w:r>
+      <w:r>
+        <w:t xml:space="preserve"> </w:t>
+      </w:r>
+      <w:r>
+        <w:t xml:space="preserve">twenty-five-thousand-dollar payday, and then made one thing unmistakable: the road</w:t>
+      </w:r>
+      <w:r>
+        <w:t xml:space="preserve"> </w:t>
+      </w:r>
+      <w:r>
+        <w:t xml:space="preserve">to keeping all of it ran directly through telling Mr. Big what Mr. Big wanted to</w:t>
+      </w:r>
+      <w:r>
+        <w:t xml:space="preserve"> </w:t>
+      </w:r>
+      <w:r>
+        <w:t xml:space="preserve">hear. A confession purchased on those terms, the Court held, may be worth no more</w:t>
+      </w:r>
+      <w:r>
+        <w:t xml:space="preserve"> </w:t>
+      </w:r>
+      <w:r>
+        <w:t xml:space="preserve">than what was paid for it, and a jury that has watched months of a man playacting</w:t>
+      </w:r>
+      <w:r>
+        <w:t xml:space="preserve"> </w:t>
+      </w:r>
+      <w:r>
+        <w:t xml:space="preserve">as a gangster may end up convicting the character rather than weighing the proof.</w:t>
       </w:r>
     </w:p>
     <w:p>
@@ -12890,56 +12883,43 @@
         <w:pStyle w:val="BodyText"/>
       </w:pPr>
       <w:r>
-        <w:t xml:space="preserve">So the Court laid down a new rule: Mr. Big confessions are now</w:t>
-      </w:r>
-      <w:r>
-        <w:t xml:space="preserve"> </w:t>
-      </w:r>
-      <w:r>
-        <w:rPr>
-          <w:bCs/>
-          <w:b/>
-        </w:rPr>
-        <w:t xml:space="preserve">presumptively inadmissible</w:t>
-      </w:r>
-      <w:r>
-        <w:t xml:space="preserve">. The Crown must prove the confession’s</w:t>
-      </w:r>
-      <w:r>
-        <w:t xml:space="preserve"> </w:t>
-      </w:r>
-      <w:r>
-        <w:t xml:space="preserve">probative value outweighs its prejudicial effect, with reliability measured</w:t>
-      </w:r>
-      <w:r>
-        <w:t xml:space="preserve"> </w:t>
-      </w:r>
-      <w:r>
-        <w:t xml:space="preserve">against the inducements applied and, crucially, against whether the confession</w:t>
-      </w:r>
-      <w:r>
-        <w:t xml:space="preserve"> </w:t>
-      </w:r>
-      <w:r>
-        <w:t xml:space="preserve">produced anything the police could check: a body, a weapon, a detail only the</w:t>
-      </w:r>
-      <w:r>
-        <w:t xml:space="preserve"> </w:t>
-      </w:r>
-      <w:r>
-        <w:t xml:space="preserve">killer could know. Behind that sits a second guard: the abuse-of-process</w:t>
-      </w:r>
-      <w:r>
-        <w:t xml:space="preserve"> </w:t>
-      </w:r>
-      <w:r>
-        <w:t xml:space="preserve">doctrine, for operations that overcome the will through violence or its</w:t>
-      </w:r>
-      <w:r>
-        <w:t xml:space="preserve"> </w:t>
-      </w:r>
-      <w:r>
-        <w:t xml:space="preserve">threat.</w:t>
+        <w:t xml:space="preserve">So the Court laid down a new rule. Mr. Big confessions are now presumptively</w:t>
+      </w:r>
+      <w:r>
+        <w:t xml:space="preserve"> </w:t>
+      </w:r>
+      <w:r>
+        <w:t xml:space="preserve">inadmissible. The Crown must show the confession’s probative value outweighs its</w:t>
+      </w:r>
+      <w:r>
+        <w:t xml:space="preserve"> </w:t>
+      </w:r>
+      <w:r>
+        <w:t xml:space="preserve">prejudicial effect, with reliability measured against the inducements offered and,</w:t>
+      </w:r>
+      <w:r>
+        <w:t xml:space="preserve"> </w:t>
+      </w:r>
+      <w:r>
+        <w:t xml:space="preserve">above all, against whether the confession produced anything that could actually be</w:t>
+      </w:r>
+      <w:r>
+        <w:t xml:space="preserve"> </w:t>
+      </w:r>
+      <w:r>
+        <w:t xml:space="preserve">checked, a body, a weapon, a fact only the killer could know. Behind that stands a</w:t>
+      </w:r>
+      <w:r>
+        <w:t xml:space="preserve"> </w:t>
+      </w:r>
+      <w:r>
+        <w:t xml:space="preserve">second guard, the abuse-of-process doctrine, for operations that overwhelm the</w:t>
+      </w:r>
+      <w:r>
+        <w:t xml:space="preserve"> </w:t>
+      </w:r>
+      <w:r>
+        <w:t xml:space="preserve">will through violence or threat.</w:t>
       </w:r>
     </w:p>
     <w:p>
@@ -12947,19 +12927,19 @@
         <w:pStyle w:val="BodyText"/>
       </w:pPr>
       <w:r>
-        <w:t xml:space="preserve">Measured against its own new standard, Hart’s confessions failed. They were</w:t>
-      </w:r>
-      <w:r>
-        <w:t xml:space="preserve"> </w:t>
-      </w:r>
-      <w:r>
-        <w:t xml:space="preserve">born of powerful inducements, contradicted in parts, and, unlike the</w:t>
-      </w:r>
-      <w:r>
-        <w:t xml:space="preserve"> </w:t>
-      </w:r>
-      <w:r>
-        <w:t xml:space="preserve">confession in the companion case</w:t>
+        <w:t xml:space="preserve">Measured against its own new standard, Hart’s confessions failed. They had been</w:t>
+      </w:r>
+      <w:r>
+        <w:t xml:space="preserve"> </w:t>
+      </w:r>
+      <w:r>
+        <w:t xml:space="preserve">bought with powerful inducements, they contradicted themselves in places, and,</w:t>
+      </w:r>
+      <w:r>
+        <w:t xml:space="preserve"> </w:t>
+      </w:r>
+      <w:r>
+        <w:t xml:space="preserve">unlike the confession in the companion case</w:t>
       </w:r>
       <w:r>
         <w:t xml:space="preserve"> </w:t>
@@ -12975,65 +12955,65 @@
         <w:t xml:space="preserve"> </w:t>
       </w:r>
       <w:r>
-        <w:t xml:space="preserve">(Chapter 32), where the suspect</w:t>
-      </w:r>
-      <w:r>
-        <w:t xml:space="preserve"> </w:t>
-      </w:r>
-      <w:r>
-        <w:t xml:space="preserve">led the fake gangsters to the real remains, they were confirmed by nothing.</w:t>
-      </w:r>
-      <w:r>
-        <w:t xml:space="preserve"> </w:t>
-      </w:r>
-      <w:r>
-        <w:t xml:space="preserve">The appeal was dismissed and the confessions were gone. Stripped of them, the</w:t>
-      </w:r>
-      <w:r>
-        <w:t xml:space="preserve"> </w:t>
-      </w:r>
-      <w:r>
-        <w:t xml:space="preserve">Crown’s case evaporated; reports at the time record that the charges were</w:t>
-      </w:r>
-      <w:r>
-        <w:t xml:space="preserve"> </w:t>
-      </w:r>
-      <w:r>
-        <w:t xml:space="preserve">eventually withdrawn and Hart went free.</w:t>
-      </w:r>
-      <w:r>
-        <w:t xml:space="preserve"> </w:t>
-      </w:r>
-      <w:r>
-        <w:rPr>
-          <w:iCs/>
-          <w:i/>
-        </w:rPr>
-        <w:t xml:space="preserve">(That coda comes from news coverage,</w:t>
-      </w:r>
-      <w:r>
-        <w:rPr>
-          <w:iCs/>
-          <w:i/>
-        </w:rPr>
-        <w:t xml:space="preserve"> </w:t>
-      </w:r>
-      <w:r>
-        <w:rPr>
-          <w:iCs/>
-          <w:i/>
-        </w:rPr>
-        <w:t xml:space="preserve">not the judgment itself.)</w:t>
+        <w:t xml:space="preserve">(Chapter 32), where the</w:t>
+      </w:r>
+      <w:r>
+        <w:t xml:space="preserve"> </w:t>
+      </w:r>
+      <w:r>
+        <w:t xml:space="preserve">suspect led the fake gangsters to real human remains, they were confirmed by</w:t>
+      </w:r>
+      <w:r>
+        <w:t xml:space="preserve"> </w:t>
+      </w:r>
+      <w:r>
+        <w:t xml:space="preserve">nothing at all. The appeal was dismissed and the confessions were excluded. With</w:t>
+      </w:r>
+      <w:r>
+        <w:t xml:space="preserve"> </w:t>
+      </w:r>
+      <w:r>
+        <w:t xml:space="preserve">them gone, the Crown’s case fell away; reporting at the time indicates the charges</w:t>
+      </w:r>
+      <w:r>
+        <w:t xml:space="preserve"> </w:t>
+      </w:r>
+      <w:r>
+        <w:t xml:space="preserve">were eventually withdrawn and Hart walked free.</w:t>
+      </w:r>
+      <w:r>
+        <w:t xml:space="preserve"> </w:t>
+      </w:r>
+      <w:r>
+        <w:rPr>
+          <w:iCs/>
+          <w:i/>
+        </w:rPr>
+        <w:t xml:space="preserve">(That final coda comes from news</w:t>
+      </w:r>
+      <w:r>
+        <w:rPr>
+          <w:iCs/>
+          <w:i/>
+        </w:rPr>
+        <w:t xml:space="preserve"> </w:t>
+      </w:r>
+      <w:r>
+        <w:rPr>
+          <w:iCs/>
+          <w:i/>
+        </w:rPr>
+        <w:t xml:space="preserve">coverage, not from the judgment itself.)</w:t>
       </w:r>
     </w:p>
     <w:bookmarkEnd w:id="99"/>
-    <w:bookmarkStart w:id="102" w:name="Xf808c007911591a3eb186bf77ea5c3c4ee8db56"/>
+    <w:bookmarkStart w:id="102" w:name="X0b0d763d0f87680e133776c3e680ec0e163f6c9"/>
     <w:p>
       <w:pPr>
         <w:pStyle w:val="Heading2"/>
       </w:pPr>
       <w:r>
-        <w:t xml:space="preserve">How’d he get caught? And the harder question</w:t>
+        <w:t xml:space="preserve">How’d he get caught, and should he have been?</w:t>
       </w:r>
     </w:p>
     <w:p>
@@ -13041,25 +13021,25 @@
         <w:pStyle w:val="FirstParagraph"/>
       </w:pPr>
       <w:r>
-        <w:t xml:space="preserve">He was caught the way a fish is caught: by constructing an entire ocean around</w:t>
-      </w:r>
-      <w:r>
-        <w:t xml:space="preserve"> </w:t>
-      </w:r>
-      <w:r>
-        <w:t xml:space="preserve">him. The confession was real, spoken from his own mouth, re-enacted on the</w:t>
-      </w:r>
-      <w:r>
-        <w:t xml:space="preserve"> </w:t>
-      </w:r>
-      <w:r>
-        <w:t xml:space="preserve">dock where his daughters died. What the Supreme Court forces us to ask is</w:t>
-      </w:r>
-      <w:r>
-        <w:t xml:space="preserve"> </w:t>
-      </w:r>
-      <w:r>
-        <w:t xml:space="preserve">whether it was</w:t>
+        <w:t xml:space="preserve">He was caught the way a fish is caught, by the patient construction of an entire</w:t>
+      </w:r>
+      <w:r>
+        <w:t xml:space="preserve"> </w:t>
+      </w:r>
+      <w:r>
+        <w:t xml:space="preserve">ocean around him. The confession was real in the narrow sense that the words came</w:t>
+      </w:r>
+      <w:r>
+        <w:t xml:space="preserve"> </w:t>
+      </w:r>
+      <w:r>
+        <w:t xml:space="preserve">out of his own mouth, on the very dock where his daughters had died. What the</w:t>
+      </w:r>
+      <w:r>
+        <w:t xml:space="preserve"> </w:t>
+      </w:r>
+      <w:r>
+        <w:t xml:space="preserve">Supreme Court forces every reader to confront is whether the words were</w:t>
       </w:r>
       <w:r>
         <w:t xml:space="preserve"> </w:t>
@@ -13072,41 +13052,31 @@
         <w:t xml:space="preserve">true</w:t>
       </w:r>
       <w:r>
-        <w:t xml:space="preserve">, or whether a poor, isolated, epileptic man said the</w:t>
-      </w:r>
-      <w:r>
-        <w:t xml:space="preserve"> </w:t>
-      </w:r>
-      <w:r>
-        <w:t xml:space="preserve">only words that would keep the first family he’d ever had from leaving him.</w:t>
-      </w:r>
-      <w:r>
-        <w:t xml:space="preserve"> </w:t>
-      </w:r>
-      <w:r>
-        <w:t xml:space="preserve">This chapter has no tidy payoff line, and that is the point. Every other story</w:t>
-      </w:r>
-      <w:r>
-        <w:t xml:space="preserve"> </w:t>
-      </w:r>
-      <w:r>
-        <w:t xml:space="preserve">in this book asks how they got caught.</w:t>
-      </w:r>
-      <w:r>
-        <w:t xml:space="preserve"> </w:t>
-      </w:r>
-      <w:r>
-        <w:rPr>
-          <w:iCs/>
-          <w:i/>
-        </w:rPr>
-        <w:t xml:space="preserve">Hart</w:t>
-      </w:r>
-      <w:r>
-        <w:t xml:space="preserve"> </w:t>
-      </w:r>
-      <w:r>
-        <w:t xml:space="preserve">asks what</w:t>
+        <w:t xml:space="preserve">, or</w:t>
+      </w:r>
+      <w:r>
+        <w:t xml:space="preserve"> </w:t>
+      </w:r>
+      <w:r>
+        <w:t xml:space="preserve">whether a poor, isolated, epileptic man simply said the only thing that would keep</w:t>
+      </w:r>
+      <w:r>
+        <w:t xml:space="preserve"> </w:t>
+      </w:r>
+      <w:r>
+        <w:t xml:space="preserve">the first family he had ever known from casting him out. This is the one chapter</w:t>
+      </w:r>
+      <w:r>
+        <w:t xml:space="preserve"> </w:t>
+      </w:r>
+      <w:r>
+        <w:t xml:space="preserve">in the book with no clean ending and no tidy lesson, and that is the point. Every</w:t>
+      </w:r>
+      <w:r>
+        <w:t xml:space="preserve"> </w:t>
+      </w:r>
+      <w:r>
+        <w:t xml:space="preserve">other story here asks how the killer got caught. Nelson Hart’s asks what</w:t>
       </w:r>
       <w:r>
         <w:t xml:space="preserve"> </w:t>
@@ -13124,25 +13094,19 @@
         <w:t xml:space="preserve"> </w:t>
       </w:r>
       <w:r>
-        <w:t xml:space="preserve">is worth when</w:t>
-      </w:r>
-      <w:r>
-        <w:t xml:space="preserve"> </w:t>
-      </w:r>
-      <w:r>
-        <w:t xml:space="preserve">the state manufactures the world in which the confession happens, and it is</w:t>
-      </w:r>
-      <w:r>
-        <w:t xml:space="preserve"> </w:t>
-      </w:r>
-      <w:r>
-        <w:t xml:space="preserve">the reason every Mr. Big confession in Canada now has to pass through the</w:t>
-      </w:r>
-      <w:r>
-        <w:t xml:space="preserve"> </w:t>
-      </w:r>
-      <w:r>
-        <w:t xml:space="preserve">gate this case built.</w:t>
+        <w:t xml:space="preserve">is even worth when the state builds, at a cost of four hundred thousand dollars,</w:t>
+      </w:r>
+      <w:r>
+        <w:t xml:space="preserve"> </w:t>
+      </w:r>
+      <w:r>
+        <w:t xml:space="preserve">the entire world in which the confession is spoken. It is the reason every Mr. Big</w:t>
+      </w:r>
+      <w:r>
+        <w:t xml:space="preserve"> </w:t>
+      </w:r>
+      <w:r>
+        <w:t xml:space="preserve">confession in Canada must now pass through the gate this case built.</w:t>
       </w:r>
     </w:p>
     <w:p>
@@ -13229,13 +13193,13 @@
         <w:t xml:space="preserve"> </w:t>
       </w:r>
       <w:r>
-        <w:t xml:space="preserve">The facts and the Mr. Big operation are set out at paras. 15–39; the new</w:t>
-      </w:r>
-      <w:r>
-        <w:t xml:space="preserve"> </w:t>
-      </w:r>
-      <w:r>
-        <w:t xml:space="preserve">two-pronged framework at paras. 84–128; its application to Hart’s</w:t>
+        <w:t xml:space="preserve">The facts and the Mr. Big operation are set out at paras. 15-39; the new</w:t>
+      </w:r>
+      <w:r>
+        <w:t xml:space="preserve"> </w:t>
+      </w:r>
+      <w:r>
+        <w:t xml:space="preserve">two-pronged framework at paras. 84-128; its application to Hart’s</w:t>
       </w:r>
       <w:r>
         <w:t xml:space="preserve"> </w:t>

</xml_diff>

<commit_message>
Draft Lobato (40); Part VIII near-complete (only Truscott remains)
- ch40 'The Flies That Never Came': Kirstin Lobato, convicted 170 miles
  from the murder on a forging jailhouse informant's word. Anchored
  honestly on the 2004 opinion's ACTUAL holding (informant-impeachment
  reversal); the famous blow-fly entomology and the exoneration are the
  case's later history, carried in-chapter with clear flagging.
- PDF archived; em-dash-free; master now 19 chapters

Co-Authored-By: Claude Opus 4.8 <noreply@anthropic.com>
Claude-Session: https://claude.ai/code/session_016HAHAXcMmaZghEz1kJrDWU
</commit_message>
<xml_diff>
--- a/book/word/How Not to Get Away With Murder - Master.docx
+++ b/book/word/How Not to Get Away With Murder - Master.docx
@@ -3160,10 +3160,53 @@
         <w:t xml:space="preserve">Lobato v. State</w:t>
       </w:r>
       <w:r>
-        <w:t xml:space="preserve"> </w:t>
-      </w:r>
-      <w:r>
-        <w:t xml:space="preserve">(Nev., 2004) 🔶 - entomology clears the innocent</w:t>
+        <w:t xml:space="preserve">, 120 Nev. 512 (2004) ✍️</w:t>
+      </w:r>
+      <w:r>
+        <w:t xml:space="preserve"> </w:t>
+      </w:r>
+      <w:r>
+        <w:rPr>
+          <w:iCs/>
+          <w:i/>
+        </w:rPr>
+        <w:t xml:space="preserve">drafted</w:t>
+      </w:r>
+      <w:r>
+        <w:t xml:space="preserve"> </w:t>
+      </w:r>
+      <w:r>
+        <w:t xml:space="preserve">🔶</w:t>
+      </w:r>
+      <w:r>
+        <w:t xml:space="preserve"> </w:t>
+      </w:r>
+      <w:r>
+        <w:rPr>
+          <w:iCs/>
+          <w:i/>
+        </w:rPr>
+        <w:t xml:space="preserve">Hook:</w:t>
+      </w:r>
+      <w:r>
+        <w:t xml:space="preserve"> </w:t>
+      </w:r>
+      <w:r>
+        <w:rPr>
+          <w:bCs/>
+          <w:b/>
+        </w:rPr>
+        <w:t xml:space="preserve">She was convicted of a murder that happened 170 miles from where she was, on the word of a jailhouse informant who forged letters to con her own sentencing judge. What finally freed her was the testimony of insects that never showed up.</w:t>
+      </w:r>
+      <w:r>
+        <w:t xml:space="preserve"> </w:t>
+      </w:r>
+      <w:r>
+        <w:rPr>
+          <w:iCs/>
+          <w:i/>
+        </w:rPr>
+        <w:t xml:space="preserve">(Sourcing note: the 2004 anchor decision reverses on the INFORMANT issue; the entomology + exoneration are the case’s later history, flagged in-chapter.)</w:t>
       </w:r>
     </w:p>
     <w:p>
@@ -19654,6 +19697,942 @@
     </w:p>
     <w:bookmarkEnd w:id="141"/>
     <w:bookmarkEnd w:id="142"/>
+    <w:bookmarkStart w:id="146" w:name="chapter-40---the-flies-that-never-came"/>
+    <w:p>
+      <w:pPr>
+        <w:pStyle w:val="Heading1"/>
+      </w:pPr>
+      <w:r>
+        <w:t xml:space="preserve">Chapter 40 - The Flies That Never Came</w:t>
+      </w:r>
+    </w:p>
+    <w:p>
+      <w:pPr>
+        <w:pStyle w:val="FirstParagraph"/>
+      </w:pPr>
+      <w:r>
+        <w:rPr>
+          <w:bCs/>
+          <w:b/>
+        </w:rPr>
+        <w:t xml:space="preserve">She was convicted of a murder that happened 170 miles from where she was, on</w:t>
+      </w:r>
+      <w:r>
+        <w:rPr>
+          <w:bCs/>
+          <w:b/>
+        </w:rPr>
+        <w:t xml:space="preserve"> </w:t>
+      </w:r>
+      <w:r>
+        <w:rPr>
+          <w:bCs/>
+          <w:b/>
+        </w:rPr>
+        <w:t xml:space="preserve">the word of a jailhouse informant who forged letters to con her own sentencing</w:t>
+      </w:r>
+      <w:r>
+        <w:rPr>
+          <w:bCs/>
+          <w:b/>
+        </w:rPr>
+        <w:t xml:space="preserve"> </w:t>
+      </w:r>
+      <w:r>
+        <w:rPr>
+          <w:bCs/>
+          <w:b/>
+        </w:rPr>
+        <w:t xml:space="preserve">judge. What finally freed her was the testimony of insects that never showed up.</w:t>
+      </w:r>
+    </w:p>
+    <w:p>
+      <w:pPr>
+        <w:pStyle w:val="BodyText"/>
+      </w:pPr>
+      <w:r>
+        <w:t xml:space="preserve">The last two chapters were about a science that pretended to work. This one is</w:t>
+      </w:r>
+      <w:r>
+        <w:t xml:space="preserve"> </w:t>
+      </w:r>
+      <w:r>
+        <w:t xml:space="preserve">about two different kinds of unreliable evidence that nearly cost a young woman</w:t>
+      </w:r>
+      <w:r>
+        <w:t xml:space="preserve"> </w:t>
+      </w:r>
+      <w:r>
+        <w:t xml:space="preserve">her life, and the humble, patient biology that eventually undid them both. It is</w:t>
+      </w:r>
+      <w:r>
+        <w:t xml:space="preserve"> </w:t>
+      </w:r>
+      <w:r>
+        <w:t xml:space="preserve">the story of Kirstin Blaise Lobato, and it is the case where the flies, of all</w:t>
+      </w:r>
+      <w:r>
+        <w:t xml:space="preserve"> </w:t>
+      </w:r>
+      <w:r>
+        <w:t xml:space="preserve">things, told the truth.</w:t>
+      </w:r>
+    </w:p>
+    <w:p>
+      <w:pPr>
+        <w:pStyle w:val="BodyText"/>
+      </w:pPr>
+      <w:r>
+        <w:t xml:space="preserve">On July 8, 2001, Las Vegas police found the body of a man named Duran Bailey</w:t>
+      </w:r>
+      <w:r>
+        <w:t xml:space="preserve"> </w:t>
+      </w:r>
+      <w:r>
+        <w:t xml:space="preserve">behind a dumpster on West Flamingo Road. He had been savaged, beaten with</w:t>
+      </w:r>
+      <w:r>
+        <w:t xml:space="preserve"> </w:t>
+      </w:r>
+      <w:r>
+        <w:t xml:space="preserve">something like a bat, stabbed, and mutilated after death, his penis amputated at</w:t>
+      </w:r>
+      <w:r>
+        <w:t xml:space="preserve"> </w:t>
+      </w:r>
+      <w:r>
+        <w:t xml:space="preserve">the base. It was a brutal, sexually charged killing in the heart of the city.</w:t>
+      </w:r>
+    </w:p>
+    <w:p>
+      <w:pPr>
+        <w:pStyle w:val="BodyText"/>
+      </w:pPr>
+      <w:r>
+        <w:t xml:space="preserve">Kirstin Lobato lived in Panaca, Nevada, a small town roughly 170 miles away. Some</w:t>
+      </w:r>
+      <w:r>
+        <w:t xml:space="preserve"> </w:t>
+      </w:r>
+      <w:r>
+        <w:t xml:space="preserve">weeks earlier she had told her former teacher, and later others, a frightening</w:t>
+      </w:r>
+      <w:r>
+        <w:t xml:space="preserve"> </w:t>
+      </w:r>
+      <w:r>
+        <w:t xml:space="preserve">story: that during a recent trip to Las Vegas an older man had tried to sexually</w:t>
+      </w:r>
+      <w:r>
+        <w:t xml:space="preserve"> </w:t>
+      </w:r>
+      <w:r>
+        <w:t xml:space="preserve">assault her, and that she had fought him off with her butterfly knife, cutting at</w:t>
+      </w:r>
+      <w:r>
+        <w:t xml:space="preserve"> </w:t>
+      </w:r>
+      <w:r>
+        <w:t xml:space="preserve">his groin before escaping. When a detective came to Panaca and suggested he</w:t>
+      </w:r>
+      <w:r>
+        <w:t xml:space="preserve"> </w:t>
+      </w:r>
+      <w:r>
+        <w:t xml:space="preserve">understood she’d been attacked and forced to defend herself, and then gently</w:t>
+      </w:r>
+      <w:r>
+        <w:t xml:space="preserve"> </w:t>
+      </w:r>
+      <w:r>
+        <w:t xml:space="preserve">referenced knowing she’d been</w:t>
+      </w:r>
+      <w:r>
+        <w:t xml:space="preserve"> </w:t>
+      </w:r>
+      <w:r>
+        <w:t xml:space="preserve">“</w:t>
+      </w:r>
+      <w:r>
+        <w:t xml:space="preserve">hurt in the past,</w:t>
+      </w:r>
+      <w:r>
+        <w:t xml:space="preserve">”</w:t>
+      </w:r>
+      <w:r>
+        <w:t xml:space="preserve"> </w:t>
+      </w:r>
+      <w:r>
+        <w:t xml:space="preserve">Lobato began to cry and said,</w:t>
+      </w:r>
+      <w:r>
+        <w:t xml:space="preserve"> </w:t>
+      </w:r>
+      <w:r>
+        <w:t xml:space="preserve">“</w:t>
+      </w:r>
+      <w:r>
+        <w:t xml:space="preserve">I</w:t>
+      </w:r>
+      <w:r>
+        <w:t xml:space="preserve"> </w:t>
+      </w:r>
+      <w:r>
+        <w:t xml:space="preserve">didn’t think anybody would miss him.</w:t>
+      </w:r>
+      <w:r>
+        <w:t xml:space="preserve">”</w:t>
+      </w:r>
+    </w:p>
+    <w:p>
+      <w:pPr>
+        <w:pStyle w:val="BodyText"/>
+      </w:pPr>
+      <w:r>
+        <w:t xml:space="preserve">To the detective, that was a confession. In hindsight, it was something far more</w:t>
+      </w:r>
+      <w:r>
+        <w:t xml:space="preserve"> </w:t>
+      </w:r>
+      <w:r>
+        <w:t xml:space="preserve">ambiguous, the words of a traumatized young woman conflating her own real assault</w:t>
+      </w:r>
+      <w:r>
+        <w:t xml:space="preserve"> </w:t>
+      </w:r>
+      <w:r>
+        <w:t xml:space="preserve">with a crime she had heard about. Because the assault Lobato described, the one she</w:t>
+      </w:r>
+      <w:r>
+        <w:t xml:space="preserve"> </w:t>
+      </w:r>
+      <w:r>
+        <w:t xml:space="preserve">fought off, had happened weeks before Duran Bailey was killed, and in a different</w:t>
+      </w:r>
+      <w:r>
+        <w:t xml:space="preserve"> </w:t>
+      </w:r>
+      <w:r>
+        <w:t xml:space="preserve">part of the city. The state’s theory required her to be the dumpster killer. Her</w:t>
+      </w:r>
+      <w:r>
+        <w:t xml:space="preserve"> </w:t>
+      </w:r>
+      <w:r>
+        <w:t xml:space="preserve">own account, and the geography of her life, put her a three-hour drive away.</w:t>
+      </w:r>
+    </w:p>
+    <w:bookmarkStart w:id="143" w:name="the-informant"/>
+    <w:p>
+      <w:pPr>
+        <w:pStyle w:val="Heading2"/>
+      </w:pPr>
+      <w:r>
+        <w:t xml:space="preserve">The informant</w:t>
+      </w:r>
+    </w:p>
+    <w:p>
+      <w:pPr>
+        <w:pStyle w:val="FirstParagraph"/>
+      </w:pPr>
+      <w:r>
+        <w:t xml:space="preserve">With the physical case thin, the state reached for a witness the criminal justice</w:t>
+      </w:r>
+      <w:r>
+        <w:t xml:space="preserve"> </w:t>
+      </w:r>
+      <w:r>
+        <w:t xml:space="preserve">system leans on far too often and trusts far too much: another prisoner.</w:t>
+      </w:r>
+    </w:p>
+    <w:p>
+      <w:pPr>
+        <w:pStyle w:val="BodyText"/>
+      </w:pPr>
+      <w:r>
+        <w:t xml:space="preserve">Korinda Martin, an inmate at the Clark County Detention Center, testified that</w:t>
+      </w:r>
+      <w:r>
+        <w:t xml:space="preserve"> </w:t>
+      </w:r>
+      <w:r>
+        <w:t xml:space="preserve">Lobato had boasted of the murder, of amputating a man’s penis and stuffing it</w:t>
+      </w:r>
+      <w:r>
+        <w:t xml:space="preserve"> </w:t>
+      </w:r>
+      <w:r>
+        <w:t xml:space="preserve">“</w:t>
+      </w:r>
+      <w:r>
+        <w:t xml:space="preserve">down</w:t>
+      </w:r>
+      <w:r>
+        <w:t xml:space="preserve"> </w:t>
+      </w:r>
+      <w:r>
+        <w:t xml:space="preserve">his throat,</w:t>
+      </w:r>
+      <w:r>
+        <w:t xml:space="preserve">”</w:t>
+      </w:r>
+      <w:r>
+        <w:t xml:space="preserve"> </w:t>
+      </w:r>
+      <w:r>
+        <w:t xml:space="preserve">of stabbing him repeatedly, and of planning to</w:t>
+      </w:r>
+      <w:r>
+        <w:t xml:space="preserve"> </w:t>
+      </w:r>
+      <w:r>
+        <w:t xml:space="preserve">“</w:t>
+      </w:r>
+      <w:r>
+        <w:t xml:space="preserve">play the poor-me act</w:t>
+      </w:r>
+      <w:r>
+        <w:t xml:space="preserve">”</w:t>
+      </w:r>
+      <w:r>
+        <w:t xml:space="preserve"> </w:t>
+      </w:r>
+      <w:r>
+        <w:t xml:space="preserve">and cry sexual assault. It was vivid, it was damning, and it came, as such</w:t>
+      </w:r>
+      <w:r>
+        <w:t xml:space="preserve"> </w:t>
+      </w:r>
+      <w:r>
+        <w:t xml:space="preserve">testimony so often does, from a woman with powerful reasons to say whatever the</w:t>
+      </w:r>
+      <w:r>
+        <w:t xml:space="preserve"> </w:t>
+      </w:r>
+      <w:r>
+        <w:t xml:space="preserve">prosecutors wanted. Martin had a robbery conviction, a coercion conviction, and a</w:t>
+      </w:r>
+      <w:r>
+        <w:t xml:space="preserve"> </w:t>
+      </w:r>
+      <w:r>
+        <w:t xml:space="preserve">history of trying every lever available to get herself out of jail.</w:t>
+      </w:r>
+    </w:p>
+    <w:p>
+      <w:pPr>
+        <w:pStyle w:val="BodyText"/>
+      </w:pPr>
+      <w:r>
+        <w:t xml:space="preserve">Just how far Martin would go to work the system emerged in a hearing away from the</w:t>
+      </w:r>
+      <w:r>
+        <w:t xml:space="preserve"> </w:t>
+      </w:r>
+      <w:r>
+        <w:t xml:space="preserve">jury. Lobato’s lawyers confronted her with two handwritten letters. One was a</w:t>
+      </w:r>
+      <w:r>
+        <w:t xml:space="preserve"> </w:t>
+      </w:r>
+      <w:r>
+        <w:t xml:space="preserve">forgery scheme: a</w:t>
+      </w:r>
+      <w:r>
+        <w:t xml:space="preserve"> </w:t>
+      </w:r>
+      <w:r>
+        <w:t xml:space="preserve">“</w:t>
+      </w:r>
+      <w:r>
+        <w:t xml:space="preserve">cover</w:t>
+      </w:r>
+      <w:r>
+        <w:t xml:space="preserve">”</w:t>
+      </w:r>
+      <w:r>
+        <w:t xml:space="preserve"> </w:t>
+      </w:r>
+      <w:r>
+        <w:t xml:space="preserve">letter asking a former fellow prisoner to copy an</w:t>
+      </w:r>
+      <w:r>
+        <w:t xml:space="preserve"> </w:t>
+      </w:r>
+      <w:r>
+        <w:t xml:space="preserve">attached recommendation in her own handwriting and mail it to Martin’s sentencing</w:t>
+      </w:r>
+      <w:r>
+        <w:t xml:space="preserve"> </w:t>
+      </w:r>
+      <w:r>
+        <w:t xml:space="preserve">judge, a letter falsely claiming Martin held a steady job with a high-risk</w:t>
+      </w:r>
+      <w:r>
+        <w:t xml:space="preserve"> </w:t>
+      </w:r>
+      <w:r>
+        <w:t xml:space="preserve">pregnancy, all designed to con the court into leniency. Martin denied writing them.</w:t>
+      </w:r>
+      <w:r>
+        <w:t xml:space="preserve"> </w:t>
+      </w:r>
+      <w:r>
+        <w:t xml:space="preserve">But she conceded the letters were a fraud on her sentencing court, and there was</w:t>
+      </w:r>
+      <w:r>
+        <w:t xml:space="preserve"> </w:t>
+      </w:r>
+      <w:r>
+        <w:t xml:space="preserve">the small matter of the envelope they arrived in, which bore Martin’s own return</w:t>
+      </w:r>
+      <w:r>
+        <w:t xml:space="preserve"> </w:t>
+      </w:r>
+      <w:r>
+        <w:t xml:space="preserve">address and prison identification number.</w:t>
+      </w:r>
+    </w:p>
+    <w:p>
+      <w:pPr>
+        <w:pStyle w:val="BodyText"/>
+      </w:pPr>
+      <w:r>
+        <w:t xml:space="preserve">Here is where the trial went wrong in the way that would eventually undo it. When</w:t>
+      </w:r>
+      <w:r>
+        <w:t xml:space="preserve"> </w:t>
+      </w:r>
+      <w:r>
+        <w:t xml:space="preserve">Lobato’s defense tried to actually prove that this letter-forging informant had</w:t>
+      </w:r>
+      <w:r>
+        <w:t xml:space="preserve"> </w:t>
+      </w:r>
+      <w:r>
+        <w:t xml:space="preserve">authored the fraud, offering a handwriting expert’s opinion that Martin wrote the</w:t>
+      </w:r>
+      <w:r>
+        <w:t xml:space="preserve"> </w:t>
+      </w:r>
+      <w:r>
+        <w:t xml:space="preserve">letters, the trial court shut it down as a collateral matter and let none of it</w:t>
+      </w:r>
+      <w:r>
+        <w:t xml:space="preserve"> </w:t>
+      </w:r>
+      <w:r>
+        <w:t xml:space="preserve">reach the jury. The jurors who convicted Kirstin Lobato heard Korinda Martin’s</w:t>
+      </w:r>
+      <w:r>
+        <w:t xml:space="preserve"> </w:t>
+      </w:r>
+      <w:r>
+        <w:t xml:space="preserve">devastating account. They never heard that Martin was, by the evidence, a</w:t>
+      </w:r>
+      <w:r>
+        <w:t xml:space="preserve"> </w:t>
+      </w:r>
+      <w:r>
+        <w:t xml:space="preserve">practiced forger willing to defraud a judge to shave time off her own sentence.</w:t>
+      </w:r>
+      <w:r>
+        <w:t xml:space="preserve"> </w:t>
+      </w:r>
+      <w:r>
+        <w:t xml:space="preserve">And after the verdict, a police document examiner confirmed it: Martin had written</w:t>
+      </w:r>
+      <w:r>
+        <w:t xml:space="preserve"> </w:t>
+      </w:r>
+      <w:r>
+        <w:t xml:space="preserve">at least one of the letters. The jury got the informant’s story and was spared the</w:t>
+      </w:r>
+      <w:r>
+        <w:t xml:space="preserve"> </w:t>
+      </w:r>
+      <w:r>
+        <w:t xml:space="preserve">one fact that best explained why not to believe it.</w:t>
+      </w:r>
+    </w:p>
+    <w:p>
+      <w:pPr>
+        <w:pStyle w:val="BodyText"/>
+      </w:pPr>
+      <w:r>
+        <w:t xml:space="preserve">The jury convicted. In 2004, the Supreme Court of Nevada reversed, holding that</w:t>
+      </w:r>
+      <w:r>
+        <w:t xml:space="preserve"> </w:t>
+      </w:r>
+      <w:r>
+        <w:t xml:space="preserve">barring the defense from impeaching Martin with the forged letters was an error</w:t>
+      </w:r>
+      <w:r>
+        <w:t xml:space="preserve"> </w:t>
+      </w:r>
+      <w:r>
+        <w:t xml:space="preserve">that required a new trial. It is that decision this chapter is anchored to, and its</w:t>
+      </w:r>
+      <w:r>
+        <w:t xml:space="preserve"> </w:t>
+      </w:r>
+      <w:r>
+        <w:t xml:space="preserve">lesson is old and unglamorous: a jailhouse informant trading testimony for freedom</w:t>
+      </w:r>
+      <w:r>
+        <w:t xml:space="preserve"> </w:t>
+      </w:r>
+      <w:r>
+        <w:t xml:space="preserve">is among the most dangerous witnesses a courtroom can host, and a jury that cannot</w:t>
+      </w:r>
+      <w:r>
+        <w:t xml:space="preserve"> </w:t>
+      </w:r>
+      <w:r>
+        <w:t xml:space="preserve">weigh her motives cannot weigh her word.</w:t>
+      </w:r>
+    </w:p>
+    <w:bookmarkEnd w:id="143"/>
+    <w:bookmarkStart w:id="144" w:name="the-flies"/>
+    <w:p>
+      <w:pPr>
+        <w:pStyle w:val="Heading2"/>
+      </w:pPr>
+      <w:r>
+        <w:t xml:space="preserve">The flies</w:t>
+      </w:r>
+    </w:p>
+    <w:p>
+      <w:pPr>
+        <w:pStyle w:val="FirstParagraph"/>
+      </w:pPr>
+      <w:r>
+        <w:t xml:space="preserve">The 2004 reversal was not the end. It was, agonizingly, the middle. Lobato was</w:t>
+      </w:r>
+      <w:r>
+        <w:t xml:space="preserve"> </w:t>
+      </w:r>
+      <w:r>
+        <w:t xml:space="preserve">tried again and convicted again, and the fight to prove her innocence stretched on</w:t>
+      </w:r>
+      <w:r>
+        <w:t xml:space="preserve"> </w:t>
+      </w:r>
+      <w:r>
+        <w:t xml:space="preserve">for years. And what carried it, in the end, was not a lawyer’s argument or a</w:t>
+      </w:r>
+      <w:r>
+        <w:t xml:space="preserve"> </w:t>
+      </w:r>
+      <w:r>
+        <w:t xml:space="preserve">recanting witness. It was entomology.</w:t>
+      </w:r>
+    </w:p>
+    <w:p>
+      <w:pPr>
+        <w:pStyle w:val="BodyText"/>
+      </w:pPr>
+      <w:r>
+        <w:t xml:space="preserve">Consider the one fact the original timeline had glided past. Duran Bailey’s body</w:t>
+      </w:r>
+      <w:r>
+        <w:t xml:space="preserve"> </w:t>
+      </w:r>
+      <w:r>
+        <w:t xml:space="preserve">lay exposed outdoors, behind a dumpster, in Las Vegas, in July. Anyone who has</w:t>
+      </w:r>
+      <w:r>
+        <w:t xml:space="preserve"> </w:t>
+      </w:r>
+      <w:r>
+        <w:t xml:space="preserve">left a picnic unattended in high summer knows what happens next: within hours,</w:t>
+      </w:r>
+      <w:r>
+        <w:t xml:space="preserve"> </w:t>
+      </w:r>
+      <w:r>
+        <w:t xml:space="preserve">often within minutes, blow flies find exposed flesh and blood and begin to lay</w:t>
+      </w:r>
+      <w:r>
+        <w:t xml:space="preserve"> </w:t>
+      </w:r>
+      <w:r>
+        <w:t xml:space="preserve">eggs, and those eggs become larvae on a schedule so reliable that forensic</w:t>
+      </w:r>
+      <w:r>
+        <w:t xml:space="preserve"> </w:t>
+      </w:r>
+      <w:r>
+        <w:t xml:space="preserve">entomologists can read a body’s insect colonists like a clock. In the desert heat</w:t>
+      </w:r>
+      <w:r>
+        <w:t xml:space="preserve"> </w:t>
+      </w:r>
+      <w:r>
+        <w:t xml:space="preserve">of a Las Vegas day, a corpse should have been swarming.</w:t>
+      </w:r>
+    </w:p>
+    <w:p>
+      <w:pPr>
+        <w:pStyle w:val="BodyText"/>
+      </w:pPr>
+      <w:r>
+        <w:t xml:space="preserve">Bailey’s body was not. The near-total absence of the insect activity that summer</w:t>
+      </w:r>
+      <w:r>
+        <w:t xml:space="preserve"> </w:t>
+      </w:r>
+      <w:r>
+        <w:t xml:space="preserve">daylight guarantees pointed to a single conclusion: he had been killed and left</w:t>
+      </w:r>
+      <w:r>
+        <w:t xml:space="preserve"> </w:t>
+      </w:r>
+      <w:r>
+        <w:t xml:space="preserve">after dark, in the cool of night, when the flies had gone quiet. And that timing</w:t>
+      </w:r>
+      <w:r>
+        <w:t xml:space="preserve"> </w:t>
+      </w:r>
+      <w:r>
+        <w:t xml:space="preserve">mattered enormously, because it placed the murder in a window when Kirstin Lobato,</w:t>
+      </w:r>
+      <w:r>
+        <w:t xml:space="preserve"> </w:t>
+      </w:r>
+      <w:r>
+        <w:t xml:space="preserve">by the evidence, was 170 miles north in Panaca. The bugs that never came to Duran</w:t>
+      </w:r>
+      <w:r>
+        <w:t xml:space="preserve"> </w:t>
+      </w:r>
+      <w:r>
+        <w:t xml:space="preserve">Bailey’s body became the alibi that the state’s timeline had denied her. On the</w:t>
+      </w:r>
+      <w:r>
+        <w:t xml:space="preserve"> </w:t>
+      </w:r>
+      <w:r>
+        <w:t xml:space="preserve">strength of that reading, and the mounting rot of the case against her, courts</w:t>
+      </w:r>
+      <w:r>
+        <w:t xml:space="preserve"> </w:t>
+      </w:r>
+      <w:r>
+        <w:t xml:space="preserve">eventually vacated Kirstin Lobato’s conviction, and after more than sixteen years</w:t>
+      </w:r>
+      <w:r>
+        <w:t xml:space="preserve"> </w:t>
+      </w:r>
+      <w:r>
+        <w:t xml:space="preserve">in prison she walked free.</w:t>
+      </w:r>
+      <w:r>
+        <w:t xml:space="preserve"> </w:t>
+      </w:r>
+      <w:r>
+        <w:rPr>
+          <w:iCs/>
+          <w:i/>
+        </w:rPr>
+        <w:t xml:space="preserve">(The entomology evidence and the final exoneration</w:t>
+      </w:r>
+      <w:r>
+        <w:rPr>
+          <w:iCs/>
+          <w:i/>
+        </w:rPr>
+        <w:t xml:space="preserve"> </w:t>
+      </w:r>
+      <w:r>
+        <w:rPr>
+          <w:iCs/>
+          <w:i/>
+        </w:rPr>
+        <w:t xml:space="preserve">belong to Lobato’s retrial and later habeas proceedings; the 2004 decision anchored</w:t>
+      </w:r>
+      <w:r>
+        <w:rPr>
+          <w:iCs/>
+          <w:i/>
+        </w:rPr>
+        <w:t xml:space="preserve"> </w:t>
+      </w:r>
+      <w:r>
+        <w:rPr>
+          <w:iCs/>
+          <w:i/>
+        </w:rPr>
+        <w:t xml:space="preserve">here reversed her first conviction on the informant issue and does not itself</w:t>
+      </w:r>
+      <w:r>
+        <w:rPr>
+          <w:iCs/>
+          <w:i/>
+        </w:rPr>
+        <w:t xml:space="preserve"> </w:t>
+      </w:r>
+      <w:r>
+        <w:rPr>
+          <w:iCs/>
+          <w:i/>
+        </w:rPr>
+        <w:t xml:space="preserve">address the insects.)</w:t>
+      </w:r>
+    </w:p>
+    <w:bookmarkEnd w:id="144"/>
+    <w:bookmarkStart w:id="145" w:name="Xa9a806fe186efe725ca7dc26c5e4cdfa84f740f"/>
+    <w:p>
+      <w:pPr>
+        <w:pStyle w:val="Heading2"/>
+      </w:pPr>
+      <w:r>
+        <w:t xml:space="preserve">How’d she get caught? And how did she get free?</w:t>
+      </w:r>
+    </w:p>
+    <w:p>
+      <w:pPr>
+        <w:pStyle w:val="FirstParagraph"/>
+      </w:pPr>
+      <w:r>
+        <w:t xml:space="preserve">Kirstin Lobato was caught by two of the least reliable things a courtroom trades</w:t>
+      </w:r>
+      <w:r>
+        <w:t xml:space="preserve"> </w:t>
+      </w:r>
+      <w:r>
+        <w:t xml:space="preserve">in: a grief-stricken, ambiguous utterance mistaken for a confession, and a career</w:t>
+      </w:r>
+      <w:r>
+        <w:t xml:space="preserve"> </w:t>
+      </w:r>
+      <w:r>
+        <w:t xml:space="preserve">jailhouse informant who forged documents to game her own sentence and whose lies</w:t>
+      </w:r>
+      <w:r>
+        <w:t xml:space="preserve"> </w:t>
+      </w:r>
+      <w:r>
+        <w:t xml:space="preserve">the jury was never allowed to see for what they were. That is how an innocent woman</w:t>
+      </w:r>
+      <w:r>
+        <w:t xml:space="preserve"> </w:t>
+      </w:r>
+      <w:r>
+        <w:t xml:space="preserve">loses sixteen years. How she got them back is the quieter miracle at the center of</w:t>
+      </w:r>
+      <w:r>
+        <w:t xml:space="preserve"> </w:t>
+      </w:r>
+      <w:r>
+        <w:t xml:space="preserve">this book’s final chapters. No one could shake the informant, no one could unspeak</w:t>
+      </w:r>
+      <w:r>
+        <w:t xml:space="preserve"> </w:t>
+      </w:r>
+      <w:r>
+        <w:t xml:space="preserve">the confession that wasn’t one. But the flies could not be bribed, could not be</w:t>
+      </w:r>
+      <w:r>
+        <w:t xml:space="preserve"> </w:t>
+      </w:r>
+      <w:r>
+        <w:t xml:space="preserve">coached, could not be made to say what the prosecution needed. They simply followed</w:t>
+      </w:r>
+      <w:r>
+        <w:t xml:space="preserve"> </w:t>
+      </w:r>
+      <w:r>
+        <w:t xml:space="preserve">their nature, and their nature was to arrive at a fresh body within hours. When they</w:t>
+      </w:r>
+      <w:r>
+        <w:t xml:space="preserve"> </w:t>
+      </w:r>
+      <w:r>
+        <w:t xml:space="preserve">didn’t arrive, they left behind the truth, which is that Duran Bailey died in the</w:t>
+      </w:r>
+      <w:r>
+        <w:t xml:space="preserve"> </w:t>
+      </w:r>
+      <w:r>
+        <w:t xml:space="preserve">dark, in a city where Kirstin Lobato was not.</w:t>
+      </w:r>
+    </w:p>
+    <w:p>
+      <w:r>
+        <w:pict>
+          <v:rect style="width:0;height:1.5pt" o:hralign="center" o:hrstd="t" o:hr="t"/>
+        </w:pict>
+      </w:r>
+    </w:p>
+    <w:p>
+      <w:pPr>
+        <w:pStyle w:val="BlockText"/>
+      </w:pPr>
+      <w:r>
+        <w:rPr>
+          <w:bCs/>
+          <w:b/>
+        </w:rPr>
+        <w:t xml:space="preserve">📖 Read the case yourself:</w:t>
+      </w:r>
+      <w:r>
+        <w:t xml:space="preserve"> </w:t>
+      </w:r>
+      <w:r>
+        <w:rPr>
+          <w:iCs/>
+          <w:i/>
+        </w:rPr>
+        <w:t xml:space="preserve">Lobato v. State</w:t>
+      </w:r>
+      <w:r>
+        <w:t xml:space="preserve">, 120 Nev. 512, 96 P.3d 765</w:t>
+      </w:r>
+      <w:r>
+        <w:t xml:space="preserve"> </w:t>
+      </w:r>
+      <w:r>
+        <w:t xml:space="preserve">(Nev. 2004), Supreme Court of Nevada, decided 2004.</w:t>
+      </w:r>
+      <w:r>
+        <w:t xml:space="preserve"> </w:t>
+      </w:r>
+      <w:r>
+        <w:t xml:space="preserve">Free online: search</w:t>
+      </w:r>
+      <w:r>
+        <w:t xml:space="preserve"> </w:t>
+      </w:r>
+      <w:r>
+        <w:t xml:space="preserve">“</w:t>
+      </w:r>
+      <w:r>
+        <w:t xml:space="preserve">Lobato v. State 96 P.3d 765</w:t>
+      </w:r>
+      <w:r>
+        <w:t xml:space="preserve">”</w:t>
+      </w:r>
+      <w:r>
+        <w:t xml:space="preserve"> </w:t>
+      </w:r>
+      <w:r>
+        <w:t xml:space="preserve">(Justia / FindLaw / vLex).</w:t>
+      </w:r>
+      <w:r>
+        <w:t xml:space="preserve"> </w:t>
+      </w:r>
+      <w:r>
+        <w:t xml:space="preserve">The murder, Lobato’s statements, and the jailhouse-informant testimony and</w:t>
+      </w:r>
+      <w:r>
+        <w:t xml:space="preserve"> </w:t>
+      </w:r>
+      <w:r>
+        <w:t xml:space="preserve">forged-letter ruling that reversed her first conviction are set out in the</w:t>
+      </w:r>
+      <w:r>
+        <w:t xml:space="preserve"> </w:t>
+      </w:r>
+      <w:r>
+        <w:t xml:space="preserve">opinion. The forensic-entomology evidence and Lobato’s eventual exoneration come</w:t>
+      </w:r>
+      <w:r>
+        <w:t xml:space="preserve"> </w:t>
+      </w:r>
+      <w:r>
+        <w:t xml:space="preserve">from her retrial and later post-conviction proceedings, part of the case’s</w:t>
+      </w:r>
+      <w:r>
+        <w:t xml:space="preserve"> </w:t>
+      </w:r>
+      <w:r>
+        <w:t xml:space="preserve">well-documented later history.</w:t>
+      </w:r>
+      <w:r>
+        <w:t xml:space="preserve"> </w:t>
+      </w:r>
+      <w:r>
+        <w:rPr>
+          <w:bCs/>
+          <w:b/>
+        </w:rPr>
+        <w:t xml:space="preserve">Companion chapters:</w:t>
+      </w:r>
+      <w:r>
+        <w:t xml:space="preserve"> </w:t>
+      </w:r>
+      <w:r>
+        <w:t xml:space="preserve">the junk-science arc runs through</w:t>
+      </w:r>
+      <w:r>
+        <w:t xml:space="preserve"> </w:t>
+      </w:r>
+      <w:r>
+        <w:rPr>
+          <w:iCs/>
+          <w:i/>
+        </w:rPr>
+        <w:t xml:space="preserve">Bundy</w:t>
+      </w:r>
+      <w:r>
+        <w:t xml:space="preserve"> </w:t>
+      </w:r>
+      <w:r>
+        <w:t xml:space="preserve">(37),</w:t>
+      </w:r>
+      <w:r>
+        <w:t xml:space="preserve"> </w:t>
+      </w:r>
+      <w:r>
+        <w:rPr>
+          <w:iCs/>
+          <w:i/>
+        </w:rPr>
+        <w:t xml:space="preserve">Krone</w:t>
+      </w:r>
+      <w:r>
+        <w:t xml:space="preserve"> </w:t>
+      </w:r>
+      <w:r>
+        <w:t xml:space="preserve">(38), and</w:t>
+      </w:r>
+      <w:r>
+        <w:t xml:space="preserve"> </w:t>
+      </w:r>
+      <w:r>
+        <w:rPr>
+          <w:iCs/>
+          <w:i/>
+        </w:rPr>
+        <w:t xml:space="preserve">Howard</w:t>
+      </w:r>
+      <w:r>
+        <w:t xml:space="preserve"> </w:t>
+      </w:r>
+      <w:r>
+        <w:t xml:space="preserve">(39); the Canadian bookend is</w:t>
+      </w:r>
+      <w:r>
+        <w:t xml:space="preserve"> </w:t>
+      </w:r>
+      <w:r>
+        <w:rPr>
+          <w:iCs/>
+          <w:i/>
+        </w:rPr>
+        <w:t xml:space="preserve">R. v. Truscott</w:t>
+      </w:r>
+      <w:r>
+        <w:t xml:space="preserve"> </w:t>
+      </w:r>
+      <w:r>
+        <w:t xml:space="preserve">(Chapter 41).</w:t>
+      </w:r>
+    </w:p>
+    <w:bookmarkEnd w:id="145"/>
+    <w:bookmarkEnd w:id="146"/>
     <w:sectPr/>
   </w:body>
 </w:document>

</xml_diff>

<commit_message>
Draft Truscott (41) - the closing chapter; Part VIII complete
- ch41 'The Boy, the Flies, and Forty-Eight Years': Steven Truscott,
  convicted at 14 in 1959 on Dr. Penistan's stomach-contents time-of-death
  window; the 2007 ONCA reference admits fresh pathology (rendering the
  window 'scientifically untenable') and forensic entomology (blow-fly
  maggot development read against Penistan's own autopsy notes) and enters
  an acquittal. Anchored to the full CanLII text (Markdown; PDF was >30MB).
- Grave, humor-free; frames the whole book's thesis in the close.
- Part VIII (junk science / exonerations) now COMPLETE: Bundy -> Krone ->
  Howard -> Lobato -> Truscott.
- Master now 20 chapters.

Co-Authored-By: Claude Opus 4.8 <noreply@anthropic.com>
Claude-Session: https://claude.ai/code/session_016HAHAXcMmaZghEz1kJrDWU
</commit_message>
<xml_diff>
--- a/book/word/How Not to Get Away With Murder - Master.docx
+++ b/book/word/How Not to Get Away With Murder - Master.docx
@@ -3238,13 +3238,56 @@
           <w:iCs/>
           <w:i/>
         </w:rPr>
-        <w:t xml:space="preserve">R. v. Truscott</w:t>
-      </w:r>
-      <w:r>
-        <w:t xml:space="preserve"> </w:t>
-      </w:r>
-      <w:r>
-        <w:t xml:space="preserve">(ON CA, 2007) 🔶 - the Canadian bookend</w:t>
+        <w:t xml:space="preserve">Truscott (Re)</w:t>
+      </w:r>
+      <w:r>
+        <w:t xml:space="preserve">, 2007 ONCA 575 ✍️</w:t>
+      </w:r>
+      <w:r>
+        <w:t xml:space="preserve"> </w:t>
+      </w:r>
+      <w:r>
+        <w:rPr>
+          <w:iCs/>
+          <w:i/>
+        </w:rPr>
+        <w:t xml:space="preserve">drafted</w:t>
+      </w:r>
+      <w:r>
+        <w:t xml:space="preserve"> </w:t>
+      </w:r>
+      <w:r>
+        <w:t xml:space="preserve">🔶</w:t>
+      </w:r>
+      <w:r>
+        <w:t xml:space="preserve"> </w:t>
+      </w:r>
+      <w:r>
+        <w:rPr>
+          <w:iCs/>
+          <w:i/>
+        </w:rPr>
+        <w:t xml:space="preserve">Hook:</w:t>
+      </w:r>
+      <w:r>
+        <w:t xml:space="preserve"> </w:t>
+      </w:r>
+      <w:r>
+        <w:rPr>
+          <w:bCs/>
+          <w:b/>
+        </w:rPr>
+        <w:t xml:space="preserve">A pathologist looked at the food in a dead girl’s stomach and declared she had died within a forty-five-minute window. That window sent a fourteen-year-old boy to the gallows. It took forty-eight years, and a study of blow flies, to prove the window was never real.</w:t>
+      </w:r>
+      <w:r>
+        <w:t xml:space="preserve"> </w:t>
+      </w:r>
+      <w:r>
+        <w:rPr>
+          <w:iCs/>
+          <w:i/>
+        </w:rPr>
+        <w:t xml:space="preserve">(The book’s closing chapter; completes Part VIII.)</w:t>
       </w:r>
     </w:p>
     <w:p>
@@ -20633,6 +20676,966 @@
     </w:p>
     <w:bookmarkEnd w:id="145"/>
     <w:bookmarkEnd w:id="146"/>
+    <w:bookmarkStart w:id="151" w:name="Xb6275e81e8ed2caac70c8c4fbdf111eb2d1fdd2"/>
+    <w:p>
+      <w:pPr>
+        <w:pStyle w:val="Heading1"/>
+      </w:pPr>
+      <w:r>
+        <w:t xml:space="preserve">Chapter 41 - The Boy, the Flies, and Forty-Eight Years</w:t>
+      </w:r>
+    </w:p>
+    <w:p>
+      <w:pPr>
+        <w:pStyle w:val="FirstParagraph"/>
+      </w:pPr>
+      <w:r>
+        <w:rPr>
+          <w:bCs/>
+          <w:b/>
+        </w:rPr>
+        <w:t xml:space="preserve">A pathologist looked at the food in a dead girl’s stomach and declared she had</w:t>
+      </w:r>
+      <w:r>
+        <w:rPr>
+          <w:bCs/>
+          <w:b/>
+        </w:rPr>
+        <w:t xml:space="preserve"> </w:t>
+      </w:r>
+      <w:r>
+        <w:rPr>
+          <w:bCs/>
+          <w:b/>
+        </w:rPr>
+        <w:t xml:space="preserve">died within a forty-five-minute window. That window sent a fourteen-year-old boy</w:t>
+      </w:r>
+      <w:r>
+        <w:rPr>
+          <w:bCs/>
+          <w:b/>
+        </w:rPr>
+        <w:t xml:space="preserve"> </w:t>
+      </w:r>
+      <w:r>
+        <w:rPr>
+          <w:bCs/>
+          <w:b/>
+        </w:rPr>
+        <w:t xml:space="preserve">to the gallows. It took forty-eight years, and a study of blow flies, to prove</w:t>
+      </w:r>
+      <w:r>
+        <w:rPr>
+          <w:bCs/>
+          <w:b/>
+        </w:rPr>
+        <w:t xml:space="preserve"> </w:t>
+      </w:r>
+      <w:r>
+        <w:rPr>
+          <w:bCs/>
+          <w:b/>
+        </w:rPr>
+        <w:t xml:space="preserve">the window was never real.</w:t>
+      </w:r>
+    </w:p>
+    <w:p>
+      <w:pPr>
+        <w:pStyle w:val="BodyText"/>
+      </w:pPr>
+      <w:r>
+        <w:t xml:space="preserve">This book is called</w:t>
+      </w:r>
+      <w:r>
+        <w:t xml:space="preserve"> </w:t>
+      </w:r>
+      <w:r>
+        <w:rPr>
+          <w:iCs/>
+          <w:i/>
+        </w:rPr>
+        <w:t xml:space="preserve">How Not to Get Away With Murder</w:t>
+      </w:r>
+      <w:r>
+        <w:t xml:space="preserve">, and every chapter until</w:t>
+      </w:r>
+      <w:r>
+        <w:t xml:space="preserve"> </w:t>
+      </w:r>
+      <w:r>
+        <w:t xml:space="preserve">now has been a story about the guilty being caught. The book cannot honestly end</w:t>
+      </w:r>
+      <w:r>
+        <w:t xml:space="preserve"> </w:t>
+      </w:r>
+      <w:r>
+        <w:t xml:space="preserve">there, because the same forensic machinery that catches killers is operated by</w:t>
+      </w:r>
+      <w:r>
+        <w:t xml:space="preserve"> </w:t>
+      </w:r>
+      <w:r>
+        <w:t xml:space="preserve">human beings who make mistakes, and when it fails, it does not simply let a</w:t>
+      </w:r>
+      <w:r>
+        <w:t xml:space="preserve"> </w:t>
+      </w:r>
+      <w:r>
+        <w:t xml:space="preserve">guilty man walk. Sometimes it takes an innocent one and nearly hangs him. To</w:t>
+      </w:r>
+      <w:r>
+        <w:t xml:space="preserve"> </w:t>
+      </w:r>
+      <w:r>
+        <w:t xml:space="preserve">close, we have to tell that story too, and in Canada there is no story that tells</w:t>
+      </w:r>
+      <w:r>
+        <w:t xml:space="preserve"> </w:t>
+      </w:r>
+      <w:r>
+        <w:t xml:space="preserve">it better than the case of a fourteen-year-old boy named Steven Truscott.</w:t>
+      </w:r>
+    </w:p>
+    <w:p>
+      <w:pPr>
+        <w:pStyle w:val="BodyText"/>
+      </w:pPr>
+      <w:r>
+        <w:t xml:space="preserve">On the evening of June 9, 1959, near the Royal Canadian Air Force station outside</w:t>
+      </w:r>
+      <w:r>
+        <w:t xml:space="preserve"> </w:t>
+      </w:r>
+      <w:r>
+        <w:t xml:space="preserve">Clinton, Ontario, Steven Truscott gave his twelve-year-old classmate Lynne Harper</w:t>
+      </w:r>
+      <w:r>
+        <w:t xml:space="preserve"> </w:t>
+      </w:r>
+      <w:r>
+        <w:t xml:space="preserve">a ride on the handlebars of his bicycle, north along the County Road. He said he</w:t>
+      </w:r>
+      <w:r>
+        <w:t xml:space="preserve"> </w:t>
+      </w:r>
+      <w:r>
+        <w:t xml:space="preserve">dropped her near the highway and watched her get into a car. It was, he insisted</w:t>
+      </w:r>
+      <w:r>
+        <w:t xml:space="preserve"> </w:t>
+      </w:r>
+      <w:r>
+        <w:t xml:space="preserve">then and for the rest of his life, the last he saw of her.</w:t>
+      </w:r>
+    </w:p>
+    <w:p>
+      <w:pPr>
+        <w:pStyle w:val="BodyText"/>
+      </w:pPr>
+      <w:r>
+        <w:t xml:space="preserve">Two days later, searchers found Lynne Harper’s body in a wooded area called</w:t>
+      </w:r>
+      <w:r>
+        <w:t xml:space="preserve"> </w:t>
+      </w:r>
+      <w:r>
+        <w:t xml:space="preserve">Lawson’s Bush. She had been sexually assaulted and strangled with her own blouse.</w:t>
+      </w:r>
+      <w:r>
+        <w:t xml:space="preserve"> </w:t>
+      </w:r>
+      <w:r>
+        <w:t xml:space="preserve">And within days, the boy who had last been seen with her, Steven Truscott, was</w:t>
+      </w:r>
+      <w:r>
+        <w:t xml:space="preserve"> </w:t>
+      </w:r>
+      <w:r>
+        <w:t xml:space="preserve">arrested, tried as an adult for capital murder, convicted, and sentenced to hang.</w:t>
+      </w:r>
+      <w:r>
+        <w:t xml:space="preserve"> </w:t>
+      </w:r>
+      <w:r>
+        <w:t xml:space="preserve">The sentence was commuted to life. He was fourteen years old, and every court</w:t>
+      </w:r>
+      <w:r>
+        <w:t xml:space="preserve"> </w:t>
+      </w:r>
+      <w:r>
+        <w:t xml:space="preserve">that reviewed his case, including a majority of the Supreme Court of Canada on a</w:t>
+      </w:r>
+      <w:r>
+        <w:t xml:space="preserve"> </w:t>
+      </w:r>
+      <w:r>
+        <w:t xml:space="preserve">1966 reference, upheld the conviction.</w:t>
+      </w:r>
+    </w:p>
+    <w:p>
+      <w:pPr>
+        <w:pStyle w:val="BodyText"/>
+      </w:pPr>
+      <w:r>
+        <w:t xml:space="preserve">The case against him was entirely circumstantial, and it stood on four pillars.</w:t>
+      </w:r>
+      <w:r>
+        <w:t xml:space="preserve"> </w:t>
+      </w:r>
+      <w:r>
+        <w:t xml:space="preserve">Three of them were the ordinary stuff of a 1950s murder trial: witnesses along</w:t>
+      </w:r>
+      <w:r>
+        <w:t xml:space="preserve"> </w:t>
+      </w:r>
+      <w:r>
+        <w:t xml:space="preserve">the County Road, disputed evidence about his later conduct, and some physical</w:t>
+      </w:r>
+      <w:r>
+        <w:t xml:space="preserve"> </w:t>
+      </w:r>
+      <w:r>
+        <w:t xml:space="preserve">findings on his body offered to suggest he was the assailant. But the pillar that</w:t>
+      </w:r>
+      <w:r>
+        <w:t xml:space="preserve"> </w:t>
+      </w:r>
+      <w:r>
+        <w:t xml:space="preserve">held up all the rest, the one that gave Steven Truscott what the Crown called</w:t>
+      </w:r>
+      <w:r>
+        <w:t xml:space="preserve"> </w:t>
+      </w:r>
+      <w:r>
+        <w:t xml:space="preserve">“</w:t>
+      </w:r>
+      <w:r>
+        <w:t xml:space="preserve">exclusive opportunity</w:t>
+      </w:r>
+      <w:r>
+        <w:t xml:space="preserve">”</w:t>
+      </w:r>
+      <w:r>
+        <w:t xml:space="preserve"> </w:t>
+      </w:r>
+      <w:r>
+        <w:t xml:space="preserve">to commit the murder, was a piece of forensic science. It</w:t>
+      </w:r>
+      <w:r>
+        <w:t xml:space="preserve"> </w:t>
+      </w:r>
+      <w:r>
+        <w:t xml:space="preserve">was the word of a pathologist about the contents of a dead girl’s stomach.</w:t>
+      </w:r>
+    </w:p>
+    <w:bookmarkStart w:id="147" w:name="the-window"/>
+    <w:p>
+      <w:pPr>
+        <w:pStyle w:val="Heading2"/>
+      </w:pPr>
+      <w:r>
+        <w:t xml:space="preserve">The window</w:t>
+      </w:r>
+    </w:p>
+    <w:p>
+      <w:pPr>
+        <w:pStyle w:val="FirstParagraph"/>
+      </w:pPr>
+      <w:r>
+        <w:t xml:space="preserve">The pathologist was Dr. John Penistan, and he performed Lynne Harper’s autopsy.</w:t>
+      </w:r>
+      <w:r>
+        <w:t xml:space="preserve"> </w:t>
+      </w:r>
+      <w:r>
+        <w:t xml:space="preserve">On the basis of three observations, the degree to which her last meal had digested</w:t>
+      </w:r>
+      <w:r>
+        <w:t xml:space="preserve"> </w:t>
+      </w:r>
+      <w:r>
+        <w:t xml:space="preserve">in her stomach, the state of the rigor mortis in her body, and the extent of</w:t>
+      </w:r>
+      <w:r>
+        <w:t xml:space="preserve"> </w:t>
+      </w:r>
+      <w:r>
+        <w:t xml:space="preserve">decomposition, he delivered an opinion of striking, almost surgical precision. He</w:t>
+      </w:r>
+      <w:r>
+        <w:t xml:space="preserve"> </w:t>
+      </w:r>
+      <w:r>
+        <w:t xml:space="preserve">told the court that Lynne Harper had died between 7:00 and 7:45 p.m. on June 9.</w:t>
+      </w:r>
+    </w:p>
+    <w:p>
+      <w:pPr>
+        <w:pStyle w:val="BodyText"/>
+      </w:pPr>
+      <w:r>
+        <w:t xml:space="preserve">Understand what that narrow window did. Steven Truscott was demonstrably with</w:t>
+      </w:r>
+      <w:r>
+        <w:t xml:space="preserve"> </w:t>
+      </w:r>
+      <w:r>
+        <w:t xml:space="preserve">Lynne on the County Road shortly after 7:00 p.m. If she died by 7:45, then he,</w:t>
+      </w:r>
+      <w:r>
+        <w:t xml:space="preserve"> </w:t>
+      </w:r>
+      <w:r>
+        <w:t xml:space="preserve">and effectively only he, had the opportunity to kill her before she could reach</w:t>
+      </w:r>
+      <w:r>
+        <w:t xml:space="preserve"> </w:t>
+      </w:r>
+      <w:r>
+        <w:t xml:space="preserve">the highway and the car he described. Dr. Penistan’s forty-five-minute window was</w:t>
+      </w:r>
+      <w:r>
+        <w:t xml:space="preserve"> </w:t>
+      </w:r>
+      <w:r>
+        <w:t xml:space="preserve">not merely evidence in the case. It</w:t>
+      </w:r>
+      <w:r>
+        <w:t xml:space="preserve"> </w:t>
+      </w:r>
+      <w:r>
+        <w:rPr>
+          <w:iCs/>
+          <w:i/>
+        </w:rPr>
+        <w:t xml:space="preserve">was</w:t>
+      </w:r>
+      <w:r>
+        <w:t xml:space="preserve"> </w:t>
+      </w:r>
+      <w:r>
+        <w:t xml:space="preserve">the case. It converted a boy who gave a</w:t>
+      </w:r>
+      <w:r>
+        <w:t xml:space="preserve"> </w:t>
+      </w:r>
+      <w:r>
+        <w:t xml:space="preserve">girl a ride into the only man on earth who could have murdered her.</w:t>
+      </w:r>
+    </w:p>
+    <w:p>
+      <w:pPr>
+        <w:pStyle w:val="BodyText"/>
+      </w:pPr>
+      <w:r>
+        <w:t xml:space="preserve">And it was built on sand. The science of estimating time of death from stomach</w:t>
+      </w:r>
+      <w:r>
+        <w:t xml:space="preserve"> </w:t>
+      </w:r>
+      <w:r>
+        <w:t xml:space="preserve">contents, of assuming that a stomach empties on a fixed and knowable schedule,</w:t>
+      </w:r>
+      <w:r>
+        <w:t xml:space="preserve"> </w:t>
+      </w:r>
+      <w:r>
+        <w:t xml:space="preserve">was exactly the kind of confident, precise-sounding forensic claim that juries</w:t>
+      </w:r>
+      <w:r>
+        <w:t xml:space="preserve"> </w:t>
+      </w:r>
+      <w:r>
+        <w:t xml:space="preserve">find irresistible and that later scrutiny so often dissolves. Digestion does not</w:t>
+      </w:r>
+      <w:r>
+        <w:t xml:space="preserve"> </w:t>
+      </w:r>
+      <w:r>
+        <w:t xml:space="preserve">run on a stopwatch. It varies enormously with the person, the meal, the stress,</w:t>
+      </w:r>
+      <w:r>
+        <w:t xml:space="preserve"> </w:t>
+      </w:r>
+      <w:r>
+        <w:t xml:space="preserve">the fear. A stomach can take hours longer to empty than Dr. Penistan assumed. The</w:t>
+      </w:r>
+      <w:r>
+        <w:t xml:space="preserve"> </w:t>
+      </w:r>
+      <w:r>
+        <w:t xml:space="preserve">window he drew with such authority was a guess wearing the costume of a</w:t>
+      </w:r>
+      <w:r>
+        <w:t xml:space="preserve"> </w:t>
+      </w:r>
+      <w:r>
+        <w:t xml:space="preserve">measurement, and a fourteen-year-old’s life was hung inside it.</w:t>
+      </w:r>
+    </w:p>
+    <w:bookmarkEnd w:id="147"/>
+    <w:bookmarkStart w:id="148" w:name="the-flies-1"/>
+    <w:p>
+      <w:pPr>
+        <w:pStyle w:val="Heading2"/>
+      </w:pPr>
+      <w:r>
+        <w:t xml:space="preserve">The flies</w:t>
+      </w:r>
+    </w:p>
+    <w:p>
+      <w:pPr>
+        <w:pStyle w:val="FirstParagraph"/>
+      </w:pPr>
+      <w:r>
+        <w:t xml:space="preserve">In 2007, on a reference from the Minister of Justice, the Court of Appeal for</w:t>
+      </w:r>
+      <w:r>
+        <w:t xml:space="preserve"> </w:t>
+      </w:r>
+      <w:r>
+        <w:t xml:space="preserve">Ontario examined Steven Truscott’s conviction one final time, as though it were a</w:t>
+      </w:r>
+      <w:r>
+        <w:t xml:space="preserve"> </w:t>
+      </w:r>
+      <w:r>
+        <w:t xml:space="preserve">fresh appeal, and this time it did something no court had done before. It let in</w:t>
+      </w:r>
+      <w:r>
+        <w:t xml:space="preserve"> </w:t>
+      </w:r>
+      <w:r>
+        <w:t xml:space="preserve">new evidence about the time of death, and that evidence came from two directions,</w:t>
+      </w:r>
+      <w:r>
+        <w:t xml:space="preserve"> </w:t>
+      </w:r>
+      <w:r>
+        <w:t xml:space="preserve">both of which pointed away from Dr. Penistan’s window.</w:t>
+      </w:r>
+    </w:p>
+    <w:p>
+      <w:pPr>
+        <w:pStyle w:val="BodyText"/>
+      </w:pPr>
+      <w:r>
+        <w:t xml:space="preserve">The first was a reassessment of the pathology itself. Modern expert review</w:t>
+      </w:r>
+      <w:r>
+        <w:t xml:space="preserve"> </w:t>
+      </w:r>
+      <w:r>
+        <w:t xml:space="preserve">rendered the old claim, that Lynne Harper</w:t>
+      </w:r>
+      <w:r>
+        <w:t xml:space="preserve"> </w:t>
+      </w:r>
+      <w:r>
+        <w:rPr>
+          <w:iCs/>
+          <w:i/>
+        </w:rPr>
+        <w:t xml:space="preserve">must</w:t>
+      </w:r>
+      <w:r>
+        <w:t xml:space="preserve"> </w:t>
+      </w:r>
+      <w:r>
+        <w:t xml:space="preserve">have died before 8:00 p.m.,</w:t>
+      </w:r>
+      <w:r>
+        <w:t xml:space="preserve"> </w:t>
+      </w:r>
+      <w:r>
+        <w:t xml:space="preserve">scientifically untenable. The certainty was gone, and with it the exclusive</w:t>
+      </w:r>
+      <w:r>
+        <w:t xml:space="preserve"> </w:t>
+      </w:r>
+      <w:r>
+        <w:t xml:space="preserve">opportunity it had manufactured.</w:t>
+      </w:r>
+    </w:p>
+    <w:p>
+      <w:pPr>
+        <w:pStyle w:val="BodyText"/>
+      </w:pPr>
+      <w:r>
+        <w:t xml:space="preserve">The second came from the humblest witnesses imaginable: the blow flies that had</w:t>
+      </w:r>
+      <w:r>
+        <w:t xml:space="preserve"> </w:t>
+      </w:r>
+      <w:r>
+        <w:t xml:space="preserve">found Lynne Harper’s body. Dr. Penistan, at the autopsy, had removed maggots from</w:t>
+      </w:r>
+      <w:r>
+        <w:t xml:space="preserve"> </w:t>
+      </w:r>
+      <w:r>
+        <w:t xml:space="preserve">around her nose and mouth and, in his notes, recorded their size, about</w:t>
+      </w:r>
+      <w:r>
+        <w:t xml:space="preserve"> </w:t>
+      </w:r>
+      <w:r>
+        <w:t xml:space="preserve">one-sixteenth of an inch. Decades later, forensic entomologists took that</w:t>
+      </w:r>
+      <w:r>
+        <w:t xml:space="preserve"> </w:t>
+      </w:r>
+      <w:r>
+        <w:t xml:space="preserve">recorded detail and did what entomologists do. A blow fly’s life runs on a</w:t>
+      </w:r>
+      <w:r>
+        <w:t xml:space="preserve"> </w:t>
+      </w:r>
+      <w:r>
+        <w:t xml:space="preserve">biological clock so dependable that the size and developmental stage of the</w:t>
+      </w:r>
+      <w:r>
+        <w:t xml:space="preserve"> </w:t>
+      </w:r>
+      <w:r>
+        <w:t xml:space="preserve">maggots on a body can be read backward to estimate when insects first arrived,</w:t>
+      </w:r>
+      <w:r>
+        <w:t xml:space="preserve"> </w:t>
+      </w:r>
+      <w:r>
+        <w:t xml:space="preserve">and therefore, roughly, when death occurred and the body lay exposed. Working</w:t>
+      </w:r>
+      <w:r>
+        <w:t xml:space="preserve"> </w:t>
+      </w:r>
+      <w:r>
+        <w:t xml:space="preserve">from the maggots Dr. Penistan himself had described, the entomology pointed to a</w:t>
+      </w:r>
+      <w:r>
+        <w:t xml:space="preserve"> </w:t>
+      </w:r>
+      <w:r>
+        <w:t xml:space="preserve">death later than his window allowed, potentially so much later that it could</w:t>
+      </w:r>
+      <w:r>
+        <w:t xml:space="preserve"> </w:t>
+      </w:r>
+      <w:r>
+        <w:t xml:space="preserve">place the killing at a time when Steven Truscott was nowhere near Lawson’s Bush.</w:t>
+      </w:r>
+    </w:p>
+    <w:p>
+      <w:pPr>
+        <w:pStyle w:val="BodyText"/>
+      </w:pPr>
+      <w:r>
+        <w:t xml:space="preserve">The Court of Appeal was careful about the science. It did not declare the</w:t>
+      </w:r>
+      <w:r>
+        <w:t xml:space="preserve"> </w:t>
+      </w:r>
+      <w:r>
+        <w:t xml:space="preserve">entomology certain; it noted its frailties and acknowledged the assumptions it</w:t>
+      </w:r>
+      <w:r>
+        <w:t xml:space="preserve"> </w:t>
+      </w:r>
+      <w:r>
+        <w:t xml:space="preserve">rested on. But it held that the evidence was sound enough to go to a jury, and</w:t>
+      </w:r>
+      <w:r>
+        <w:t xml:space="preserve"> </w:t>
+      </w:r>
+      <w:r>
+        <w:t xml:space="preserve">that, together with the collapse of Dr. Penistan’s pathology, it could raise a</w:t>
+      </w:r>
+      <w:r>
+        <w:t xml:space="preserve"> </w:t>
+      </w:r>
+      <w:r>
+        <w:t xml:space="preserve">reasonable doubt that Lynne Harper died before 8:00 p.m. And a reasonable doubt</w:t>
+      </w:r>
+      <w:r>
+        <w:t xml:space="preserve"> </w:t>
+      </w:r>
+      <w:r>
+        <w:t xml:space="preserve">about the time of death was a reasonable doubt about the entire case, because the</w:t>
+      </w:r>
+      <w:r>
+        <w:t xml:space="preserve"> </w:t>
+      </w:r>
+      <w:r>
+        <w:t xml:space="preserve">whole edifice had been built on that single, false window.</w:t>
+      </w:r>
+    </w:p>
+    <w:p>
+      <w:pPr>
+        <w:pStyle w:val="BodyText"/>
+      </w:pPr>
+      <w:r>
+        <w:t xml:space="preserve">The court found that Steven Truscott’s conviction was a miscarriage of justice</w:t>
+      </w:r>
+      <w:r>
+        <w:t xml:space="preserve"> </w:t>
+      </w:r>
+      <w:r>
+        <w:t xml:space="preserve">and quashed it. A new trial, half a century on, was a practical impossibility. So</w:t>
+      </w:r>
+      <w:r>
+        <w:t xml:space="preserve"> </w:t>
+      </w:r>
+      <w:r>
+        <w:t xml:space="preserve">the court did the only just thing left to do. It held that if a new trial could</w:t>
+      </w:r>
+      <w:r>
+        <w:t xml:space="preserve"> </w:t>
+      </w:r>
+      <w:r>
+        <w:t xml:space="preserve">be held, an acquittal would clearly be the more likely result, and it entered</w:t>
+      </w:r>
+      <w:r>
+        <w:t xml:space="preserve"> </w:t>
+      </w:r>
+      <w:r>
+        <w:t xml:space="preserve">that acquittal itself. In 2007, forty-eight years after a fourteen-year-old boy</w:t>
+      </w:r>
+      <w:r>
+        <w:t xml:space="preserve"> </w:t>
+      </w:r>
+      <w:r>
+        <w:t xml:space="preserve">was sentenced to die, Steven Truscott was declared, at last, an innocent man.</w:t>
+      </w:r>
+    </w:p>
+    <w:bookmarkEnd w:id="148"/>
+    <w:bookmarkStart w:id="150" w:name="the-question-this-book-cannot-avoid"/>
+    <w:p>
+      <w:pPr>
+        <w:pStyle w:val="Heading2"/>
+      </w:pPr>
+      <w:r>
+        <w:t xml:space="preserve">The question this book cannot avoid</w:t>
+      </w:r>
+    </w:p>
+    <w:p>
+      <w:pPr>
+        <w:pStyle w:val="FirstParagraph"/>
+      </w:pPr>
+      <w:r>
+        <w:t xml:space="preserve">For every other subject in these pages, the closing question has been</w:t>
+      </w:r>
+      <w:r>
+        <w:t xml:space="preserve"> </w:t>
+      </w:r>
+      <w:r>
+        <w:t xml:space="preserve">“</w:t>
+      </w:r>
+      <w:r>
+        <w:t xml:space="preserve">how’d they</w:t>
+      </w:r>
+      <w:r>
+        <w:t xml:space="preserve"> </w:t>
+      </w:r>
+      <w:r>
+        <w:t xml:space="preserve">get caught.</w:t>
+      </w:r>
+      <w:r>
+        <w:t xml:space="preserve">”</w:t>
+      </w:r>
+      <w:r>
+        <w:t xml:space="preserve"> </w:t>
+      </w:r>
+      <w:r>
+        <w:t xml:space="preserve">For Steven Truscott, the question is the opposite and far more</w:t>
+      </w:r>
+      <w:r>
+        <w:t xml:space="preserve"> </w:t>
+      </w:r>
+      <w:r>
+        <w:t xml:space="preserve">uncomfortable: how was an innocent boy</w:t>
+      </w:r>
+      <w:r>
+        <w:t xml:space="preserve"> </w:t>
+      </w:r>
+      <w:r>
+        <w:rPr>
+          <w:iCs/>
+          <w:i/>
+        </w:rPr>
+        <w:t xml:space="preserve">convicted</w:t>
+      </w:r>
+      <w:r>
+        <w:t xml:space="preserve">, and how was he made to wait a</w:t>
+      </w:r>
+      <w:r>
+        <w:t xml:space="preserve"> </w:t>
+      </w:r>
+      <w:r>
+        <w:t xml:space="preserve">lifetime to be uncaught? The answer is the same forensic overconfidence that runs</w:t>
+      </w:r>
+      <w:r>
+        <w:t xml:space="preserve"> </w:t>
+      </w:r>
+      <w:r>
+        <w:t xml:space="preserve">like a warning through this entire book. A murderer is caught when the evidence,</w:t>
+      </w:r>
+      <w:r>
+        <w:t xml:space="preserve"> </w:t>
+      </w:r>
+      <w:r>
+        <w:t xml:space="preserve">honestly read, points only at him. But evidence does not read itself. It is read</w:t>
+      </w:r>
+      <w:r>
+        <w:t xml:space="preserve"> </w:t>
+      </w:r>
+      <w:r>
+        <w:t xml:space="preserve">by people, and when a person in a white coat mistakes a guess for a measurement</w:t>
+      </w:r>
+      <w:r>
+        <w:t xml:space="preserve"> </w:t>
+      </w:r>
+      <w:r>
+        <w:t xml:space="preserve">and says it with enough authority, a jury will convict on it, whether the man in</w:t>
+      </w:r>
+      <w:r>
+        <w:t xml:space="preserve"> </w:t>
+      </w:r>
+      <w:r>
+        <w:t xml:space="preserve">the dock is Ted Bundy or a fourteen-year-old who gave a classmate a ride home.</w:t>
+      </w:r>
+    </w:p>
+    <w:p>
+      <w:pPr>
+        <w:pStyle w:val="BodyText"/>
+      </w:pPr>
+      <w:r>
+        <w:t xml:space="preserve">That is the note this book has to end on, because it is the truth that makes all</w:t>
+      </w:r>
+      <w:r>
+        <w:t xml:space="preserve"> </w:t>
+      </w:r>
+      <w:r>
+        <w:t xml:space="preserve">the other chapters mean something. The forensic sciences that catch the guilty,</w:t>
+      </w:r>
+      <w:r>
+        <w:t xml:space="preserve"> </w:t>
+      </w:r>
+      <w:r>
+        <w:t xml:space="preserve">the cell towers and the Fitbits and the search histories and the tracklogs, are</w:t>
+      </w:r>
+      <w:r>
+        <w:t xml:space="preserve"> </w:t>
+      </w:r>
+      <w:r>
+        <w:t xml:space="preserve">genuinely powerful, and genuinely good, precisely to the degree that we hold them</w:t>
+      </w:r>
+      <w:r>
+        <w:t xml:space="preserve"> </w:t>
+      </w:r>
+      <w:r>
+        <w:t xml:space="preserve">honest. When we let them promise more than they can deliver, they do not stop</w:t>
+      </w:r>
+      <w:r>
+        <w:t xml:space="preserve"> </w:t>
+      </w:r>
+      <w:r>
+        <w:t xml:space="preserve">convicting people. They simply start convicting the wrong ones. Steven Truscott</w:t>
+      </w:r>
+      <w:r>
+        <w:t xml:space="preserve"> </w:t>
+      </w:r>
+      <w:r>
+        <w:t xml:space="preserve">was freed, in the end, by insects too small to lie and a court finally willing to</w:t>
+      </w:r>
+      <w:r>
+        <w:t xml:space="preserve"> </w:t>
+      </w:r>
+      <w:r>
+        <w:t xml:space="preserve">listen. He should never have needed either. The lesson of how not to get away</w:t>
+      </w:r>
+      <w:r>
+        <w:t xml:space="preserve"> </w:t>
+      </w:r>
+      <w:r>
+        <w:t xml:space="preserve">with murder is also, unavoidably, the lesson of how not to convict a boy of one:</w:t>
+      </w:r>
+      <w:r>
+        <w:t xml:space="preserve"> </w:t>
+      </w:r>
+      <w:r>
+        <w:t xml:space="preserve">follow the evidence, but never trust it more than it has earned.</w:t>
+      </w:r>
+    </w:p>
+    <w:p>
+      <w:r>
+        <w:pict>
+          <v:rect style="width:0;height:1.5pt" o:hralign="center" o:hrstd="t" o:hr="t"/>
+        </w:pict>
+      </w:r>
+    </w:p>
+    <w:p>
+      <w:pPr>
+        <w:pStyle w:val="BlockText"/>
+      </w:pPr>
+      <w:r>
+        <w:rPr>
+          <w:bCs/>
+          <w:b/>
+        </w:rPr>
+        <w:t xml:space="preserve">📖 Read the case yourself:</w:t>
+      </w:r>
+      <w:r>
+        <w:t xml:space="preserve"> </w:t>
+      </w:r>
+      <w:r>
+        <w:rPr>
+          <w:iCs/>
+          <w:i/>
+        </w:rPr>
+        <w:t xml:space="preserve">Truscott (Re)</w:t>
+      </w:r>
+      <w:r>
+        <w:t xml:space="preserve">, 2007 ONCA 575, Court of Appeal</w:t>
+      </w:r>
+      <w:r>
+        <w:t xml:space="preserve"> </w:t>
+      </w:r>
+      <w:r>
+        <w:t xml:space="preserve">for Ontario.</w:t>
+      </w:r>
+      <w:r>
+        <w:t xml:space="preserve"> </w:t>
+      </w:r>
+      <w:r>
+        <w:t xml:space="preserve">Free online:</w:t>
+      </w:r>
+      <w:r>
+        <w:t xml:space="preserve"> </w:t>
+      </w:r>
+      <w:hyperlink r:id="rId149">
+        <w:r>
+          <w:rPr>
+            <w:rStyle w:val="Hyperlink"/>
+          </w:rPr>
+          <w:t xml:space="preserve">CanLII</w:t>
+        </w:r>
+      </w:hyperlink>
+      <w:r>
+        <w:t xml:space="preserve">.</w:t>
+      </w:r>
+      <w:r>
+        <w:t xml:space="preserve"> </w:t>
+      </w:r>
+      <w:r>
+        <w:t xml:space="preserve">The overview and the four pillars of the Crown’s case are set out in Part I;</w:t>
+      </w:r>
+      <w:r>
+        <w:t xml:space="preserve"> </w:t>
+      </w:r>
+      <w:r>
+        <w:t xml:space="preserve">Dr. Penistan’s stomach-contents time-of-death opinion is examined in Part III;</w:t>
+      </w:r>
+      <w:r>
+        <w:t xml:space="preserve"> </w:t>
+      </w:r>
+      <w:r>
+        <w:t xml:space="preserve">the forensic-entomology evidence and the court’s conclusion on it appear in the</w:t>
+      </w:r>
+      <w:r>
+        <w:t xml:space="preserve"> </w:t>
+      </w:r>
+      <w:r>
+        <w:t xml:space="preserve">analysis of the first pillar; the acquittal is entered in Part VI.</w:t>
+      </w:r>
+      <w:r>
+        <w:t xml:space="preserve"> </w:t>
+      </w:r>
+      <w:r>
+        <w:rPr>
+          <w:bCs/>
+          <w:b/>
+        </w:rPr>
+        <w:t xml:space="preserve">Companion chapters:</w:t>
+      </w:r>
+      <w:r>
+        <w:t xml:space="preserve"> </w:t>
+      </w:r>
+      <w:r>
+        <w:t xml:space="preserve">the junk-science arc runs through</w:t>
+      </w:r>
+      <w:r>
+        <w:t xml:space="preserve"> </w:t>
+      </w:r>
+      <w:r>
+        <w:rPr>
+          <w:iCs/>
+          <w:i/>
+        </w:rPr>
+        <w:t xml:space="preserve">Bundy</w:t>
+      </w:r>
+      <w:r>
+        <w:t xml:space="preserve"> </w:t>
+      </w:r>
+      <w:r>
+        <w:t xml:space="preserve">(37),</w:t>
+      </w:r>
+      <w:r>
+        <w:t xml:space="preserve"> </w:t>
+      </w:r>
+      <w:r>
+        <w:rPr>
+          <w:iCs/>
+          <w:i/>
+        </w:rPr>
+        <w:t xml:space="preserve">Krone</w:t>
+      </w:r>
+      <w:r>
+        <w:t xml:space="preserve"> </w:t>
+      </w:r>
+      <w:r>
+        <w:t xml:space="preserve">(38),</w:t>
+      </w:r>
+      <w:r>
+        <w:t xml:space="preserve"> </w:t>
+      </w:r>
+      <w:r>
+        <w:rPr>
+          <w:iCs/>
+          <w:i/>
+        </w:rPr>
+        <w:t xml:space="preserve">Howard</w:t>
+      </w:r>
+      <w:r>
+        <w:t xml:space="preserve"> </w:t>
+      </w:r>
+      <w:r>
+        <w:t xml:space="preserve">(39), and</w:t>
+      </w:r>
+      <w:r>
+        <w:t xml:space="preserve"> </w:t>
+      </w:r>
+      <w:r>
+        <w:rPr>
+          <w:iCs/>
+          <w:i/>
+        </w:rPr>
+        <w:t xml:space="preserve">Lobato</w:t>
+      </w:r>
+      <w:r>
+        <w:t xml:space="preserve"> </w:t>
+      </w:r>
+      <w:r>
+        <w:t xml:space="preserve">(40); this is its Canadian bookend and the</w:t>
+      </w:r>
+      <w:r>
+        <w:t xml:space="preserve"> </w:t>
+      </w:r>
+      <w:r>
+        <w:t xml:space="preserve">book’s closing chapter.</w:t>
+      </w:r>
+    </w:p>
+    <w:bookmarkEnd w:id="150"/>
+    <w:bookmarkEnd w:id="151"/>
     <w:sectPr/>
   </w:body>
 </w:document>

</xml_diff>

<commit_message>
Split front matter onto separate title, copyright, and dedication pages
Front-matter page breaks so the print interior opens with a clean standalone
title page (p1), copyright page (p2), and dedication page (p3). Rebuilt the
6x9 interior PDF (now 196 pp; spine ~0.44in white), the EPUB, and the master
docx to match.

Co-Authored-By: Claude Opus 4.8 <noreply@anthropic.com>
Claude-Session: https://claude.ai/code/session_016HAHAXcMmaZghEz1kJrDWU
</commit_message>
<xml_diff>
--- a/book/word/How Not to Get Away With Murder - Master.docx
+++ b/book/word/How Not to Get Away With Murder - Master.docx
@@ -58,13 +58,6 @@
         <w:t xml:space="preserve">Frank Alfano</w:t>
       </w:r>
     </w:p>
-    <w:p>
-      <w:r>
-        <w:pict>
-          <v:rect style="width:0;height:1.5pt" o:hralign="center" o:hrstd="t" o:hr="t"/>
-        </w:pict>
-      </w:r>
-    </w:p>
     <w:bookmarkEnd w:id="20"/>
     <w:bookmarkStart w:id="21" w:name="copyright"/>
     <w:p>
@@ -187,13 +180,6 @@
         <w:t xml:space="preserve">First edition, 2026.</w:t>
       </w:r>
     </w:p>
-    <w:p>
-      <w:r>
-        <w:pict>
-          <v:rect style="width:0;height:1.5pt" o:hralign="center" o:hrstd="t" o:hr="t"/>
-        </w:pict>
-      </w:r>
-    </w:p>
     <w:bookmarkEnd w:id="21"/>
     <w:bookmarkStart w:id="22" w:name="dedication"/>
     <w:p>
@@ -210,13 +196,6 @@
       </w:pPr>
       <w:r>
         <w:t xml:space="preserve">For Silas, my grandson, whom I was lucky enough to be there for when he was born.</w:t>
-      </w:r>
-    </w:p>
-    <w:p>
-      <w:r>
-        <w:pict>
-          <v:rect style="width:0;height:1.5pt" o:hralign="center" o:hrstd="t" o:hr="t"/>
-        </w:pict>
       </w:r>
     </w:p>
     <w:bookmarkEnd w:id="22"/>

</xml_diff>